<commit_message>
chore(ur): change system templates
Change the system templates for the "Verfügung" and the "Stellungnahme".
</commit_message>
<xml_diff>
--- a/document-merge-service/kt_uri/templatefiles/urec_systemvorlage_stellungnahme_240912.docx
+++ b/document-merge-service/kt_uri/templatefiles/urec_systemvorlage_stellungnahme_240912.docx
@@ -1,497 +1,301 @@
 
 <file path=word/document.xml><?xml version="1.0" encoding="utf-8"?>
-<w:document xmlns:wpc="http://schemas.microsoft.com/office/word/2010/wordprocessingCanvas" xmlns:cx="http://schemas.microsoft.com/office/drawing/2014/chartex" xmlns:cx1="http://schemas.microsoft.com/office/drawing/2015/9/8/chartex" xmlns:cx2="http://schemas.microsoft.com/office/drawing/2015/10/21/chartex" xmlns:cx3="http://schemas.microsoft.com/office/drawing/2016/5/9/chartex" xmlns:cx4="http://schemas.microsoft.com/office/drawing/2016/5/10/chartex" xmlns:cx5="http://schemas.microsoft.com/office/drawing/2016/5/11/chartex" xmlns:cx6="http://schemas.microsoft.com/office/drawing/2016/5/12/chartex" xmlns:cx7="http://schemas.microsoft.com/office/drawing/2016/5/13/chartex" xmlns:cx8="http://schemas.microsoft.com/office/drawing/2016/5/14/chartex" xmlns:mc="http://schemas.openxmlformats.org/markup-compatibility/2006" xmlns:aink="http://schemas.microsoft.com/office/drawing/2016/ink" xmlns:am3d="http://schemas.microsoft.com/office/drawing/2017/model3d" xmlns:o="urn:schemas-microsoft-com:office:office" xmlns:oel="http://schemas.microsoft.com/office/2019/extlst" xmlns:r="http://schemas.openxmlformats.org/officeDocument/2006/relationships" xmlns:m="http://schemas.openxmlformats.org/officeDocument/2006/math" xmlns:v="urn:schemas-microsoft-com:vml" xmlns:wp14="http://schemas.microsoft.com/office/word/2010/wordprocessingDrawing" xmlns:wp="http://schemas.openxmlformats.org/drawingml/2006/wordprocessingDrawing" xmlns:w10="urn:schemas-microsoft-com:office:word" xmlns:w="http://schemas.openxmlformats.org/wordprocessingml/2006/main" xmlns:w14="http://schemas.microsoft.com/office/word/2010/wordml" xmlns:w15="http://schemas.microsoft.com/office/word/2012/wordml" xmlns:w16cex="http://schemas.microsoft.com/office/word/2018/wordml/cex" xmlns:w16cid="http://schemas.microsoft.com/office/word/2016/wordml/cid" xmlns:w16="http://schemas.microsoft.com/office/word/2018/wordml" xmlns:w16sdtdh="http://schemas.microsoft.com/office/word/2020/wordml/sdtdatahash" xmlns:w16se="http://schemas.microsoft.com/office/word/2015/wordml/symex" xmlns:wpg="http://schemas.microsoft.com/office/word/2010/wordprocessingGroup" xmlns:wpi="http://schemas.microsoft.com/office/word/2010/wordprocessingInk" xmlns:wne="http://schemas.microsoft.com/office/word/2006/wordml" xmlns:wps="http://schemas.microsoft.com/office/word/2010/wordprocessingShape" mc:Ignorable="w14 w15 w16se w16cid w16 w16cex w16sdtdh wp14">
+<w:document xmlns:wpc="http://schemas.microsoft.com/office/word/2010/wordprocessingCanvas" xmlns:cx="http://schemas.microsoft.com/office/drawing/2014/chartex" xmlns:cx1="http://schemas.microsoft.com/office/drawing/2015/9/8/chartex" xmlns:cx2="http://schemas.microsoft.com/office/drawing/2015/10/21/chartex" xmlns:cx3="http://schemas.microsoft.com/office/drawing/2016/5/9/chartex" xmlns:cx4="http://schemas.microsoft.com/office/drawing/2016/5/10/chartex" xmlns:cx5="http://schemas.microsoft.com/office/drawing/2016/5/11/chartex" xmlns:cx6="http://schemas.microsoft.com/office/drawing/2016/5/12/chartex" xmlns:cx7="http://schemas.microsoft.com/office/drawing/2016/5/13/chartex" xmlns:cx8="http://schemas.microsoft.com/office/drawing/2016/5/14/chartex" xmlns:mc="http://schemas.openxmlformats.org/markup-compatibility/2006" xmlns:aink="http://schemas.microsoft.com/office/drawing/2016/ink" xmlns:am3d="http://schemas.microsoft.com/office/drawing/2017/model3d" xmlns:o="urn:schemas-microsoft-com:office:office" xmlns:oel="http://schemas.microsoft.com/office/2019/extlst" xmlns:r="http://schemas.openxmlformats.org/officeDocument/2006/relationships" xmlns:m="http://schemas.openxmlformats.org/officeDocument/2006/math" xmlns:v="urn:schemas-microsoft-com:vml" xmlns:wp14="http://schemas.microsoft.com/office/word/2010/wordprocessingDrawing" xmlns:wp="http://schemas.openxmlformats.org/drawingml/2006/wordprocessingDrawing" xmlns:w10="urn:schemas-microsoft-com:office:word" xmlns:w="http://schemas.openxmlformats.org/wordprocessingml/2006/main" xmlns:w14="http://schemas.microsoft.com/office/word/2010/wordml" xmlns:w15="http://schemas.microsoft.com/office/word/2012/wordml" xmlns:w16cex="http://schemas.microsoft.com/office/word/2018/wordml/cex" xmlns:w16cid="http://schemas.microsoft.com/office/word/2016/wordml/cid" xmlns:w16="http://schemas.microsoft.com/office/word/2018/wordml" xmlns:w16du="http://schemas.microsoft.com/office/word/2023/wordml/word16du" xmlns:w16sdtdh="http://schemas.microsoft.com/office/word/2020/wordml/sdtdatahash" xmlns:w16sdtfl="http://schemas.microsoft.com/office/word/2024/wordml/sdtformatlock" xmlns:w16se="http://schemas.microsoft.com/office/word/2015/wordml/symex" xmlns:wpg="http://schemas.microsoft.com/office/word/2010/wordprocessingGroup" xmlns:wpi="http://schemas.microsoft.com/office/word/2010/wordprocessingInk" xmlns:wne="http://schemas.microsoft.com/office/word/2006/wordml" xmlns:wps="http://schemas.microsoft.com/office/word/2010/wordprocessingShape" mc:Ignorable="w14 w15 w16se w16cid w16 w16cex w16sdtdh w16sdtfl w16du wp14">
   <w:body>
-    <w:tbl>
-      <w:tblPr>
-        <w:tblW w:w="9071" w:type="dxa"/>
-        <w:tblLayout w:type="fixed"/>
-        <w:tblCellMar>
-          <w:left w:w="0" w:type="dxa"/>
-          <w:right w:w="0" w:type="dxa"/>
-        </w:tblCellMar>
-        <w:tblLook w:val="04A0" w:firstRow="1" w:lastRow="0" w:firstColumn="1" w:lastColumn="0" w:noHBand="0" w:noVBand="1"/>
-      </w:tblPr>
-      <w:tblGrid>
-        <w:gridCol w:w="9071"/>
-      </w:tblGrid>
-      <w:tr>
-        <w:trPr>
-          <w:trHeight w:val="1644"/>
-        </w:trPr>
-        <w:tc>
-          <w:tcPr>
-            <w:tcW w:w="9071" w:type="dxa"/>
-            <w:shd w:val="clear" w:color="auto" w:fill="auto"/>
-          </w:tcPr>
-          <w:p>
-            <w:pPr>
-              <w:pStyle w:val="zOawRecipient"/>
-              <w:rPr>
-                <w:rFonts w:cs="Calibri"/>
-                <w:b/>
-                <w:bCs/>
-                <w:color w:val="000000"/>
-              </w:rPr>
-            </w:pPr>
-            <w:r>
-              <w:rPr>
-                <w:rFonts w:cs="Calibri"/>
-                <w:b/>
-                <w:bCs/>
-                <w:color w:val="000000"/>
-              </w:rPr>
-              <w:t>Zustellung via Gemeindebaubehörde</w:t>
-            </w:r>
-            <w:r>
-              <w:rPr>
-                <w:rFonts w:cs="Calibri"/>
-                <w:b/>
-                <w:bCs/>
-                <w:color w:val="000000"/>
-              </w:rPr>
-              <w:t>/Leitbehörde</w:t>
-            </w:r>
-          </w:p>
-          <w:p>
-            <w:pPr>
-              <w:pStyle w:val="zOawRecipient"/>
-              <w:rPr>
-                <w:rFonts w:cs="Calibri"/>
-                <w:color w:val="000000"/>
-              </w:rPr>
-            </w:pPr>
-            <w:proofErr w:type="gramStart"/>
-            <w:r>
-              <w:rPr>
-                <w:rFonts w:cs="Calibri"/>
-                <w:color w:val="000000"/>
-              </w:rPr>
-              <w:t>{{ GESUCHSTELLER</w:t>
-            </w:r>
-            <w:proofErr w:type="gramEnd"/>
-            <w:r>
-              <w:rPr>
-                <w:rFonts w:cs="Calibri"/>
-                <w:color w:val="000000"/>
-              </w:rPr>
-              <w:t xml:space="preserve"> }}</w:t>
-            </w:r>
-          </w:p>
-          <w:p>
-            <w:pPr>
-              <w:pStyle w:val="zOawRecipient"/>
-            </w:pPr>
-            <w:bookmarkStart w:id="0" w:name="RecipientFormattedFullAddress"/>
-            <w:bookmarkEnd w:id="0"/>
-            <w:proofErr w:type="gramStart"/>
-            <w:r>
-              <w:t>{{ GESUCHSTELLER</w:t>
-            </w:r>
-            <w:proofErr w:type="gramEnd"/>
-            <w:r>
-              <w:t>_ADRESSE_1 }}</w:t>
-            </w:r>
-          </w:p>
-          <w:p>
-            <w:pPr>
-              <w:pStyle w:val="zOawRecipient"/>
-            </w:pPr>
-            <w:proofErr w:type="gramStart"/>
-            <w:r>
-              <w:t>{{ GESUCHSTELLER</w:t>
-            </w:r>
-            <w:proofErr w:type="gramEnd"/>
-            <w:r>
-              <w:t>_ADRESSE_2 }}</w:t>
-            </w:r>
-          </w:p>
-        </w:tc>
-      </w:tr>
-      <w:tr>
-        <w:trPr>
-          <w:trHeight w:val="20"/>
-        </w:trPr>
-        <w:tc>
-          <w:tcPr>
-            <w:tcW w:w="9071" w:type="dxa"/>
-            <w:shd w:val="clear" w:color="auto" w:fill="auto"/>
-            <w:vAlign w:val="bottom"/>
-          </w:tcPr>
-          <w:p>
-            <w:pPr>
-              <w:pStyle w:val="Text"/>
-            </w:pPr>
-          </w:p>
-        </w:tc>
-      </w:tr>
-      <w:tr>
-        <w:trPr>
-          <w:trHeight w:val="1191"/>
-        </w:trPr>
-        <w:tc>
-          <w:tcPr>
-            <w:tcW w:w="9071" w:type="dxa"/>
-            <w:shd w:val="clear" w:color="auto" w:fill="auto"/>
-            <w:tcMar>
-              <w:top w:w="284" w:type="dxa"/>
-            </w:tcMar>
-          </w:tcPr>
-          <w:p>
-            <w:pPr>
-              <w:pStyle w:val="Text"/>
-            </w:pPr>
-            <w:r>
-              <w:t>Altdorf</w:t>
-            </w:r>
-            <w:r>
-              <w:t xml:space="preserve">, </w:t>
-            </w:r>
-            <w:bookmarkStart w:id="1" w:name="_Hlk177042461"/>
-            <w:r>
-              <w:fldChar w:fldCharType="begin"/>
-            </w:r>
-            <w:r>
-              <w:instrText xml:space="preserve"> DATE  \@ "d. MMMM yyyy"  \* MERGEFORMAT </w:instrText>
-            </w:r>
-            <w:r>
-              <w:fldChar w:fldCharType="separate"/>
-            </w:r>
-            <w:r>
-              <w:rPr>
-                <w:noProof/>
-              </w:rPr>
-              <w:t>12. September 2024</w:t>
-            </w:r>
-            <w:r>
-              <w:fldChar w:fldCharType="end"/>
-            </w:r>
-            <w:bookmarkEnd w:id="1"/>
-          </w:p>
-          <w:p>
-            <w:pPr>
-              <w:pStyle w:val="Text9pt"/>
-            </w:pPr>
-            <w:bookmarkStart w:id="2" w:name="CustomFieldIhrZeichen"/>
-            <w:bookmarkEnd w:id="2"/>
-          </w:p>
-        </w:tc>
-      </w:tr>
-      <w:tr>
-        <w:trPr>
-          <w:trHeight w:val="340"/>
-        </w:trPr>
-        <w:tc>
-          <w:tcPr>
-            <w:tcW w:w="9071" w:type="dxa"/>
-            <w:shd w:val="clear" w:color="auto" w:fill="auto"/>
-            <w:tcMar>
-              <w:bottom w:w="567" w:type="dxa"/>
-            </w:tcMar>
-          </w:tcPr>
-          <w:p>
-            <w:pPr>
-              <w:pStyle w:val="Betreff"/>
-              <w:spacing w:after="0"/>
-            </w:pPr>
-            <w:bookmarkStart w:id="3" w:name="Subject" w:colFirst="0" w:colLast="0"/>
-            <w:proofErr w:type="gramStart"/>
-            <w:r>
-              <w:t>{{ DOSSIER</w:t>
-            </w:r>
-            <w:proofErr w:type="gramEnd"/>
-            <w:r>
-              <w:t>_TYP }}; Stellungnahme</w:t>
-            </w:r>
-          </w:p>
-          <w:p/>
-          <w:tbl>
-            <w:tblPr>
-              <w:tblStyle w:val="Tabellenraster"/>
-              <w:tblW w:w="0" w:type="auto"/>
-              <w:tblBorders>
-                <w:top w:val="none" w:sz="0" w:space="0" w:color="auto"/>
-                <w:left w:val="none" w:sz="0" w:space="0" w:color="auto"/>
-                <w:bottom w:val="none" w:sz="0" w:space="0" w:color="auto"/>
-                <w:right w:val="none" w:sz="0" w:space="0" w:color="auto"/>
-                <w:insideH w:val="none" w:sz="0" w:space="0" w:color="auto"/>
-                <w:insideV w:val="none" w:sz="0" w:space="0" w:color="auto"/>
-              </w:tblBorders>
-              <w:tblLayout w:type="fixed"/>
-              <w:tblLook w:val="04A0" w:firstRow="1" w:lastRow="0" w:firstColumn="1" w:lastColumn="0" w:noHBand="0" w:noVBand="1"/>
-            </w:tblPr>
-            <w:tblGrid>
-              <w:gridCol w:w="1985"/>
-              <w:gridCol w:w="7076"/>
-            </w:tblGrid>
-            <w:tr>
-              <w:tc>
-                <w:tcPr>
-                  <w:tcW w:w="1985" w:type="dxa"/>
-                </w:tcPr>
-                <w:p>
-                  <w:pPr>
-                    <w:ind w:left="-63"/>
-                  </w:pPr>
-                  <w:r>
-                    <w:t>Vorhaben:</w:t>
-                  </w:r>
-                </w:p>
-              </w:tc>
-              <w:tc>
-                <w:tcPr>
-                  <w:tcW w:w="7076" w:type="dxa"/>
-                </w:tcPr>
-                <w:p>
-                  <w:proofErr w:type="gramStart"/>
-                  <w:r>
-                    <w:t>{{ BESCHREIBUNG</w:t>
-                  </w:r>
-                  <w:proofErr w:type="gramEnd"/>
-                  <w:r>
-                    <w:t xml:space="preserve">_BAUVORHABEN | </w:t>
-                  </w:r>
-                  <w:proofErr w:type="spellStart"/>
-                  <w:r>
-                    <w:t>multiline</w:t>
-                  </w:r>
-                  <w:proofErr w:type="spellEnd"/>
-                  <w:r>
-                    <w:t xml:space="preserve"> }}</w:t>
-                  </w:r>
-                </w:p>
-              </w:tc>
-            </w:tr>
-            <w:tr>
-              <w:tc>
-                <w:tcPr>
-                  <w:tcW w:w="1985" w:type="dxa"/>
-                </w:tcPr>
-                <w:p>
-                  <w:pPr>
-                    <w:ind w:left="-63"/>
-                  </w:pPr>
-                  <w:r>
-                    <w:t>Dossier Nr.:</w:t>
-                  </w:r>
-                </w:p>
-              </w:tc>
-              <w:tc>
-                <w:tcPr>
-                  <w:tcW w:w="7076" w:type="dxa"/>
-                </w:tcPr>
-                <w:p>
-                  <w:proofErr w:type="gramStart"/>
-                  <w:r>
-                    <w:t>{{ DOSSIER</w:t>
-                  </w:r>
-                  <w:proofErr w:type="gramEnd"/>
-                  <w:r>
-                    <w:t>_NUMMER }}</w:t>
-                  </w:r>
-                </w:p>
-              </w:tc>
-            </w:tr>
-            <w:tr>
-              <w:tc>
-                <w:tcPr>
-                  <w:tcW w:w="1985" w:type="dxa"/>
-                </w:tcPr>
-                <w:p>
-                  <w:pPr>
-                    <w:ind w:left="-63"/>
-                  </w:pPr>
-                  <w:r>
-                    <w:t>Ort:</w:t>
-                  </w:r>
-                </w:p>
-              </w:tc>
-              <w:tc>
-                <w:tcPr>
-                  <w:tcW w:w="7076" w:type="dxa"/>
-                </w:tcPr>
-                <w:p>
-                  <w:proofErr w:type="gramStart"/>
-                  <w:r>
-                    <w:t>{{ ORT</w:t>
-                  </w:r>
-                  <w:proofErr w:type="gramEnd"/>
-                  <w:r>
-                    <w:t xml:space="preserve"> }}</w:t>
-                  </w:r>
-                  <w:r>
-                    <w:t>, {{ STRASSE }}</w:t>
-                  </w:r>
-                </w:p>
-              </w:tc>
-            </w:tr>
-            <w:tr>
-              <w:tc>
-                <w:tcPr>
-                  <w:tcW w:w="1985" w:type="dxa"/>
-                </w:tcPr>
-                <w:p>
-                  <w:pPr>
-                    <w:ind w:left="-63"/>
-                  </w:pPr>
-                  <w:r>
-                    <w:t>Parzelle(n) Nr.:</w:t>
-                  </w:r>
-                </w:p>
-              </w:tc>
-              <w:tc>
-                <w:tcPr>
-                  <w:tcW w:w="7076" w:type="dxa"/>
-                </w:tcPr>
-                <w:p>
-                  <w:proofErr w:type="gramStart"/>
-                  <w:r>
-                    <w:t>{{ PARZELLE</w:t>
-                  </w:r>
-                  <w:proofErr w:type="gramEnd"/>
-                  <w:r>
-                    <w:t xml:space="preserve"> }}</w:t>
-                  </w:r>
-                </w:p>
-              </w:tc>
-            </w:tr>
-            <w:tr>
-              <w:tc>
-                <w:tcPr>
-                  <w:tcW w:w="1985" w:type="dxa"/>
-                </w:tcPr>
-                <w:p>
-                  <w:pPr>
-                    <w:ind w:left="-63"/>
-                  </w:pPr>
-                  <w:r>
-                    <w:t>Zone:</w:t>
-                  </w:r>
-                </w:p>
-              </w:tc>
-              <w:tc>
-                <w:tcPr>
-                  <w:tcW w:w="7076" w:type="dxa"/>
-                </w:tcPr>
-                <w:p>
-                  <w:proofErr w:type="gramStart"/>
-                  <w:r>
-                    <w:t>{{ ZONE</w:t>
-                  </w:r>
-                  <w:proofErr w:type="gramEnd"/>
-                  <w:r>
-                    <w:t xml:space="preserve"> }}</w:t>
-                  </w:r>
-                </w:p>
-              </w:tc>
-            </w:tr>
-            <w:tr>
-              <w:tc>
-                <w:tcPr>
-                  <w:tcW w:w="1985" w:type="dxa"/>
-                </w:tcPr>
-                <w:p>
-                  <w:pPr>
-                    <w:ind w:left="-63"/>
-                  </w:pPr>
-                  <w:r>
-                    <w:t>Gesuchsteller:</w:t>
-                  </w:r>
-                </w:p>
-              </w:tc>
-              <w:tc>
-                <w:tcPr>
-                  <w:tcW w:w="7076" w:type="dxa"/>
-                </w:tcPr>
-                <w:p>
-                  <w:proofErr w:type="gramStart"/>
-                  <w:r>
-                    <w:t>{{ GESUCHSTELLER</w:t>
-                  </w:r>
-                  <w:proofErr w:type="gramEnd"/>
-                  <w:r>
-                    <w:t>_NAME_ADRESSE }}</w:t>
-                  </w:r>
-                </w:p>
-              </w:tc>
-            </w:tr>
-          </w:tbl>
-          <w:p/>
-        </w:tc>
-      </w:tr>
-      <w:bookmarkEnd w:id="3"/>
-      <w:tr>
-        <w:trPr>
-          <w:trHeight w:val="20"/>
-        </w:trPr>
-        <w:tc>
-          <w:tcPr>
-            <w:tcW w:w="9071" w:type="dxa"/>
-            <w:shd w:val="clear" w:color="auto" w:fill="auto"/>
-          </w:tcPr>
-          <w:p>
-            <w:pPr>
-              <w:pStyle w:val="zOawBlindzeile"/>
-            </w:pPr>
-          </w:p>
-        </w:tc>
-      </w:tr>
-    </w:tbl>
     <w:p>
       <w:pPr>
-        <w:pStyle w:val="zOawBlindzeile"/>
+        <w:pStyle w:val="1pt"/>
         <w:sectPr>
-          <w:footerReference w:type="default" r:id="rId12"/>
-          <w:headerReference w:type="first" r:id="rId13"/>
-          <w:footerReference w:type="first" r:id="rId14"/>
+          <w:headerReference w:type="even" r:id="rId14"/>
+          <w:headerReference w:type="default" r:id="rId15"/>
+          <w:footerReference w:type="even" r:id="rId16"/>
+          <w:footerReference w:type="default" r:id="rId17"/>
+          <w:headerReference w:type="first" r:id="rId18"/>
+          <w:footerReference w:type="first" r:id="rId19"/>
           <w:pgSz w:w="11906" w:h="16838" w:code="9"/>
           <w:pgMar w:top="2835" w:right="1134" w:bottom="1985" w:left="1701" w:header="510" w:footer="567" w:gutter="0"/>
           <w:cols w:space="708"/>
-          <w:titlePg/>
           <w:docGrid w:linePitch="360"/>
         </w:sectPr>
       </w:pPr>
+      <w:r>
+        <w:fldChar w:fldCharType="begin"/>
+      </w:r>
+      <w:r>
+        <w:instrText xml:space="preserve">  </w:instrText>
+      </w:r>
+      <w:r>
+        <w:fldChar w:fldCharType="separate"/>
+      </w:r>
+      <w:r>
+        <w:fldChar w:fldCharType="end"/>
+      </w:r>
     </w:p>
     <w:sdt>
       <w:sdtPr>
-        <w:tag w:val="Introduction"/>
-        <w:id w:val="-1251426694"/>
+        <w:alias w:val="Body Address Block"/>
+        <w:tag w:val="officeatworkDocumentPart: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"/>
+        <w:id w:val="804893733"/>
         <w:placeholder>
-          <w:docPart w:val="A28DEAC98E864F40AD3EF282E33FC7A4"/>
+          <w:docPart w:val="DefaultPlaceholder_-1854013440"/>
         </w:placeholder>
-        <w:dataBinding w:prefixMappings="xmlns:ns='http://schemas.officeatwork.com/CustomXMLPart'" w:xpath="/ns:officeatwork/ns:Introduction" w:storeItemID="{449B45FC-8755-4360-A7E8-6A1DA88E2CF0}"/>
-        <w:text w:multiLine="1"/>
+        <w15:appearance w15:val="hidden"/>
       </w:sdtPr>
-      <w:sdtEndPr/>
       <w:sdtContent>
         <w:p>
           <w:pPr>
-            <w:pStyle w:val="Text"/>
+            <w:pStyle w:val="1pt"/>
+          </w:pPr>
+        </w:p>
+        <w:tbl>
+          <w:tblPr>
+            <w:tblW w:w="9071" w:type="dxa"/>
+            <w:tblLayout w:type="fixed"/>
+            <w:tblCellMar>
+              <w:left w:w="0" w:type="dxa"/>
+              <w:right w:w="0" w:type="dxa"/>
+            </w:tblCellMar>
+            <w:tblLook w:val="04A0" w:firstRow="1" w:lastRow="0" w:firstColumn="1" w:lastColumn="0" w:noHBand="0" w:noVBand="1"/>
+          </w:tblPr>
+          <w:tblGrid>
+            <w:gridCol w:w="4678"/>
+            <w:gridCol w:w="4393"/>
+          </w:tblGrid>
+          <w:tr>
+            <w:trPr>
+              <w:trHeight w:val="1531"/>
+            </w:trPr>
+            <w:tc>
+              <w:tcPr>
+                <w:tcW w:w="4678" w:type="dxa"/>
+              </w:tcPr>
+              <w:sdt>
+                <w:sdtPr>
+                  <w:tag w:val="officeatworkDocumentPart:U2FsdGVkX1/e8dvbmrbms6+pxq3GOQhNFQe/5z4siGKrWXA1jBKW5eKVKmsSfuLhpFbrUQF2i9ZgI6UrItHJg3LHSw4lBAdn1eSb6OIKMZ7SebD4n8QVUocGhcgKjuj6QWZfagMlD3U4txnaI+WlGx6hbcLDGZm6j56T9c+INWN0N0WS2rUeLtfVEe1n6uYgjfDEQ9Jg3T0NH8r/dUqBVL8vgU3Z+LhPSeYUYqO84RjsqIDZ1TWRYoibw98REWHMAz8t6FwcTWMLmZ491Jumwg=="/>
+                  <w:id w:val="-1778550106"/>
+                  <w:lock w:val="sdtLocked"/>
+                  <w:placeholder>
+                    <w:docPart w:val="EE3E77094C004512A9905A9EEAD830AA"/>
+                  </w:placeholder>
+                </w:sdtPr>
+                <w:sdtContent>
+                  <w:sdt>
+                    <w:sdtPr>
+                      <w:alias w:val="Empfängerblock"/>
+                      <w:tag w:val="officeatworkDocumentPart: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"/>
+                      <w:id w:val="-1163311188"/>
+                      <w:lock w:val="contentLocked"/>
+                      <w:placeholder>
+                        <w:docPart w:val="10AF4F2DF9984F189B1CAC3064572385"/>
+                      </w:placeholder>
+                    </w:sdtPr>
+                    <w:sdtContent>
+                      <w:p>
+                        <w:pPr>
+                          <w:pStyle w:val="bodyaddressblock"/>
+                        </w:pPr>
+                        <w:r>
+                          <w:t>​</w:t>
+                        </w:r>
+                      </w:p>
+                    </w:sdtContent>
+                  </w:sdt>
+                </w:sdtContent>
+              </w:sdt>
+              <w:p>
+                <w:pPr>
+                  <w:pStyle w:val="zOawRecipient"/>
+                  <w:rPr>
+                    <w:rFonts w:cs="Calibri"/>
+                    <w:color w:val="000000"/>
+                  </w:rPr>
+                </w:pPr>
+                <w:proofErr w:type="gramStart"/>
+                <w:r>
+                  <w:rPr>
+                    <w:rFonts w:cs="Calibri"/>
+                    <w:color w:val="000000"/>
+                  </w:rPr>
+                  <w:t>{{ GESUCHSTELLER</w:t>
+                </w:r>
+                <w:proofErr w:type="gramEnd"/>
+                <w:r>
+                  <w:rPr>
+                    <w:rFonts w:cs="Calibri"/>
+                    <w:color w:val="000000"/>
+                  </w:rPr>
+                  <w:t xml:space="preserve"> }}</w:t>
+                </w:r>
+              </w:p>
+              <w:p>
+                <w:pPr>
+                  <w:pStyle w:val="zOawRecipient"/>
+                </w:pPr>
+                <w:bookmarkStart w:id="0" w:name="RecipientFormattedFullAddress"/>
+                <w:bookmarkEnd w:id="0"/>
+                <w:proofErr w:type="gramStart"/>
+                <w:r>
+                  <w:t>{{ GESUCHSTELLER</w:t>
+                </w:r>
+                <w:proofErr w:type="gramEnd"/>
+                <w:r>
+                  <w:t>_ADRESSE_</w:t>
+                </w:r>
+                <w:proofErr w:type="gramStart"/>
+                <w:r>
+                  <w:t>1 }</w:t>
+                </w:r>
+                <w:proofErr w:type="gramEnd"/>
+                <w:r>
+                  <w:t>}</w:t>
+                </w:r>
+              </w:p>
+              <w:p>
+                <w:pPr>
+                  <w:pStyle w:val="bodyaddressblock"/>
+                  <w:rPr>
+                    <w:lang w:val="de-DE"/>
+                  </w:rPr>
+                </w:pPr>
+                <w:proofErr w:type="gramStart"/>
+                <w:r>
+                  <w:t>{{ GESUCHSTELLER</w:t>
+                </w:r>
+                <w:proofErr w:type="gramEnd"/>
+                <w:r>
+                  <w:t>_ADRESSE_2 }}</w:t>
+                </w:r>
+              </w:p>
+            </w:tc>
+            <w:sdt>
+              <w:sdtPr>
+                <w:tag w:val="officeatworkDocumentPart:U2FsdGVkX18G+LWeaQh6G2X13X7nHuogJcBe/m4plbK6fYGHPB8/oROw7Qg5V4kuH5OZE5YSC+xz8SSLvJgVSd8PRLWVFKvmRQRH2TZdBsFsqgxONLvkwWPYW2s/d/yYOEPIB8S7GsdohIvoh7PxlGAF4hbS+Gz020zhru9K0hBbbAPRfOyVWGdulwIehboNZEZdoJ1T2QpRguI8ow31rPqg3/8pyOBBJe+FVtSTEL6yR1GgvntCoRH8Lkw8o2ZdLibjII8sWNS60n28Q1gFHw=="/>
+                <w:id w:val="1476799903"/>
+                <w:lock w:val="sdtLocked"/>
+                <w:placeholder>
+                  <w:docPart w:val="74C2DA7684A5405FA26B38C9F36415F8"/>
+                </w:placeholder>
+              </w:sdtPr>
+              <w:sdtContent>
+                <w:tc>
+                  <w:tcPr>
+                    <w:tcW w:w="4393" w:type="dxa"/>
+                  </w:tcPr>
+                  <w:sdt>
+                    <w:sdtPr>
+                      <w:alias w:val="Empfängerblock"/>
+                      <w:tag w:val="officeatworkDocumentPart: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"/>
+                      <w:id w:val="2046864062"/>
+                      <w:lock w:val="contentLocked"/>
+                      <w:placeholder>
+                        <w:docPart w:val="F0A0ECDA330441C2802C3E4BAE6D2312"/>
+                      </w:placeholder>
+                      <w:showingPlcHdr/>
+                    </w:sdtPr>
+                    <w:sdtContent>
+                      <w:p>
+                        <w:pPr>
+                          <w:pStyle w:val="bodyaddressblock"/>
+                          <w:rPr>
+                            <w:lang w:val="de-DE"/>
+                          </w:rPr>
+                        </w:pPr>
+                        <w:r>
+                          <w:rPr>
+                            <w:rStyle w:val="Platzhaltertext"/>
+                            <w:rFonts w:ascii="Arial" w:hAnsi="Arial" w:cs="Arial"/>
+                          </w:rPr>
+                          <w:t>​</w:t>
+                        </w:r>
+                      </w:p>
+                    </w:sdtContent>
+                  </w:sdt>
+                </w:tc>
+              </w:sdtContent>
+            </w:sdt>
+          </w:tr>
+        </w:tbl>
+        <w:p>
+          <w:pPr>
+            <w:pStyle w:val="1pt"/>
+            <w:rPr>
+              <w:lang w:val="de-DE"/>
+            </w:rPr>
+          </w:pPr>
+        </w:p>
+        <w:p>
+          <w:pPr>
+            <w:pStyle w:val="1pt"/>
+          </w:pPr>
+        </w:p>
+      </w:sdtContent>
+    </w:sdt>
+    <w:sdt>
+      <w:sdtPr>
+        <w:alias w:val="Body Document Block"/>
+        <w:tag w:val="officeatworkDocumentPart: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"/>
+        <w:id w:val="-682515253"/>
+        <w:placeholder>
+          <w:docPart w:val="DefaultPlaceholder_-1854013440"/>
+        </w:placeholder>
+        <w15:appearance w15:val="hidden"/>
+      </w:sdtPr>
+      <w:sdtContent>
+        <w:sdt>
+          <w:sdtPr>
+            <w:alias w:val="Dokumentblock (gesperrt)"/>
+            <w:tag w:val="officeatworkDocumentPart: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"/>
+            <w:id w:val="-1427505563"/>
+            <w:lock w:val="sdtContentLocked"/>
+            <w:placeholder>
+              <w:docPart w:val="7343135B96DC4FBFBF4597B87306F263"/>
+            </w:placeholder>
+            <w:showingPlcHdr/>
+          </w:sdtPr>
+          <w:sdtContent>
+            <w:p>
+              <w:pPr>
+                <w:pStyle w:val="1pt"/>
+                <w:rPr>
+                  <w:lang w:val="de-DE"/>
+                </w:rPr>
+              </w:pPr>
+              <w:r>
+                <w:rPr>
+                  <w:rStyle w:val="Platzhaltertext"/>
+                  <w:rFonts w:ascii="Arial" w:hAnsi="Arial" w:cs="Arial"/>
+                </w:rPr>
+                <w:t>​</w:t>
+              </w:r>
+            </w:p>
+          </w:sdtContent>
+        </w:sdt>
+      </w:sdtContent>
+    </w:sdt>
+    <w:sdt>
+      <w:sdtPr>
+        <w:tag w:val="officeatworkDocumentPart:U2FsdGVkX1+2G8SW2zyeHocPFB1l+CMsF4pFMrUWgiDxbzpu+0sTsoLnuws5GC9N+Q6MuuYF5S1k7sED0F+OQByEdDzgGsbLExM86EiSXS5JS/z71m5itEzTMbmlJ1U2mz7/OUiBkhKF38Rjzc+rC5zYLZ3k4L4soNDX7gcNcN5km06seUcTJHPvaidG97ehPLskk1g6ohK07Zdhf8xQ3K+//pDukF+x8hxLCPgvFJGXxO+1IjAnjQNqVhm/UyR1"/>
+        <w:id w:val="-122467530"/>
+        <w:lock w:val="sdtLocked"/>
+        <w:placeholder>
+          <w:docPart w:val="4E0390ECC8A440409AF9A12433F5DB35"/>
+        </w:placeholder>
+        <w:showingPlcHdr/>
+      </w:sdtPr>
+      <w:sdtContent>
+        <w:p>
+          <w:pPr>
+            <w:pStyle w:val="bodysubject"/>
           </w:pPr>
           <w:r>
-            <w:t>Sehr geehrte Damen und Herren</w:t>
+            <w:rPr>
+              <w:rStyle w:val="Platzhaltertext"/>
+            </w:rPr>
+            <w:t>[Klicken oder tippen Sie hier, um Text einzugeben.]</w:t>
           </w:r>
         </w:p>
       </w:sdtContent>
     </w:sdt>
-    <w:p>
-      <w:pPr>
-        <w:pStyle w:val="Text"/>
-      </w:pPr>
-    </w:p>
-    <w:p>
-      <w:pPr>
-        <w:pStyle w:val="Text"/>
-      </w:pPr>
-      <w:r>
-        <w:t>(TEXT)</w:t>
-      </w:r>
-    </w:p>
-    <w:p>
-      <w:r>
-        <w:br w:type="page"/>
-      </w:r>
-    </w:p>
     <w:p/>
     <w:tbl>
       <w:tblPr>
@@ -505,204 +309,433 @@
           <w:insideH w:val="none" w:sz="0" w:space="0" w:color="auto"/>
           <w:insideV w:val="none" w:sz="0" w:space="0" w:color="auto"/>
         </w:tblBorders>
+        <w:tblLayout w:type="fixed"/>
         <w:tblLook w:val="04A0" w:firstRow="1" w:lastRow="0" w:firstColumn="1" w:lastColumn="0" w:noHBand="0" w:noVBand="1"/>
       </w:tblPr>
       <w:tblGrid>
-        <w:gridCol w:w="5098"/>
-        <w:gridCol w:w="3963"/>
+        <w:gridCol w:w="1985"/>
+        <w:gridCol w:w="7076"/>
       </w:tblGrid>
       <w:tr>
         <w:tc>
           <w:tcPr>
-            <w:tcW w:w="5098" w:type="dxa"/>
+            <w:tcW w:w="1985" w:type="dxa"/>
           </w:tcPr>
           <w:p>
             <w:pPr>
               <w:ind w:left="-63"/>
             </w:pPr>
-            <w:bookmarkStart w:id="4" w:name="_Hlk177042491"/>
             <w:r>
-              <w:t>Freundliche Grüsse</w:t>
+              <w:t>Vorhaben:</w:t>
             </w:r>
           </w:p>
         </w:tc>
         <w:tc>
           <w:tcPr>
-            <w:tcW w:w="3963" w:type="dxa"/>
+            <w:tcW w:w="7076" w:type="dxa"/>
           </w:tcPr>
-          <w:p/>
+          <w:p>
+            <w:pPr>
+              <w:jc w:val="left"/>
+            </w:pPr>
+            <w:proofErr w:type="gramStart"/>
+            <w:r>
+              <w:t>{{ BESCHREIBUNG</w:t>
+            </w:r>
+            <w:proofErr w:type="gramEnd"/>
+            <w:r>
+              <w:t xml:space="preserve">_BAUVORHABEN | </w:t>
+            </w:r>
+            <w:proofErr w:type="spellStart"/>
+            <w:r>
+              <w:t>multiline</w:t>
+            </w:r>
+            <w:proofErr w:type="spellEnd"/>
+            <w:r>
+              <w:t xml:space="preserve"> }}</w:t>
+            </w:r>
+          </w:p>
         </w:tc>
       </w:tr>
       <w:tr>
         <w:tc>
           <w:tcPr>
-            <w:tcW w:w="5098" w:type="dxa"/>
+            <w:tcW w:w="1985" w:type="dxa"/>
           </w:tcPr>
           <w:p>
             <w:pPr>
               <w:ind w:left="-63"/>
             </w:pPr>
+            <w:r>
+              <w:t>Dossier Nr.:</w:t>
+            </w:r>
           </w:p>
         </w:tc>
         <w:tc>
           <w:tcPr>
-            <w:tcW w:w="3963" w:type="dxa"/>
+            <w:tcW w:w="7076" w:type="dxa"/>
           </w:tcPr>
-          <w:p/>
+          <w:p>
+            <w:pPr>
+              <w:jc w:val="left"/>
+            </w:pPr>
+            <w:proofErr w:type="gramStart"/>
+            <w:r>
+              <w:t>{{ DOSSIER</w:t>
+            </w:r>
+            <w:proofErr w:type="gramEnd"/>
+            <w:r>
+              <w:t>_NUMMER }}</w:t>
+            </w:r>
+          </w:p>
         </w:tc>
       </w:tr>
       <w:tr>
         <w:tc>
           <w:tcPr>
-            <w:tcW w:w="5098" w:type="dxa"/>
+            <w:tcW w:w="1985" w:type="dxa"/>
           </w:tcPr>
           <w:p>
             <w:pPr>
               <w:ind w:left="-63"/>
-              <w:rPr>
-                <w:b/>
-                <w:bCs/>
-              </w:rPr>
             </w:pPr>
             <w:r>
-              <w:rPr>
-                <w:b/>
-                <w:bCs/>
-              </w:rPr>
-              <w:t>[Direktion oder Amt]</w:t>
+              <w:t>Ort:</w:t>
             </w:r>
           </w:p>
         </w:tc>
         <w:tc>
           <w:tcPr>
-            <w:tcW w:w="3963" w:type="dxa"/>
+            <w:tcW w:w="7076" w:type="dxa"/>
           </w:tcPr>
-          <w:p/>
+          <w:p>
+            <w:pPr>
+              <w:jc w:val="left"/>
+            </w:pPr>
+            <w:proofErr w:type="gramStart"/>
+            <w:r>
+              <w:t>{{ ORT</w:t>
+            </w:r>
+            <w:proofErr w:type="gramEnd"/>
+            <w:r>
+              <w:t xml:space="preserve"> }}, </w:t>
+            </w:r>
+            <w:proofErr w:type="gramStart"/>
+            <w:r>
+              <w:t>{{ STRASSE</w:t>
+            </w:r>
+            <w:proofErr w:type="gramEnd"/>
+            <w:r>
+              <w:t xml:space="preserve"> }}</w:t>
+            </w:r>
+          </w:p>
         </w:tc>
       </w:tr>
       <w:tr>
         <w:tc>
           <w:tcPr>
-            <w:tcW w:w="5098" w:type="dxa"/>
+            <w:tcW w:w="1985" w:type="dxa"/>
           </w:tcPr>
           <w:p>
             <w:pPr>
               <w:ind w:left="-63"/>
             </w:pPr>
+            <w:r>
+              <w:t>Parzelle(n) Nr.:</w:t>
+            </w:r>
           </w:p>
+        </w:tc>
+        <w:tc>
+          <w:tcPr>
+            <w:tcW w:w="7076" w:type="dxa"/>
+          </w:tcPr>
+          <w:p>
+            <w:pPr>
+              <w:jc w:val="left"/>
+            </w:pPr>
+            <w:proofErr w:type="gramStart"/>
+            <w:r>
+              <w:t>{{ PARZELLE</w:t>
+            </w:r>
+            <w:proofErr w:type="gramEnd"/>
+            <w:r>
+              <w:t xml:space="preserve"> }}</w:t>
+            </w:r>
+          </w:p>
+        </w:tc>
+      </w:tr>
+      <w:tr>
+        <w:tc>
+          <w:tcPr>
+            <w:tcW w:w="1985" w:type="dxa"/>
+          </w:tcPr>
           <w:p>
             <w:pPr>
               <w:ind w:left="-63"/>
             </w:pPr>
+            <w:r>
+              <w:t>Zone:</w:t>
+            </w:r>
           </w:p>
+        </w:tc>
+        <w:tc>
+          <w:tcPr>
+            <w:tcW w:w="7076" w:type="dxa"/>
+          </w:tcPr>
+          <w:p>
+            <w:pPr>
+              <w:jc w:val="left"/>
+            </w:pPr>
+            <w:proofErr w:type="gramStart"/>
+            <w:r>
+              <w:t>{{ ZONE</w:t>
+            </w:r>
+            <w:proofErr w:type="gramEnd"/>
+            <w:r>
+              <w:t xml:space="preserve"> }}</w:t>
+            </w:r>
+          </w:p>
+        </w:tc>
+      </w:tr>
+      <w:tr>
+        <w:tc>
+          <w:tcPr>
+            <w:tcW w:w="1985" w:type="dxa"/>
+          </w:tcPr>
           <w:p>
             <w:pPr>
               <w:ind w:left="-63"/>
             </w:pPr>
+            <w:r>
+              <w:t>Gesuchsteller:</w:t>
+            </w:r>
           </w:p>
         </w:tc>
         <w:tc>
           <w:tcPr>
-            <w:tcW w:w="3963" w:type="dxa"/>
+            <w:tcW w:w="7076" w:type="dxa"/>
           </w:tcPr>
-          <w:p/>
-        </w:tc>
-      </w:tr>
-      <w:tr>
-        <w:sdt>
-          <w:sdtPr>
-            <w:tag w:val="Sig1"/>
-            <w:id w:val="-744873252"/>
-            <w:placeholder>
-              <w:docPart w:val="A00863442AEA43F29467ED98612A59AC"/>
-            </w:placeholder>
-            <w:dataBinding w:prefixMappings="xmlns:ns='http://schemas.officeatwork.com/CustomXMLPart'" w:xpath="/ns:officeatwork/ns:Sig1" w:storeItemID="{449B45FC-8755-4360-A7E8-6A1DA88E2CF0}"/>
-            <w:text w:multiLine="1"/>
-          </w:sdtPr>
-          <w:sdtEndPr/>
-          <w:sdtContent>
-            <w:tc>
-              <w:tcPr>
-                <w:tcW w:w="5098" w:type="dxa"/>
-              </w:tcPr>
-              <w:p>
-                <w:pPr>
-                  <w:ind w:left="-63"/>
-                </w:pPr>
-                <w:r>
-                  <w:t>​</w:t>
-                </w:r>
-              </w:p>
-            </w:tc>
-          </w:sdtContent>
-        </w:sdt>
-        <w:tc>
-          <w:tcPr>
-            <w:tcW w:w="3963" w:type="dxa"/>
-          </w:tcPr>
-          <w:p/>
+          <w:p>
+            <w:pPr>
+              <w:jc w:val="left"/>
+            </w:pPr>
+            <w:proofErr w:type="gramStart"/>
+            <w:r>
+              <w:t>{{ GESUCHSTELLER</w:t>
+            </w:r>
+            <w:proofErr w:type="gramEnd"/>
+            <w:r>
+              <w:t>_NAME_ADRESSE }}</w:t>
+            </w:r>
+          </w:p>
         </w:tc>
       </w:tr>
     </w:tbl>
-    <w:p/>
+    <w:sdt>
+      <w:sdtPr>
+        <w:rPr>
+          <w:sz w:val="2"/>
+          <w:lang w:val="en-GB"/>
+        </w:rPr>
+        <w:alias w:val="Body Introduction Block"/>
+        <w:tag w:val="officeatworkDocumentPart: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"/>
+        <w:id w:val="-805395332"/>
+        <w:placeholder>
+          <w:docPart w:val="DefaultPlaceholder_-1854013440"/>
+        </w:placeholder>
+        <w15:appearance w15:val="hidden"/>
+      </w:sdtPr>
+      <w:sdtContent>
+        <w:sdt>
+          <w:sdtPr>
+            <w:rPr>
+              <w:sz w:val="2"/>
+              <w:lang w:val="en-GB"/>
+            </w:rPr>
+            <w:alias w:val="Anredeblock"/>
+            <w:tag w:val="officeatworkDocumentPart: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"/>
+            <w:id w:val="555589149"/>
+            <w:lock w:val="contentLocked"/>
+            <w:placeholder>
+              <w:docPart w:val="CF333B2262FD44E3A3C571D1B00D18F9"/>
+            </w:placeholder>
+          </w:sdtPr>
+          <w:sdtContent>
+            <w:p>
+              <w:pPr>
+                <w:pStyle w:val="bodyintroduction"/>
+                <w:rPr>
+                  <w:sz w:val="24"/>
+                  <w:szCs w:val="24"/>
+                </w:rPr>
+              </w:pPr>
+              <w:r>
+                <w:t>Sehr geehrte Damen und Herren</w:t>
+              </w:r>
+            </w:p>
+            <w:p>
+              <w:pPr>
+                <w:pStyle w:val="1pt"/>
+                <w:rPr>
+                  <w:lang w:val="de-DE"/>
+                </w:rPr>
+              </w:pPr>
+              <w:r>
+                <w:t>​</w:t>
+              </w:r>
+            </w:p>
+          </w:sdtContent>
+        </w:sdt>
+      </w:sdtContent>
+    </w:sdt>
+    <w:sdt>
+      <w:sdtPr>
+        <w:tag w:val="officeatworkDocumentPart:U2FsdGVkX18zGlZzD4bBsEpuF7iIDlwuz4cZffSifJPiCP/zzik1ipI2hSEAjk41+xNg2deTu47JE5g+ZaMKL3QqScxhLuZ1A3p4VZMjLphg0iFm2rW5PH4eZn+F1v4Hyn63od3zFmLXP1e80LE2ahBFtzmFjMy8j/EpJDvp6egKYZY4SR7isuBx6qvlwlQtkA+ieW6IkOdZVuEBV3X1RG3TIkaY7CXFdYdKf+SAjJdVnvYuGo04x7yIjiA9uvSo"/>
+        <w:id w:val="-605116801"/>
+        <w:lock w:val="sdtLocked"/>
+        <w:placeholder>
+          <w:docPart w:val="46C3130EBA5C437386A368BE6F706A94"/>
+        </w:placeholder>
+        <w:showingPlcHdr/>
+      </w:sdtPr>
+      <w:sdtContent>
+        <w:p>
+          <w:pPr>
+            <w:pStyle w:val="Text"/>
+          </w:pPr>
+          <w:r>
+            <w:rPr>
+              <w:rStyle w:val="Platzhaltertext"/>
+            </w:rPr>
+            <w:t>[Klicken oder tippen Sie hier, um Text einzugeben.]</w:t>
+          </w:r>
+        </w:p>
+      </w:sdtContent>
+    </w:sdt>
     <w:p>
       <w:pPr>
-        <w:pStyle w:val="Text"/>
-      </w:pPr>
-    </w:p>
-    <w:p>
-      <w:pPr>
-        <w:pStyle w:val="Text"/>
+        <w:spacing w:line="240" w:lineRule="auto"/>
+        <w:rPr>
+          <w:lang w:val="de-DE"/>
+        </w:rPr>
       </w:pPr>
       <w:r>
-        <w:t>Beilagen:</w:t>
+        <w:rPr>
+          <w:lang w:val="de-DE"/>
+        </w:rPr>
+        <w:br w:type="page"/>
       </w:r>
     </w:p>
-    <w:p>
-      <w:pPr>
-        <w:pStyle w:val="Aufzhlungszeichen"/>
-      </w:pPr>
-    </w:p>
-    <w:p>
-      <w:pPr>
-        <w:pStyle w:val="Text"/>
-      </w:pPr>
-    </w:p>
-    <w:p>
-      <w:pPr>
-        <w:pStyle w:val="Text"/>
-      </w:pPr>
-      <w:r>
-        <w:t>Verteiler:</w:t>
-      </w:r>
-    </w:p>
-    <w:p>
-      <w:pPr>
-        <w:pStyle w:val="Aufzhlungszeichen"/>
-      </w:pPr>
-    </w:p>
-    <w:p>
-      <w:pPr>
-        <w:pStyle w:val="Text"/>
-      </w:pPr>
-    </w:p>
-    <w:p>
-      <w:pPr>
-        <w:pStyle w:val="Text"/>
-      </w:pPr>
-      <w:r>
-        <w:t>Kopie an:</w:t>
-      </w:r>
-    </w:p>
-    <w:bookmarkEnd w:id="4"/>
-    <w:p>
-      <w:pPr>
-        <w:pStyle w:val="Aufzhlungszeichen"/>
-      </w:pPr>
-    </w:p>
+    <w:sdt>
+      <w:sdtPr>
+        <w:rPr>
+          <w:lang w:val="de-DE"/>
+        </w:rPr>
+        <w:alias w:val="Body Signature Block"/>
+        <w:tag w:val="officeatworkDocumentPart: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"/>
+        <w:id w:val="649633414"/>
+        <w:placeholder>
+          <w:docPart w:val="DefaultPlaceholder_-1854013440"/>
+        </w:placeholder>
+        <w15:appearance w15:val="hidden"/>
+      </w:sdtPr>
+      <w:sdtContent>
+        <w:sdt>
+          <w:sdtPr>
+            <w:alias w:val="Unterschriftsblock (gesperrt)"/>
+            <w:tag w:val="officeatworkDocumentPart: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"/>
+            <w:id w:val="-624627292"/>
+            <w:lock w:val="sdtContentLocked"/>
+            <w:placeholder>
+              <w:docPart w:val="94B05EF37F8145359C898073F9EFC586"/>
+            </w:placeholder>
+          </w:sdtPr>
+          <w:sdtContent>
+            <w:p>
+              <w:pPr>
+                <w:pStyle w:val="1pt"/>
+                <w:rPr>
+                  <w:lang w:val="de-DE"/>
+                </w:rPr>
+              </w:pPr>
+              <w:r>
+                <w:t>​</w:t>
+              </w:r>
+            </w:p>
+          </w:sdtContent>
+        </w:sdt>
+      </w:sdtContent>
+    </w:sdt>
+    <w:sdt>
+      <w:sdtPr>
+        <w:alias w:val="Body Additional Information Block"/>
+        <w:tag w:val="officeatworkDocumentPart: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"/>
+        <w:id w:val="1720477099"/>
+        <w:placeholder>
+          <w:docPart w:val="DefaultPlaceholder_-1854013440"/>
+        </w:placeholder>
+        <w15:appearance w15:val="hidden"/>
+      </w:sdtPr>
+      <w:sdtContent>
+        <w:sdt>
+          <w:sdtPr>
+            <w:alias w:val="Zusatzangaben (gesperrt)"/>
+            <w:tag w:val="officeatworkDocumentPart: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"/>
+            <w:id w:val="-1860729919"/>
+            <w:lock w:val="sdtContentLocked"/>
+            <w:placeholder>
+              <w:docPart w:val="7131270FD68A4F72A9714EBF79CA284B"/>
+            </w:placeholder>
+          </w:sdtPr>
+          <w:sdtContent>
+            <w:p>
+              <w:pPr>
+                <w:pStyle w:val="1pt"/>
+                <w:rPr>
+                  <w:lang w:val="de-DE"/>
+                </w:rPr>
+              </w:pPr>
+              <w:r>
+                <w:t>​</w:t>
+              </w:r>
+            </w:p>
+          </w:sdtContent>
+        </w:sdt>
+      </w:sdtContent>
+    </w:sdt>
+    <w:sdt>
+      <w:sdtPr>
+        <w:rPr>
+          <w:lang w:val="de-DE"/>
+        </w:rPr>
+        <w:tag w:val="officeatworkDocumentPart:U2FsdGVkX19gHjN+o06Hs0sYdVVIDFUrDBc46sxgStMSPgVp+XCQJ0SxNDitFpsOTPLT07qIHO79Nqd+HXg1aIuYOEv5sjBd5NWNEO4JYkrTGcaW3GfNQ8Yftk+Q0kttAJHywzJGl836JQhjU6kppq2v0QBUX9aA0CCDJ7QO93U6dT9PIknNX029VeEVAubfF6cL9YMFshdoQDtDEB+h/SZLSB1C47cXCqtQWhtjHxTglu/2aG7kTYL8uo6mUIbKHAOANqo2cM+O3el7Ki71cA=="/>
+        <w:id w:val="-358665778"/>
+        <w:lock w:val="sdtLocked"/>
+        <w:placeholder>
+          <w:docPart w:val="B18BE1EF45774FDF9230D203BFCD8675"/>
+        </w:placeholder>
+        <w:showingPlcHdr/>
+      </w:sdtPr>
+      <w:sdtContent>
+        <w:p>
+          <w:pPr>
+            <w:pStyle w:val="bodyaddinfolabel"/>
+            <w:rPr>
+              <w:lang w:val="de-DE"/>
+            </w:rPr>
+          </w:pPr>
+          <w:r>
+            <w:rPr>
+              <w:rStyle w:val="Platzhaltertext"/>
+            </w:rPr>
+            <w:t>[Klicken oder tippen Sie hier, um Text einzugeben.]</w:t>
+          </w:r>
+        </w:p>
+      </w:sdtContent>
+    </w:sdt>
     <w:sectPr>
-      <w:headerReference w:type="default" r:id="rId15"/>
-      <w:footerReference w:type="default" r:id="rId16"/>
+      <w:headerReference w:type="default" r:id="rId20"/>
+      <w:footerReference w:type="default" r:id="rId21"/>
       <w:type w:val="continuous"/>
       <w:pgSz w:w="11906" w:h="16838" w:code="9"/>
       <w:pgMar w:top="1418" w:right="1134" w:bottom="1985" w:left="1701" w:header="567" w:footer="567" w:gutter="0"/>
@@ -714,7 +747,7 @@
 </file>
 
 <file path=word/endnotes.xml><?xml version="1.0" encoding="utf-8"?>
-<w:endnotes xmlns:wpc="http://schemas.microsoft.com/office/word/2010/wordprocessingCanvas" xmlns:cx="http://schemas.microsoft.com/office/drawing/2014/chartex" xmlns:cx1="http://schemas.microsoft.com/office/drawing/2015/9/8/chartex" xmlns:cx2="http://schemas.microsoft.com/office/drawing/2015/10/21/chartex" xmlns:cx3="http://schemas.microsoft.com/office/drawing/2016/5/9/chartex" xmlns:cx4="http://schemas.microsoft.com/office/drawing/2016/5/10/chartex" xmlns:cx5="http://schemas.microsoft.com/office/drawing/2016/5/11/chartex" xmlns:cx6="http://schemas.microsoft.com/office/drawing/2016/5/12/chartex" xmlns:cx7="http://schemas.microsoft.com/office/drawing/2016/5/13/chartex" xmlns:cx8="http://schemas.microsoft.com/office/drawing/2016/5/14/chartex" xmlns:mc="http://schemas.openxmlformats.org/markup-compatibility/2006" xmlns:aink="http://schemas.microsoft.com/office/drawing/2016/ink" xmlns:am3d="http://schemas.microsoft.com/office/drawing/2017/model3d" xmlns:o="urn:schemas-microsoft-com:office:office" xmlns:oel="http://schemas.microsoft.com/office/2019/extlst" xmlns:r="http://schemas.openxmlformats.org/officeDocument/2006/relationships" xmlns:m="http://schemas.openxmlformats.org/officeDocument/2006/math" xmlns:v="urn:schemas-microsoft-com:vml" xmlns:wp14="http://schemas.microsoft.com/office/word/2010/wordprocessingDrawing" xmlns:wp="http://schemas.openxmlformats.org/drawingml/2006/wordprocessingDrawing" xmlns:w10="urn:schemas-microsoft-com:office:word" xmlns:w="http://schemas.openxmlformats.org/wordprocessingml/2006/main" xmlns:w14="http://schemas.microsoft.com/office/word/2010/wordml" xmlns:w15="http://schemas.microsoft.com/office/word/2012/wordml" xmlns:w16cex="http://schemas.microsoft.com/office/word/2018/wordml/cex" xmlns:w16cid="http://schemas.microsoft.com/office/word/2016/wordml/cid" xmlns:w16="http://schemas.microsoft.com/office/word/2018/wordml" xmlns:w16sdtdh="http://schemas.microsoft.com/office/word/2020/wordml/sdtdatahash" xmlns:w16se="http://schemas.microsoft.com/office/word/2015/wordml/symex" xmlns:wpg="http://schemas.microsoft.com/office/word/2010/wordprocessingGroup" xmlns:wpi="http://schemas.microsoft.com/office/word/2010/wordprocessingInk" xmlns:wne="http://schemas.microsoft.com/office/word/2006/wordml" xmlns:wps="http://schemas.microsoft.com/office/word/2010/wordprocessingShape" mc:Ignorable="w14 w15 w16se w16cid w16 w16cex w16sdtdh wp14">
+<w:endnotes xmlns:wpc="http://schemas.microsoft.com/office/word/2010/wordprocessingCanvas" xmlns:cx="http://schemas.microsoft.com/office/drawing/2014/chartex" xmlns:cx1="http://schemas.microsoft.com/office/drawing/2015/9/8/chartex" xmlns:cx2="http://schemas.microsoft.com/office/drawing/2015/10/21/chartex" xmlns:cx3="http://schemas.microsoft.com/office/drawing/2016/5/9/chartex" xmlns:cx4="http://schemas.microsoft.com/office/drawing/2016/5/10/chartex" xmlns:cx5="http://schemas.microsoft.com/office/drawing/2016/5/11/chartex" xmlns:cx6="http://schemas.microsoft.com/office/drawing/2016/5/12/chartex" xmlns:cx7="http://schemas.microsoft.com/office/drawing/2016/5/13/chartex" xmlns:cx8="http://schemas.microsoft.com/office/drawing/2016/5/14/chartex" xmlns:mc="http://schemas.openxmlformats.org/markup-compatibility/2006" xmlns:aink="http://schemas.microsoft.com/office/drawing/2016/ink" xmlns:am3d="http://schemas.microsoft.com/office/drawing/2017/model3d" xmlns:o="urn:schemas-microsoft-com:office:office" xmlns:oel="http://schemas.microsoft.com/office/2019/extlst" xmlns:r="http://schemas.openxmlformats.org/officeDocument/2006/relationships" xmlns:m="http://schemas.openxmlformats.org/officeDocument/2006/math" xmlns:v="urn:schemas-microsoft-com:vml" xmlns:wp14="http://schemas.microsoft.com/office/word/2010/wordprocessingDrawing" xmlns:wp="http://schemas.openxmlformats.org/drawingml/2006/wordprocessingDrawing" xmlns:w10="urn:schemas-microsoft-com:office:word" xmlns:w="http://schemas.openxmlformats.org/wordprocessingml/2006/main" xmlns:w14="http://schemas.microsoft.com/office/word/2010/wordml" xmlns:w15="http://schemas.microsoft.com/office/word/2012/wordml" xmlns:w16cex="http://schemas.microsoft.com/office/word/2018/wordml/cex" xmlns:w16cid="http://schemas.microsoft.com/office/word/2016/wordml/cid" xmlns:w16="http://schemas.microsoft.com/office/word/2018/wordml" xmlns:w16du="http://schemas.microsoft.com/office/word/2023/wordml/word16du" xmlns:w16sdtdh="http://schemas.microsoft.com/office/word/2020/wordml/sdtdatahash" xmlns:w16sdtfl="http://schemas.microsoft.com/office/word/2024/wordml/sdtformatlock" xmlns:w16se="http://schemas.microsoft.com/office/word/2015/wordml/symex" xmlns:wpg="http://schemas.microsoft.com/office/word/2010/wordprocessingGroup" xmlns:wpi="http://schemas.microsoft.com/office/word/2010/wordprocessingInk" xmlns:wne="http://schemas.microsoft.com/office/word/2006/wordml" xmlns:wps="http://schemas.microsoft.com/office/word/2010/wordprocessingShape" mc:Ignorable="w14 w15 w16se w16cid w16 w16cex w16sdtdh w16sdtfl w16du wp14">
   <w:endnote w:type="separator" w:id="-1">
     <w:p>
       <w:pPr>
@@ -739,429 +772,7 @@
 </file>
 
 <file path=word/footer1.xml><?xml version="1.0" encoding="utf-8"?>
-<w:ftr xmlns:wpc="http://schemas.microsoft.com/office/word/2010/wordprocessingCanvas" xmlns:cx="http://schemas.microsoft.com/office/drawing/2014/chartex" xmlns:cx1="http://schemas.microsoft.com/office/drawing/2015/9/8/chartex" xmlns:cx2="http://schemas.microsoft.com/office/drawing/2015/10/21/chartex" xmlns:cx3="http://schemas.microsoft.com/office/drawing/2016/5/9/chartex" xmlns:cx4="http://schemas.microsoft.com/office/drawing/2016/5/10/chartex" xmlns:cx5="http://schemas.microsoft.com/office/drawing/2016/5/11/chartex" xmlns:cx6="http://schemas.microsoft.com/office/drawing/2016/5/12/chartex" xmlns:cx7="http://schemas.microsoft.com/office/drawing/2016/5/13/chartex" xmlns:cx8="http://schemas.microsoft.com/office/drawing/2016/5/14/chartex" xmlns:mc="http://schemas.openxmlformats.org/markup-compatibility/2006" xmlns:aink="http://schemas.microsoft.com/office/drawing/2016/ink" xmlns:am3d="http://schemas.microsoft.com/office/drawing/2017/model3d" xmlns:o="urn:schemas-microsoft-com:office:office" xmlns:oel="http://schemas.microsoft.com/office/2019/extlst" xmlns:r="http://schemas.openxmlformats.org/officeDocument/2006/relationships" xmlns:m="http://schemas.openxmlformats.org/officeDocument/2006/math" xmlns:v="urn:schemas-microsoft-com:vml" xmlns:wp14="http://schemas.microsoft.com/office/word/2010/wordprocessingDrawing" xmlns:wp="http://schemas.openxmlformats.org/drawingml/2006/wordprocessingDrawing" xmlns:w10="urn:schemas-microsoft-com:office:word" xmlns:w="http://schemas.openxmlformats.org/wordprocessingml/2006/main" xmlns:w14="http://schemas.microsoft.com/office/word/2010/wordml" xmlns:w15="http://schemas.microsoft.com/office/word/2012/wordml" xmlns:w16cex="http://schemas.microsoft.com/office/word/2018/wordml/cex" xmlns:w16cid="http://schemas.microsoft.com/office/word/2016/wordml/cid" xmlns:w16="http://schemas.microsoft.com/office/word/2018/wordml" xmlns:w16sdtdh="http://schemas.microsoft.com/office/word/2020/wordml/sdtdatahash" xmlns:w16se="http://schemas.microsoft.com/office/word/2015/wordml/symex" xmlns:wpg="http://schemas.microsoft.com/office/word/2010/wordprocessingGroup" xmlns:wpi="http://schemas.microsoft.com/office/word/2010/wordprocessingInk" xmlns:wne="http://schemas.microsoft.com/office/word/2006/wordml" xmlns:wps="http://schemas.microsoft.com/office/word/2010/wordprocessingShape" mc:Ignorable="w14 w15 w16se w16cid w16 w16cex w16sdtdh wp14">
-  <w:tbl>
-    <w:tblPr>
-      <w:tblW w:w="9071" w:type="dxa"/>
-      <w:tblLayout w:type="fixed"/>
-      <w:tblCellMar>
-        <w:left w:w="0" w:type="dxa"/>
-        <w:right w:w="0" w:type="dxa"/>
-      </w:tblCellMar>
-      <w:tblLook w:val="01E0" w:firstRow="1" w:lastRow="1" w:firstColumn="1" w:lastColumn="1" w:noHBand="0" w:noVBand="0"/>
-    </w:tblPr>
-    <w:tblGrid>
-      <w:gridCol w:w="4678"/>
-      <w:gridCol w:w="1701"/>
-      <w:gridCol w:w="2692"/>
-    </w:tblGrid>
-    <w:tr>
-      <w:sdt>
-        <w:sdtPr>
-          <w:rPr>
-            <w:rFonts w:cs="Arial"/>
-            <w:szCs w:val="16"/>
-          </w:rPr>
-          <w:tag w:val="Direktion"/>
-          <w:id w:val="-1379239234"/>
-          <w:dataBinding w:prefixMappings="xmlns:ns='http://schemas.officeatwork.com/CustomXMLPart'" w:xpath="/ns:officeatwork/ns:Direktion" w:storeItemID="{449B45FC-8755-4360-A7E8-6A1DA88E2CF0}"/>
-          <w:text w:multiLine="1"/>
-        </w:sdtPr>
-        <w:sdtEndPr/>
-        <w:sdtContent>
-          <w:tc>
-            <w:tcPr>
-              <w:tcW w:w="4678" w:type="dxa"/>
-              <w:tcBorders>
-                <w:top w:val="single" w:sz="4" w:space="0" w:color="auto"/>
-                <w:left w:val="nil"/>
-                <w:bottom w:val="nil"/>
-                <w:right w:val="nil"/>
-              </w:tcBorders>
-            </w:tcPr>
-            <w:p>
-              <w:pPr>
-                <w:pStyle w:val="Fuzeile"/>
-                <w:spacing w:before="60"/>
-                <w:rPr>
-                  <w:rFonts w:cs="Arial"/>
-                  <w:szCs w:val="16"/>
-                </w:rPr>
-              </w:pPr>
-              <w:r>
-                <w:rPr>
-                  <w:rFonts w:cs="Arial"/>
-                  <w:szCs w:val="16"/>
-                </w:rPr>
-                <w:t>​</w:t>
-              </w:r>
-            </w:p>
-          </w:tc>
-        </w:sdtContent>
-      </w:sdt>
-      <w:tc>
-        <w:tcPr>
-          <w:tcW w:w="1701" w:type="dxa"/>
-          <w:tcBorders>
-            <w:top w:val="single" w:sz="4" w:space="0" w:color="auto"/>
-            <w:left w:val="nil"/>
-            <w:bottom w:val="nil"/>
-            <w:right w:val="nil"/>
-          </w:tcBorders>
-          <w:hideMark/>
-        </w:tcPr>
-        <w:p>
-          <w:pPr>
-            <w:pStyle w:val="Fuzeile"/>
-            <w:spacing w:before="60"/>
-            <w:rPr>
-              <w:rFonts w:cs="Arial"/>
-              <w:szCs w:val="16"/>
-            </w:rPr>
-          </w:pPr>
-          <w:r>
-            <w:rPr>
-              <w:rFonts w:cs="Arial"/>
-              <w:szCs w:val="16"/>
-            </w:rPr>
-            <w:t>Sachbearbeitung:</w:t>
-          </w:r>
-        </w:p>
-      </w:tc>
-      <w:sdt>
-        <w:sdtPr>
-          <w:rPr>
-            <w:rFonts w:cs="Arial"/>
-            <w:szCs w:val="16"/>
-          </w:rPr>
-          <w:tag w:val="Sachbearbeitung"/>
-          <w:id w:val="1971628805"/>
-          <w:dataBinding w:prefixMappings="xmlns:ns='http://schemas.officeatwork.com/CustomXMLPart'" w:xpath="/ns:officeatwork/ns:Sachbearbeitung" w:storeItemID="{449B45FC-8755-4360-A7E8-6A1DA88E2CF0}"/>
-          <w:text w:multiLine="1"/>
-        </w:sdtPr>
-        <w:sdtEndPr/>
-        <w:sdtContent>
-          <w:tc>
-            <w:tcPr>
-              <w:tcW w:w="2692" w:type="dxa"/>
-              <w:tcBorders>
-                <w:top w:val="single" w:sz="4" w:space="0" w:color="auto"/>
-                <w:left w:val="nil"/>
-                <w:bottom w:val="nil"/>
-                <w:right w:val="nil"/>
-              </w:tcBorders>
-            </w:tcPr>
-            <w:p>
-              <w:pPr>
-                <w:pStyle w:val="Fuzeile"/>
-                <w:spacing w:before="60"/>
-                <w:rPr>
-                  <w:rFonts w:cs="Arial"/>
-                  <w:szCs w:val="16"/>
-                </w:rPr>
-              </w:pPr>
-              <w:r>
-                <w:rPr>
-                  <w:rFonts w:cs="Arial"/>
-                  <w:szCs w:val="16"/>
-                </w:rPr>
-                <w:t>​</w:t>
-              </w:r>
-            </w:p>
-          </w:tc>
-        </w:sdtContent>
-      </w:sdt>
-    </w:tr>
-    <w:tr>
-      <w:sdt>
-        <w:sdtPr>
-          <w:rPr>
-            <w:rFonts w:cs="Arial"/>
-            <w:szCs w:val="16"/>
-          </w:rPr>
-          <w:tag w:val="Amt"/>
-          <w:id w:val="-1070963292"/>
-          <w:dataBinding w:prefixMappings="xmlns:ns='http://schemas.officeatwork.com/CustomXMLPart'" w:xpath="/ns:officeatwork/ns:Amt" w:storeItemID="{449B45FC-8755-4360-A7E8-6A1DA88E2CF0}"/>
-          <w:text w:multiLine="1"/>
-        </w:sdtPr>
-        <w:sdtEndPr/>
-        <w:sdtContent>
-          <w:tc>
-            <w:tcPr>
-              <w:tcW w:w="4678" w:type="dxa"/>
-            </w:tcPr>
-            <w:p>
-              <w:pPr>
-                <w:pStyle w:val="Fuzeile"/>
-                <w:rPr>
-                  <w:rFonts w:cs="Arial"/>
-                  <w:szCs w:val="16"/>
-                </w:rPr>
-              </w:pPr>
-              <w:r>
-                <w:rPr>
-                  <w:rFonts w:cs="Arial"/>
-                  <w:szCs w:val="16"/>
-                </w:rPr>
-                <w:t>​</w:t>
-              </w:r>
-            </w:p>
-          </w:tc>
-        </w:sdtContent>
-      </w:sdt>
-      <w:tc>
-        <w:tcPr>
-          <w:tcW w:w="1701" w:type="dxa"/>
-          <w:hideMark/>
-        </w:tcPr>
-        <w:p>
-          <w:pPr>
-            <w:pStyle w:val="Fuzeile"/>
-            <w:rPr>
-              <w:rFonts w:cs="Arial"/>
-              <w:szCs w:val="16"/>
-            </w:rPr>
-          </w:pPr>
-          <w:r>
-            <w:rPr>
-              <w:rFonts w:cs="Arial"/>
-              <w:szCs w:val="16"/>
-            </w:rPr>
-            <w:t>Telefon:</w:t>
-          </w:r>
-        </w:p>
-      </w:tc>
-      <w:sdt>
-        <w:sdtPr>
-          <w:rPr>
-            <w:rFonts w:cs="Arial"/>
-            <w:szCs w:val="16"/>
-          </w:rPr>
-          <w:tag w:val="Telefon"/>
-          <w:id w:val="-1324199578"/>
-          <w:dataBinding w:prefixMappings="xmlns:ns='http://schemas.officeatwork.com/CustomXMLPart'" w:xpath="/ns:officeatwork/ns:Telefon" w:storeItemID="{449B45FC-8755-4360-A7E8-6A1DA88E2CF0}"/>
-          <w:text w:multiLine="1"/>
-        </w:sdtPr>
-        <w:sdtEndPr/>
-        <w:sdtContent>
-          <w:tc>
-            <w:tcPr>
-              <w:tcW w:w="2692" w:type="dxa"/>
-            </w:tcPr>
-            <w:p>
-              <w:pPr>
-                <w:pStyle w:val="Fuzeile"/>
-                <w:rPr>
-                  <w:rFonts w:cs="Arial"/>
-                  <w:szCs w:val="16"/>
-                </w:rPr>
-              </w:pPr>
-              <w:r>
-                <w:rPr>
-                  <w:rFonts w:cs="Arial"/>
-                  <w:szCs w:val="16"/>
-                </w:rPr>
-                <w:t>​</w:t>
-              </w:r>
-            </w:p>
-          </w:tc>
-        </w:sdtContent>
-      </w:sdt>
-    </w:tr>
-    <w:tr>
-      <w:sdt>
-        <w:sdtPr>
-          <w:rPr>
-            <w:rFonts w:cs="Arial"/>
-            <w:szCs w:val="16"/>
-          </w:rPr>
-          <w:tag w:val="Address"/>
-          <w:id w:val="-672175985"/>
-          <w:dataBinding w:prefixMappings="xmlns:ns='http://schemas.officeatwork.com/CustomXMLPart'" w:xpath="/ns:officeatwork/ns:Address" w:storeItemID="{449B45FC-8755-4360-A7E8-6A1DA88E2CF0}"/>
-          <w:text w:multiLine="1"/>
-        </w:sdtPr>
-        <w:sdtEndPr/>
-        <w:sdtContent>
-          <w:tc>
-            <w:tcPr>
-              <w:tcW w:w="4678" w:type="dxa"/>
-            </w:tcPr>
-            <w:p>
-              <w:pPr>
-                <w:pStyle w:val="Fuzeile"/>
-                <w:rPr>
-                  <w:rFonts w:cs="Arial"/>
-                  <w:szCs w:val="16"/>
-                </w:rPr>
-              </w:pPr>
-              <w:r>
-                <w:rPr>
-                  <w:rFonts w:cs="Arial"/>
-                  <w:szCs w:val="16"/>
-                </w:rPr>
-                <w:t>​</w:t>
-              </w:r>
-            </w:p>
-          </w:tc>
-        </w:sdtContent>
-      </w:sdt>
-      <w:tc>
-        <w:tcPr>
-          <w:tcW w:w="1701" w:type="dxa"/>
-          <w:hideMark/>
-        </w:tcPr>
-        <w:p>
-          <w:pPr>
-            <w:pStyle w:val="Fuzeile"/>
-            <w:rPr>
-              <w:rFonts w:cs="Arial"/>
-              <w:szCs w:val="16"/>
-            </w:rPr>
-          </w:pPr>
-          <w:r>
-            <w:rPr>
-              <w:rFonts w:cs="Arial"/>
-              <w:szCs w:val="16"/>
-            </w:rPr>
-            <w:t>E-Mail:</w:t>
-          </w:r>
-        </w:p>
-      </w:tc>
-      <w:sdt>
-        <w:sdtPr>
-          <w:rPr>
-            <w:rFonts w:cs="Arial"/>
-            <w:szCs w:val="16"/>
-          </w:rPr>
-          <w:tag w:val="EMail"/>
-          <w:id w:val="-1702631975"/>
-          <w:dataBinding w:prefixMappings="xmlns:ns='http://schemas.officeatwork.com/CustomXMLPart'" w:xpath="/ns:officeatwork/ns:EMail" w:storeItemID="{449B45FC-8755-4360-A7E8-6A1DA88E2CF0}"/>
-          <w:text w:multiLine="1"/>
-        </w:sdtPr>
-        <w:sdtEndPr/>
-        <w:sdtContent>
-          <w:tc>
-            <w:tcPr>
-              <w:tcW w:w="2692" w:type="dxa"/>
-            </w:tcPr>
-            <w:p>
-              <w:pPr>
-                <w:pStyle w:val="Fuzeile"/>
-                <w:rPr>
-                  <w:rFonts w:cs="Arial"/>
-                  <w:szCs w:val="16"/>
-                </w:rPr>
-              </w:pPr>
-              <w:r>
-                <w:rPr>
-                  <w:rFonts w:cs="Arial"/>
-                  <w:szCs w:val="16"/>
-                </w:rPr>
-                <w:t>​</w:t>
-              </w:r>
-            </w:p>
-          </w:tc>
-        </w:sdtContent>
-      </w:sdt>
-    </w:tr>
-    <w:tr>
-      <w:sdt>
-        <w:sdtPr>
-          <w:rPr>
-            <w:rFonts w:cs="Arial"/>
-            <w:szCs w:val="16"/>
-          </w:rPr>
-          <w:tag w:val="Address2"/>
-          <w:id w:val="-870605183"/>
-          <w:dataBinding w:prefixMappings="xmlns:ns='http://schemas.officeatwork.com/CustomXMLPart'" w:xpath="/ns:officeatwork/ns:Address2" w:storeItemID="{449B45FC-8755-4360-A7E8-6A1DA88E2CF0}"/>
-          <w:text w:multiLine="1"/>
-        </w:sdtPr>
-        <w:sdtEndPr/>
-        <w:sdtContent>
-          <w:tc>
-            <w:tcPr>
-              <w:tcW w:w="4678" w:type="dxa"/>
-              <w:hideMark/>
-            </w:tcPr>
-            <w:p>
-              <w:pPr>
-                <w:pStyle w:val="Fuzeile"/>
-                <w:rPr>
-                  <w:rFonts w:cs="Arial"/>
-                  <w:szCs w:val="16"/>
-                </w:rPr>
-              </w:pPr>
-              <w:r>
-                <w:rPr>
-                  <w:rFonts w:cs="Arial"/>
-                  <w:szCs w:val="16"/>
-                </w:rPr>
-                <w:t>​</w:t>
-              </w:r>
-            </w:p>
-          </w:tc>
-        </w:sdtContent>
-      </w:sdt>
-      <w:tc>
-        <w:tcPr>
-          <w:tcW w:w="1701" w:type="dxa"/>
-          <w:hideMark/>
-        </w:tcPr>
-        <w:p>
-          <w:pPr>
-            <w:pStyle w:val="Fuzeile"/>
-            <w:rPr>
-              <w:rFonts w:cs="Arial"/>
-              <w:szCs w:val="16"/>
-            </w:rPr>
-          </w:pPr>
-          <w:r>
-            <w:rPr>
-              <w:rFonts w:cs="Arial"/>
-              <w:szCs w:val="16"/>
-            </w:rPr>
-            <w:t>Internet:</w:t>
-          </w:r>
-        </w:p>
-      </w:tc>
-      <w:tc>
-        <w:tcPr>
-          <w:tcW w:w="2692" w:type="dxa"/>
-        </w:tcPr>
-        <w:p>
-          <w:pPr>
-            <w:pStyle w:val="Fuzeile"/>
-            <w:rPr>
-              <w:rFonts w:cs="Arial"/>
-              <w:szCs w:val="16"/>
-            </w:rPr>
-          </w:pPr>
-          <w:sdt>
-            <w:sdtPr>
-              <w:rPr>
-                <w:rFonts w:cs="Arial"/>
-                <w:szCs w:val="16"/>
-              </w:rPr>
-              <w:tag w:val="Internet"/>
-              <w:id w:val="-332525420"/>
-              <w:dataBinding w:prefixMappings="xmlns:ns='http://schemas.officeatwork.com/CustomXMLPart'" w:xpath="/ns:officeatwork/ns:Internet" w:storeItemID="{449B45FC-8755-4360-A7E8-6A1DA88E2CF0}"/>
-              <w:text w:multiLine="1"/>
-            </w:sdtPr>
-            <w:sdtEndPr/>
-            <w:sdtContent>
-              <w:r>
-                <w:rPr>
-                  <w:rFonts w:cs="Arial"/>
-                  <w:szCs w:val="16"/>
-                </w:rPr>
-                <w:t>​</w:t>
-              </w:r>
-            </w:sdtContent>
-          </w:sdt>
-        </w:p>
-      </w:tc>
-    </w:tr>
-  </w:tbl>
+<w:ftr xmlns:wpc="http://schemas.microsoft.com/office/word/2010/wordprocessingCanvas" xmlns:cx="http://schemas.microsoft.com/office/drawing/2014/chartex" xmlns:cx1="http://schemas.microsoft.com/office/drawing/2015/9/8/chartex" xmlns:cx2="http://schemas.microsoft.com/office/drawing/2015/10/21/chartex" xmlns:cx3="http://schemas.microsoft.com/office/drawing/2016/5/9/chartex" xmlns:cx4="http://schemas.microsoft.com/office/drawing/2016/5/10/chartex" xmlns:cx5="http://schemas.microsoft.com/office/drawing/2016/5/11/chartex" xmlns:cx6="http://schemas.microsoft.com/office/drawing/2016/5/12/chartex" xmlns:cx7="http://schemas.microsoft.com/office/drawing/2016/5/13/chartex" xmlns:cx8="http://schemas.microsoft.com/office/drawing/2016/5/14/chartex" xmlns:mc="http://schemas.openxmlformats.org/markup-compatibility/2006" xmlns:aink="http://schemas.microsoft.com/office/drawing/2016/ink" xmlns:am3d="http://schemas.microsoft.com/office/drawing/2017/model3d" xmlns:o="urn:schemas-microsoft-com:office:office" xmlns:oel="http://schemas.microsoft.com/office/2019/extlst" xmlns:r="http://schemas.openxmlformats.org/officeDocument/2006/relationships" xmlns:m="http://schemas.openxmlformats.org/officeDocument/2006/math" xmlns:v="urn:schemas-microsoft-com:vml" xmlns:wp14="http://schemas.microsoft.com/office/word/2010/wordprocessingDrawing" xmlns:wp="http://schemas.openxmlformats.org/drawingml/2006/wordprocessingDrawing" xmlns:w10="urn:schemas-microsoft-com:office:word" xmlns:w="http://schemas.openxmlformats.org/wordprocessingml/2006/main" xmlns:w14="http://schemas.microsoft.com/office/word/2010/wordml" xmlns:w15="http://schemas.microsoft.com/office/word/2012/wordml" xmlns:w16cex="http://schemas.microsoft.com/office/word/2018/wordml/cex" xmlns:w16cid="http://schemas.microsoft.com/office/word/2016/wordml/cid" xmlns:w16="http://schemas.microsoft.com/office/word/2018/wordml" xmlns:w16du="http://schemas.microsoft.com/office/word/2023/wordml/word16du" xmlns:w16sdtdh="http://schemas.microsoft.com/office/word/2020/wordml/sdtdatahash" xmlns:w16sdtfl="http://schemas.microsoft.com/office/word/2024/wordml/sdtformatlock" xmlns:w16se="http://schemas.microsoft.com/office/word/2015/wordml/symex" xmlns:wpg="http://schemas.microsoft.com/office/word/2010/wordprocessingGroup" xmlns:wpi="http://schemas.microsoft.com/office/word/2010/wordprocessingInk" xmlns:wne="http://schemas.microsoft.com/office/word/2006/wordml" xmlns:wps="http://schemas.microsoft.com/office/word/2010/wordprocessingShape" mc:Ignorable="w14 w15 w16se w16cid w16 w16cex w16sdtdh w16sdtfl w16du wp14">
   <w:p>
     <w:pPr>
       <w:pStyle w:val="Fuzeile"/>
@@ -1171,429 +782,115 @@
 </file>
 
 <file path=word/footer2.xml><?xml version="1.0" encoding="utf-8"?>
-<w:ftr xmlns:wpc="http://schemas.microsoft.com/office/word/2010/wordprocessingCanvas" xmlns:cx="http://schemas.microsoft.com/office/drawing/2014/chartex" xmlns:cx1="http://schemas.microsoft.com/office/drawing/2015/9/8/chartex" xmlns:cx2="http://schemas.microsoft.com/office/drawing/2015/10/21/chartex" xmlns:cx3="http://schemas.microsoft.com/office/drawing/2016/5/9/chartex" xmlns:cx4="http://schemas.microsoft.com/office/drawing/2016/5/10/chartex" xmlns:cx5="http://schemas.microsoft.com/office/drawing/2016/5/11/chartex" xmlns:cx6="http://schemas.microsoft.com/office/drawing/2016/5/12/chartex" xmlns:cx7="http://schemas.microsoft.com/office/drawing/2016/5/13/chartex" xmlns:cx8="http://schemas.microsoft.com/office/drawing/2016/5/14/chartex" xmlns:mc="http://schemas.openxmlformats.org/markup-compatibility/2006" xmlns:aink="http://schemas.microsoft.com/office/drawing/2016/ink" xmlns:am3d="http://schemas.microsoft.com/office/drawing/2017/model3d" xmlns:o="urn:schemas-microsoft-com:office:office" xmlns:oel="http://schemas.microsoft.com/office/2019/extlst" xmlns:r="http://schemas.openxmlformats.org/officeDocument/2006/relationships" xmlns:m="http://schemas.openxmlformats.org/officeDocument/2006/math" xmlns:v="urn:schemas-microsoft-com:vml" xmlns:wp14="http://schemas.microsoft.com/office/word/2010/wordprocessingDrawing" xmlns:wp="http://schemas.openxmlformats.org/drawingml/2006/wordprocessingDrawing" xmlns:w10="urn:schemas-microsoft-com:office:word" xmlns:w="http://schemas.openxmlformats.org/wordprocessingml/2006/main" xmlns:w14="http://schemas.microsoft.com/office/word/2010/wordml" xmlns:w15="http://schemas.microsoft.com/office/word/2012/wordml" xmlns:w16cex="http://schemas.microsoft.com/office/word/2018/wordml/cex" xmlns:w16cid="http://schemas.microsoft.com/office/word/2016/wordml/cid" xmlns:w16="http://schemas.microsoft.com/office/word/2018/wordml" xmlns:w16sdtdh="http://schemas.microsoft.com/office/word/2020/wordml/sdtdatahash" xmlns:w16se="http://schemas.microsoft.com/office/word/2015/wordml/symex" xmlns:wpg="http://schemas.microsoft.com/office/word/2010/wordprocessingGroup" xmlns:wpi="http://schemas.microsoft.com/office/word/2010/wordprocessingInk" xmlns:wne="http://schemas.microsoft.com/office/word/2006/wordml" xmlns:wps="http://schemas.microsoft.com/office/word/2010/wordprocessingShape" mc:Ignorable="w14 w15 w16se w16cid w16 w16cex w16sdtdh wp14">
-  <w:tbl>
-    <w:tblPr>
-      <w:tblW w:w="9071" w:type="dxa"/>
-      <w:tblLayout w:type="fixed"/>
-      <w:tblCellMar>
-        <w:left w:w="0" w:type="dxa"/>
-        <w:right w:w="0" w:type="dxa"/>
-      </w:tblCellMar>
-      <w:tblLook w:val="01E0" w:firstRow="1" w:lastRow="1" w:firstColumn="1" w:lastColumn="1" w:noHBand="0" w:noVBand="0"/>
-    </w:tblPr>
-    <w:tblGrid>
-      <w:gridCol w:w="4678"/>
-      <w:gridCol w:w="1701"/>
-      <w:gridCol w:w="2692"/>
-    </w:tblGrid>
-    <w:tr>
+<w:ftr xmlns:wpc="http://schemas.microsoft.com/office/word/2010/wordprocessingCanvas" xmlns:cx="http://schemas.microsoft.com/office/drawing/2014/chartex" xmlns:cx1="http://schemas.microsoft.com/office/drawing/2015/9/8/chartex" xmlns:cx2="http://schemas.microsoft.com/office/drawing/2015/10/21/chartex" xmlns:cx3="http://schemas.microsoft.com/office/drawing/2016/5/9/chartex" xmlns:cx4="http://schemas.microsoft.com/office/drawing/2016/5/10/chartex" xmlns:cx5="http://schemas.microsoft.com/office/drawing/2016/5/11/chartex" xmlns:cx6="http://schemas.microsoft.com/office/drawing/2016/5/12/chartex" xmlns:cx7="http://schemas.microsoft.com/office/drawing/2016/5/13/chartex" xmlns:cx8="http://schemas.microsoft.com/office/drawing/2016/5/14/chartex" xmlns:mc="http://schemas.openxmlformats.org/markup-compatibility/2006" xmlns:aink="http://schemas.microsoft.com/office/drawing/2016/ink" xmlns:am3d="http://schemas.microsoft.com/office/drawing/2017/model3d" xmlns:o="urn:schemas-microsoft-com:office:office" xmlns:oel="http://schemas.microsoft.com/office/2019/extlst" xmlns:r="http://schemas.openxmlformats.org/officeDocument/2006/relationships" xmlns:m="http://schemas.openxmlformats.org/officeDocument/2006/math" xmlns:v="urn:schemas-microsoft-com:vml" xmlns:wp14="http://schemas.microsoft.com/office/word/2010/wordprocessingDrawing" xmlns:wp="http://schemas.openxmlformats.org/drawingml/2006/wordprocessingDrawing" xmlns:w10="urn:schemas-microsoft-com:office:word" xmlns:w="http://schemas.openxmlformats.org/wordprocessingml/2006/main" xmlns:w14="http://schemas.microsoft.com/office/word/2010/wordml" xmlns:w15="http://schemas.microsoft.com/office/word/2012/wordml" xmlns:w16cex="http://schemas.microsoft.com/office/word/2018/wordml/cex" xmlns:w16cid="http://schemas.microsoft.com/office/word/2016/wordml/cid" xmlns:w16="http://schemas.microsoft.com/office/word/2018/wordml" xmlns:w16du="http://schemas.microsoft.com/office/word/2023/wordml/word16du" xmlns:w16sdtdh="http://schemas.microsoft.com/office/word/2020/wordml/sdtdatahash" xmlns:w16sdtfl="http://schemas.microsoft.com/office/word/2024/wordml/sdtformatlock" xmlns:w16se="http://schemas.microsoft.com/office/word/2015/wordml/symex" xmlns:wpg="http://schemas.microsoft.com/office/word/2010/wordprocessingGroup" xmlns:wpi="http://schemas.microsoft.com/office/word/2010/wordprocessingInk" xmlns:wne="http://schemas.microsoft.com/office/word/2006/wordml" xmlns:wps="http://schemas.microsoft.com/office/word/2010/wordprocessingShape" mc:Ignorable="w14 w15 w16se w16cid w16 w16cex w16sdtdh w16sdtfl w16du wp14">
+  <w:sdt>
+    <w:sdtPr>
+      <w:alias w:val="Footer Block P1 portrait"/>
+      <w:tag w:val="officeatworkDocumentPart: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"/>
+      <w:id w:val="1466233985"/>
+      <w:placeholder>
+        <w:docPart w:val="DefaultPlaceholder_-1854013440"/>
+      </w:placeholder>
+      <w15:appearance w15:val="hidden"/>
+    </w:sdtPr>
+    <w:sdtContent>
       <w:sdt>
         <w:sdtPr>
-          <w:rPr>
-            <w:rFonts w:cs="Arial"/>
-            <w:szCs w:val="16"/>
-          </w:rPr>
-          <w:tag w:val="Direktion"/>
-          <w:id w:val="863643433"/>
-          <w:dataBinding w:prefixMappings="xmlns:ns='http://schemas.officeatwork.com/CustomXMLPart'" w:xpath="/ns:officeatwork/ns:Direktion" w:storeItemID="{449B45FC-8755-4360-A7E8-6A1DA88E2CF0}"/>
-          <w:text w:multiLine="1"/>
+          <w:alias w:val="Fusszeile (gesperrt)"/>
+          <w:tag w:val="officeatworkDocumentPart: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"/>
+          <w:id w:val="1961769279"/>
+          <w:lock w:val="sdtContentLocked"/>
+          <w:placeholder>
+            <w:docPart w:val="3396F2D9941F4B65B2D11C8A9CC25315"/>
+          </w:placeholder>
         </w:sdtPr>
-        <w:sdtEndPr/>
         <w:sdtContent>
-          <w:tc>
-            <w:tcPr>
-              <w:tcW w:w="4678" w:type="dxa"/>
-              <w:tcBorders>
-                <w:top w:val="single" w:sz="4" w:space="0" w:color="auto"/>
-                <w:left w:val="nil"/>
-                <w:bottom w:val="nil"/>
-                <w:right w:val="nil"/>
-              </w:tcBorders>
-            </w:tcPr>
-            <w:p>
-              <w:pPr>
-                <w:pStyle w:val="Fuzeile"/>
-                <w:spacing w:before="60"/>
-                <w:rPr>
-                  <w:rFonts w:cs="Arial"/>
-                  <w:szCs w:val="16"/>
-                </w:rPr>
-              </w:pPr>
-              <w:r>
-                <w:rPr>
-                  <w:rFonts w:cs="Arial"/>
-                  <w:szCs w:val="16"/>
-                </w:rPr>
-                <w:t>​</w:t>
-              </w:r>
-            </w:p>
-          </w:tc>
+          <w:p>
+            <w:pPr>
+              <w:pStyle w:val="Fuzeile"/>
+            </w:pPr>
+          </w:p>
+          <w:tbl>
+            <w:tblPr>
+              <w:tblW w:w="0" w:type="auto"/>
+              <w:tblBorders>
+                <w:top w:val="single" w:sz="2" w:space="0" w:color="000000"/>
+              </w:tblBorders>
+              <w:tblCellMar>
+                <w:left w:w="0" w:type="dxa"/>
+                <w:right w:w="0" w:type="dxa"/>
+              </w:tblCellMar>
+              <w:tblLook w:val="04A0" w:firstRow="1" w:lastRow="0" w:firstColumn="1" w:lastColumn="0" w:noHBand="0" w:noVBand="1"/>
+            </w:tblPr>
+            <w:tblGrid>
+              <w:gridCol w:w="4665"/>
+              <w:gridCol w:w="1710"/>
+              <w:gridCol w:w="2685"/>
+            </w:tblGrid>
+            <w:tr>
+              <w:tc>
+                <w:tcPr>
+                  <w:tcW w:w="4665" w:type="dxa"/>
+                  <w:hideMark/>
+                </w:tcPr>
+                <w:p>
+                  <w:pPr>
+                    <w:rPr>
+                      <w:sz w:val="20"/>
+                      <w:szCs w:val="20"/>
+                    </w:rPr>
+                  </w:pPr>
+                </w:p>
+              </w:tc>
+              <w:tc>
+                <w:tcPr>
+                  <w:tcW w:w="1710" w:type="dxa"/>
+                  <w:hideMark/>
+                </w:tcPr>
+                <w:p>
+                  <w:pPr>
+                    <w:rPr>
+                      <w:rFonts w:eastAsia="Times New Roman"/>
+                      <w:sz w:val="20"/>
+                      <w:szCs w:val="20"/>
+                    </w:rPr>
+                  </w:pPr>
+                </w:p>
+              </w:tc>
+              <w:tc>
+                <w:tcPr>
+                  <w:tcW w:w="2685" w:type="dxa"/>
+                  <w:hideMark/>
+                </w:tcPr>
+                <w:p>
+                  <w:pPr>
+                    <w:rPr>
+                      <w:rFonts w:eastAsia="Times New Roman"/>
+                      <w:sz w:val="20"/>
+                      <w:szCs w:val="20"/>
+                    </w:rPr>
+                  </w:pPr>
+                </w:p>
+              </w:tc>
+            </w:tr>
+          </w:tbl>
+          <w:p>
+            <w:pPr>
+              <w:pStyle w:val="Fuzeile"/>
+            </w:pPr>
+            <w:r>
+              <w:t>​</w:t>
+            </w:r>
+          </w:p>
         </w:sdtContent>
       </w:sdt>
-      <w:tc>
-        <w:tcPr>
-          <w:tcW w:w="1701" w:type="dxa"/>
-          <w:tcBorders>
-            <w:top w:val="single" w:sz="4" w:space="0" w:color="auto"/>
-            <w:left w:val="nil"/>
-            <w:bottom w:val="nil"/>
-            <w:right w:val="nil"/>
-          </w:tcBorders>
-          <w:hideMark/>
-        </w:tcPr>
-        <w:p>
-          <w:pPr>
-            <w:pStyle w:val="Fuzeile"/>
-            <w:spacing w:before="60"/>
-            <w:rPr>
-              <w:rFonts w:cs="Arial"/>
-              <w:szCs w:val="16"/>
-            </w:rPr>
-          </w:pPr>
-          <w:r>
-            <w:rPr>
-              <w:rFonts w:cs="Arial"/>
-              <w:szCs w:val="16"/>
-            </w:rPr>
-            <w:t>Sachbearbeitung:</w:t>
-          </w:r>
-        </w:p>
-      </w:tc>
-      <w:sdt>
-        <w:sdtPr>
-          <w:rPr>
-            <w:rFonts w:cs="Arial"/>
-            <w:szCs w:val="16"/>
-          </w:rPr>
-          <w:tag w:val="Sachbearbeitung"/>
-          <w:id w:val="-1393195049"/>
-          <w:dataBinding w:prefixMappings="xmlns:ns='http://schemas.officeatwork.com/CustomXMLPart'" w:xpath="/ns:officeatwork/ns:Sachbearbeitung" w:storeItemID="{449B45FC-8755-4360-A7E8-6A1DA88E2CF0}"/>
-          <w:text w:multiLine="1"/>
-        </w:sdtPr>
-        <w:sdtEndPr/>
-        <w:sdtContent>
-          <w:tc>
-            <w:tcPr>
-              <w:tcW w:w="2692" w:type="dxa"/>
-              <w:tcBorders>
-                <w:top w:val="single" w:sz="4" w:space="0" w:color="auto"/>
-                <w:left w:val="nil"/>
-                <w:bottom w:val="nil"/>
-                <w:right w:val="nil"/>
-              </w:tcBorders>
-            </w:tcPr>
-            <w:p>
-              <w:pPr>
-                <w:pStyle w:val="Fuzeile"/>
-                <w:spacing w:before="60"/>
-                <w:rPr>
-                  <w:rFonts w:cs="Arial"/>
-                  <w:szCs w:val="16"/>
-                </w:rPr>
-              </w:pPr>
-              <w:r>
-                <w:rPr>
-                  <w:rFonts w:cs="Arial"/>
-                  <w:szCs w:val="16"/>
-                </w:rPr>
-                <w:t>​</w:t>
-              </w:r>
-            </w:p>
-          </w:tc>
-        </w:sdtContent>
-      </w:sdt>
-    </w:tr>
-    <w:tr>
-      <w:sdt>
-        <w:sdtPr>
-          <w:rPr>
-            <w:rFonts w:cs="Arial"/>
-            <w:szCs w:val="16"/>
-          </w:rPr>
-          <w:tag w:val="Amt"/>
-          <w:id w:val="-1768693055"/>
-          <w:dataBinding w:prefixMappings="xmlns:ns='http://schemas.officeatwork.com/CustomXMLPart'" w:xpath="/ns:officeatwork/ns:Amt" w:storeItemID="{449B45FC-8755-4360-A7E8-6A1DA88E2CF0}"/>
-          <w:text w:multiLine="1"/>
-        </w:sdtPr>
-        <w:sdtEndPr/>
-        <w:sdtContent>
-          <w:tc>
-            <w:tcPr>
-              <w:tcW w:w="4678" w:type="dxa"/>
-            </w:tcPr>
-            <w:p>
-              <w:pPr>
-                <w:pStyle w:val="Fuzeile"/>
-                <w:rPr>
-                  <w:rFonts w:cs="Arial"/>
-                  <w:szCs w:val="16"/>
-                </w:rPr>
-              </w:pPr>
-              <w:r>
-                <w:rPr>
-                  <w:rFonts w:cs="Arial"/>
-                  <w:szCs w:val="16"/>
-                </w:rPr>
-                <w:t>​</w:t>
-              </w:r>
-            </w:p>
-          </w:tc>
-        </w:sdtContent>
-      </w:sdt>
-      <w:tc>
-        <w:tcPr>
-          <w:tcW w:w="1701" w:type="dxa"/>
-          <w:hideMark/>
-        </w:tcPr>
-        <w:p>
-          <w:pPr>
-            <w:pStyle w:val="Fuzeile"/>
-            <w:rPr>
-              <w:rFonts w:cs="Arial"/>
-              <w:szCs w:val="16"/>
-            </w:rPr>
-          </w:pPr>
-          <w:r>
-            <w:rPr>
-              <w:rFonts w:cs="Arial"/>
-              <w:szCs w:val="16"/>
-            </w:rPr>
-            <w:t>Telefon:</w:t>
-          </w:r>
-        </w:p>
-      </w:tc>
-      <w:sdt>
-        <w:sdtPr>
-          <w:rPr>
-            <w:rFonts w:cs="Arial"/>
-            <w:szCs w:val="16"/>
-          </w:rPr>
-          <w:tag w:val="Telefon"/>
-          <w:id w:val="1606843158"/>
-          <w:dataBinding w:prefixMappings="xmlns:ns='http://schemas.officeatwork.com/CustomXMLPart'" w:xpath="/ns:officeatwork/ns:Telefon" w:storeItemID="{449B45FC-8755-4360-A7E8-6A1DA88E2CF0}"/>
-          <w:text w:multiLine="1"/>
-        </w:sdtPr>
-        <w:sdtEndPr/>
-        <w:sdtContent>
-          <w:tc>
-            <w:tcPr>
-              <w:tcW w:w="2692" w:type="dxa"/>
-            </w:tcPr>
-            <w:p>
-              <w:pPr>
-                <w:pStyle w:val="Fuzeile"/>
-                <w:rPr>
-                  <w:rFonts w:cs="Arial"/>
-                  <w:szCs w:val="16"/>
-                </w:rPr>
-              </w:pPr>
-              <w:r>
-                <w:rPr>
-                  <w:rFonts w:cs="Arial"/>
-                  <w:szCs w:val="16"/>
-                </w:rPr>
-                <w:t>​</w:t>
-              </w:r>
-            </w:p>
-          </w:tc>
-        </w:sdtContent>
-      </w:sdt>
-    </w:tr>
-    <w:tr>
-      <w:sdt>
-        <w:sdtPr>
-          <w:rPr>
-            <w:rFonts w:cs="Arial"/>
-            <w:szCs w:val="16"/>
-          </w:rPr>
-          <w:tag w:val="Address"/>
-          <w:id w:val="1144620027"/>
-          <w:dataBinding w:prefixMappings="xmlns:ns='http://schemas.officeatwork.com/CustomXMLPart'" w:xpath="/ns:officeatwork/ns:Address" w:storeItemID="{449B45FC-8755-4360-A7E8-6A1DA88E2CF0}"/>
-          <w:text w:multiLine="1"/>
-        </w:sdtPr>
-        <w:sdtEndPr/>
-        <w:sdtContent>
-          <w:tc>
-            <w:tcPr>
-              <w:tcW w:w="4678" w:type="dxa"/>
-            </w:tcPr>
-            <w:p>
-              <w:pPr>
-                <w:pStyle w:val="Fuzeile"/>
-                <w:rPr>
-                  <w:rFonts w:cs="Arial"/>
-                  <w:szCs w:val="16"/>
-                </w:rPr>
-              </w:pPr>
-              <w:r>
-                <w:rPr>
-                  <w:rFonts w:cs="Arial"/>
-                  <w:szCs w:val="16"/>
-                </w:rPr>
-                <w:t>​</w:t>
-              </w:r>
-            </w:p>
-          </w:tc>
-        </w:sdtContent>
-      </w:sdt>
-      <w:tc>
-        <w:tcPr>
-          <w:tcW w:w="1701" w:type="dxa"/>
-          <w:hideMark/>
-        </w:tcPr>
-        <w:p>
-          <w:pPr>
-            <w:pStyle w:val="Fuzeile"/>
-            <w:rPr>
-              <w:rFonts w:cs="Arial"/>
-              <w:szCs w:val="16"/>
-            </w:rPr>
-          </w:pPr>
-          <w:r>
-            <w:rPr>
-              <w:rFonts w:cs="Arial"/>
-              <w:szCs w:val="16"/>
-            </w:rPr>
-            <w:t>E-Mail:</w:t>
-          </w:r>
-        </w:p>
-      </w:tc>
-      <w:sdt>
-        <w:sdtPr>
-          <w:rPr>
-            <w:rFonts w:cs="Arial"/>
-            <w:szCs w:val="16"/>
-          </w:rPr>
-          <w:tag w:val="EMail"/>
-          <w:id w:val="-2129467010"/>
-          <w:dataBinding w:prefixMappings="xmlns:ns='http://schemas.officeatwork.com/CustomXMLPart'" w:xpath="/ns:officeatwork/ns:EMail" w:storeItemID="{449B45FC-8755-4360-A7E8-6A1DA88E2CF0}"/>
-          <w:text w:multiLine="1"/>
-        </w:sdtPr>
-        <w:sdtEndPr/>
-        <w:sdtContent>
-          <w:tc>
-            <w:tcPr>
-              <w:tcW w:w="2692" w:type="dxa"/>
-            </w:tcPr>
-            <w:p>
-              <w:pPr>
-                <w:pStyle w:val="Fuzeile"/>
-                <w:rPr>
-                  <w:rFonts w:cs="Arial"/>
-                  <w:szCs w:val="16"/>
-                </w:rPr>
-              </w:pPr>
-              <w:r>
-                <w:rPr>
-                  <w:rFonts w:cs="Arial"/>
-                  <w:szCs w:val="16"/>
-                </w:rPr>
-                <w:t>​</w:t>
-              </w:r>
-            </w:p>
-          </w:tc>
-        </w:sdtContent>
-      </w:sdt>
-    </w:tr>
-    <w:tr>
-      <w:sdt>
-        <w:sdtPr>
-          <w:rPr>
-            <w:rFonts w:cs="Arial"/>
-            <w:szCs w:val="16"/>
-          </w:rPr>
-          <w:tag w:val="Address2"/>
-          <w:id w:val="-75909627"/>
-          <w:dataBinding w:prefixMappings="xmlns:ns='http://schemas.officeatwork.com/CustomXMLPart'" w:xpath="/ns:officeatwork/ns:Address2" w:storeItemID="{449B45FC-8755-4360-A7E8-6A1DA88E2CF0}"/>
-          <w:text w:multiLine="1"/>
-        </w:sdtPr>
-        <w:sdtEndPr/>
-        <w:sdtContent>
-          <w:tc>
-            <w:tcPr>
-              <w:tcW w:w="4678" w:type="dxa"/>
-              <w:hideMark/>
-            </w:tcPr>
-            <w:p>
-              <w:pPr>
-                <w:pStyle w:val="Fuzeile"/>
-                <w:rPr>
-                  <w:rFonts w:cs="Arial"/>
-                  <w:szCs w:val="16"/>
-                </w:rPr>
-              </w:pPr>
-              <w:r>
-                <w:rPr>
-                  <w:rFonts w:cs="Arial"/>
-                  <w:szCs w:val="16"/>
-                </w:rPr>
-                <w:t>​</w:t>
-              </w:r>
-            </w:p>
-          </w:tc>
-        </w:sdtContent>
-      </w:sdt>
-      <w:tc>
-        <w:tcPr>
-          <w:tcW w:w="1701" w:type="dxa"/>
-          <w:hideMark/>
-        </w:tcPr>
-        <w:p>
-          <w:pPr>
-            <w:pStyle w:val="Fuzeile"/>
-            <w:rPr>
-              <w:rFonts w:cs="Arial"/>
-              <w:szCs w:val="16"/>
-            </w:rPr>
-          </w:pPr>
-          <w:r>
-            <w:rPr>
-              <w:rFonts w:cs="Arial"/>
-              <w:szCs w:val="16"/>
-            </w:rPr>
-            <w:t>Internet:</w:t>
-          </w:r>
-        </w:p>
-      </w:tc>
-      <w:tc>
-        <w:tcPr>
-          <w:tcW w:w="2692" w:type="dxa"/>
-        </w:tcPr>
-        <w:p>
-          <w:pPr>
-            <w:pStyle w:val="Fuzeile"/>
-            <w:rPr>
-              <w:rFonts w:cs="Arial"/>
-              <w:szCs w:val="16"/>
-            </w:rPr>
-          </w:pPr>
-          <w:sdt>
-            <w:sdtPr>
-              <w:rPr>
-                <w:rFonts w:cs="Arial"/>
-                <w:szCs w:val="16"/>
-              </w:rPr>
-              <w:tag w:val="Internet"/>
-              <w:id w:val="1163747467"/>
-              <w:dataBinding w:prefixMappings="xmlns:ns='http://schemas.officeatwork.com/CustomXMLPart'" w:xpath="/ns:officeatwork/ns:Internet" w:storeItemID="{449B45FC-8755-4360-A7E8-6A1DA88E2CF0}"/>
-              <w:text w:multiLine="1"/>
-            </w:sdtPr>
-            <w:sdtEndPr/>
-            <w:sdtContent>
-              <w:r>
-                <w:rPr>
-                  <w:rFonts w:cs="Arial"/>
-                  <w:szCs w:val="16"/>
-                </w:rPr>
-                <w:t>​</w:t>
-              </w:r>
-            </w:sdtContent>
-          </w:sdt>
-        </w:p>
-      </w:tc>
-    </w:tr>
-  </w:tbl>
+    </w:sdtContent>
+  </w:sdt>
+</w:ftr>
+</file>
+
+<file path=word/footer3.xml><?xml version="1.0" encoding="utf-8"?>
+<w:ftr xmlns:wpc="http://schemas.microsoft.com/office/word/2010/wordprocessingCanvas" xmlns:cx="http://schemas.microsoft.com/office/drawing/2014/chartex" xmlns:cx1="http://schemas.microsoft.com/office/drawing/2015/9/8/chartex" xmlns:cx2="http://schemas.microsoft.com/office/drawing/2015/10/21/chartex" xmlns:cx3="http://schemas.microsoft.com/office/drawing/2016/5/9/chartex" xmlns:cx4="http://schemas.microsoft.com/office/drawing/2016/5/10/chartex" xmlns:cx5="http://schemas.microsoft.com/office/drawing/2016/5/11/chartex" xmlns:cx6="http://schemas.microsoft.com/office/drawing/2016/5/12/chartex" xmlns:cx7="http://schemas.microsoft.com/office/drawing/2016/5/13/chartex" xmlns:cx8="http://schemas.microsoft.com/office/drawing/2016/5/14/chartex" xmlns:mc="http://schemas.openxmlformats.org/markup-compatibility/2006" xmlns:aink="http://schemas.microsoft.com/office/drawing/2016/ink" xmlns:am3d="http://schemas.microsoft.com/office/drawing/2017/model3d" xmlns:o="urn:schemas-microsoft-com:office:office" xmlns:oel="http://schemas.microsoft.com/office/2019/extlst" xmlns:r="http://schemas.openxmlformats.org/officeDocument/2006/relationships" xmlns:m="http://schemas.openxmlformats.org/officeDocument/2006/math" xmlns:v="urn:schemas-microsoft-com:vml" xmlns:wp14="http://schemas.microsoft.com/office/word/2010/wordprocessingDrawing" xmlns:wp="http://schemas.openxmlformats.org/drawingml/2006/wordprocessingDrawing" xmlns:w10="urn:schemas-microsoft-com:office:word" xmlns:w="http://schemas.openxmlformats.org/wordprocessingml/2006/main" xmlns:w14="http://schemas.microsoft.com/office/word/2010/wordml" xmlns:w15="http://schemas.microsoft.com/office/word/2012/wordml" xmlns:w16cex="http://schemas.microsoft.com/office/word/2018/wordml/cex" xmlns:w16cid="http://schemas.microsoft.com/office/word/2016/wordml/cid" xmlns:w16="http://schemas.microsoft.com/office/word/2018/wordml" xmlns:w16du="http://schemas.microsoft.com/office/word/2023/wordml/word16du" xmlns:w16sdtdh="http://schemas.microsoft.com/office/word/2020/wordml/sdtdatahash" xmlns:w16sdtfl="http://schemas.microsoft.com/office/word/2024/wordml/sdtformatlock" xmlns:w16se="http://schemas.microsoft.com/office/word/2015/wordml/symex" xmlns:wpg="http://schemas.microsoft.com/office/word/2010/wordprocessingGroup" xmlns:wpi="http://schemas.microsoft.com/office/word/2010/wordprocessingInk" xmlns:wne="http://schemas.microsoft.com/office/word/2006/wordml" xmlns:wps="http://schemas.microsoft.com/office/word/2010/wordprocessingShape" mc:Ignorable="w14 w15 w16se w16cid w16 w16cex w16sdtdh w16sdtfl w16du wp14">
   <w:p>
     <w:pPr>
       <w:pStyle w:val="Fuzeile"/>
@@ -1602,8 +899,8 @@
 </w:ftr>
 </file>
 
-<file path=word/footer3.xml><?xml version="1.0" encoding="utf-8"?>
-<w:ftr xmlns:wpc="http://schemas.microsoft.com/office/word/2010/wordprocessingCanvas" xmlns:cx="http://schemas.microsoft.com/office/drawing/2014/chartex" xmlns:cx1="http://schemas.microsoft.com/office/drawing/2015/9/8/chartex" xmlns:cx2="http://schemas.microsoft.com/office/drawing/2015/10/21/chartex" xmlns:cx3="http://schemas.microsoft.com/office/drawing/2016/5/9/chartex" xmlns:cx4="http://schemas.microsoft.com/office/drawing/2016/5/10/chartex" xmlns:cx5="http://schemas.microsoft.com/office/drawing/2016/5/11/chartex" xmlns:cx6="http://schemas.microsoft.com/office/drawing/2016/5/12/chartex" xmlns:cx7="http://schemas.microsoft.com/office/drawing/2016/5/13/chartex" xmlns:cx8="http://schemas.microsoft.com/office/drawing/2016/5/14/chartex" xmlns:mc="http://schemas.openxmlformats.org/markup-compatibility/2006" xmlns:aink="http://schemas.microsoft.com/office/drawing/2016/ink" xmlns:am3d="http://schemas.microsoft.com/office/drawing/2017/model3d" xmlns:o="urn:schemas-microsoft-com:office:office" xmlns:oel="http://schemas.microsoft.com/office/2019/extlst" xmlns:r="http://schemas.openxmlformats.org/officeDocument/2006/relationships" xmlns:m="http://schemas.openxmlformats.org/officeDocument/2006/math" xmlns:v="urn:schemas-microsoft-com:vml" xmlns:wp14="http://schemas.microsoft.com/office/word/2010/wordprocessingDrawing" xmlns:wp="http://schemas.openxmlformats.org/drawingml/2006/wordprocessingDrawing" xmlns:w10="urn:schemas-microsoft-com:office:word" xmlns:w="http://schemas.openxmlformats.org/wordprocessingml/2006/main" xmlns:w14="http://schemas.microsoft.com/office/word/2010/wordml" xmlns:w15="http://schemas.microsoft.com/office/word/2012/wordml" xmlns:w16cex="http://schemas.microsoft.com/office/word/2018/wordml/cex" xmlns:w16cid="http://schemas.microsoft.com/office/word/2016/wordml/cid" xmlns:w16="http://schemas.microsoft.com/office/word/2018/wordml" xmlns:w16sdtdh="http://schemas.microsoft.com/office/word/2020/wordml/sdtdatahash" xmlns:w16se="http://schemas.microsoft.com/office/word/2015/wordml/symex" xmlns:wpg="http://schemas.microsoft.com/office/word/2010/wordprocessingGroup" xmlns:wpi="http://schemas.microsoft.com/office/word/2010/wordprocessingInk" xmlns:wne="http://schemas.microsoft.com/office/word/2006/wordml" xmlns:wps="http://schemas.microsoft.com/office/word/2010/wordprocessingShape" mc:Ignorable="w14 w15 w16se w16cid w16 w16cex w16sdtdh wp14">
+<file path=word/footer4.xml><?xml version="1.0" encoding="utf-8"?>
+<w:ftr xmlns:wpc="http://schemas.microsoft.com/office/word/2010/wordprocessingCanvas" xmlns:cx="http://schemas.microsoft.com/office/drawing/2014/chartex" xmlns:cx1="http://schemas.microsoft.com/office/drawing/2015/9/8/chartex" xmlns:cx2="http://schemas.microsoft.com/office/drawing/2015/10/21/chartex" xmlns:cx3="http://schemas.microsoft.com/office/drawing/2016/5/9/chartex" xmlns:cx4="http://schemas.microsoft.com/office/drawing/2016/5/10/chartex" xmlns:cx5="http://schemas.microsoft.com/office/drawing/2016/5/11/chartex" xmlns:cx6="http://schemas.microsoft.com/office/drawing/2016/5/12/chartex" xmlns:cx7="http://schemas.microsoft.com/office/drawing/2016/5/13/chartex" xmlns:cx8="http://schemas.microsoft.com/office/drawing/2016/5/14/chartex" xmlns:mc="http://schemas.openxmlformats.org/markup-compatibility/2006" xmlns:aink="http://schemas.microsoft.com/office/drawing/2016/ink" xmlns:am3d="http://schemas.microsoft.com/office/drawing/2017/model3d" xmlns:o="urn:schemas-microsoft-com:office:office" xmlns:oel="http://schemas.microsoft.com/office/2019/extlst" xmlns:r="http://schemas.openxmlformats.org/officeDocument/2006/relationships" xmlns:m="http://schemas.openxmlformats.org/officeDocument/2006/math" xmlns:v="urn:schemas-microsoft-com:vml" xmlns:wp14="http://schemas.microsoft.com/office/word/2010/wordprocessingDrawing" xmlns:wp="http://schemas.openxmlformats.org/drawingml/2006/wordprocessingDrawing" xmlns:w10="urn:schemas-microsoft-com:office:word" xmlns:w="http://schemas.openxmlformats.org/wordprocessingml/2006/main" xmlns:w14="http://schemas.microsoft.com/office/word/2010/wordml" xmlns:w15="http://schemas.microsoft.com/office/word/2012/wordml" xmlns:w16cex="http://schemas.microsoft.com/office/word/2018/wordml/cex" xmlns:w16cid="http://schemas.microsoft.com/office/word/2016/wordml/cid" xmlns:w16="http://schemas.microsoft.com/office/word/2018/wordml" xmlns:w16du="http://schemas.microsoft.com/office/word/2023/wordml/word16du" xmlns:w16sdtdh="http://schemas.microsoft.com/office/word/2020/wordml/sdtdatahash" xmlns:w16sdtfl="http://schemas.microsoft.com/office/word/2024/wordml/sdtformatlock" xmlns:w16se="http://schemas.microsoft.com/office/word/2015/wordml/symex" xmlns:wpg="http://schemas.microsoft.com/office/word/2010/wordprocessingGroup" xmlns:wpi="http://schemas.microsoft.com/office/word/2010/wordprocessingInk" xmlns:wne="http://schemas.microsoft.com/office/word/2006/wordml" xmlns:wps="http://schemas.microsoft.com/office/word/2010/wordprocessingShape" mc:Ignorable="w14 w15 w16se w16cid w16 w16cex w16sdtdh w16sdtfl w16du wp14">
   <w:p>
     <w:pPr>
       <w:pStyle w:val="Fuzeile"/>
@@ -1618,14 +915,22 @@
     </w:r>
     <w:proofErr w:type="gramEnd"/>
     <w:r>
-      <w:t>_NUMMER }}</w:t>
+      <w:t>_</w:t>
+    </w:r>
+    <w:proofErr w:type="gramStart"/>
+    <w:r>
+      <w:t>NUMMER }</w:t>
+    </w:r>
+    <w:proofErr w:type="gramEnd"/>
+    <w:r>
+      <w:t>}</w:t>
     </w:r>
   </w:p>
 </w:ftr>
 </file>
 
 <file path=word/footnotes.xml><?xml version="1.0" encoding="utf-8"?>
-<w:footnotes xmlns:wpc="http://schemas.microsoft.com/office/word/2010/wordprocessingCanvas" xmlns:cx="http://schemas.microsoft.com/office/drawing/2014/chartex" xmlns:cx1="http://schemas.microsoft.com/office/drawing/2015/9/8/chartex" xmlns:cx2="http://schemas.microsoft.com/office/drawing/2015/10/21/chartex" xmlns:cx3="http://schemas.microsoft.com/office/drawing/2016/5/9/chartex" xmlns:cx4="http://schemas.microsoft.com/office/drawing/2016/5/10/chartex" xmlns:cx5="http://schemas.microsoft.com/office/drawing/2016/5/11/chartex" xmlns:cx6="http://schemas.microsoft.com/office/drawing/2016/5/12/chartex" xmlns:cx7="http://schemas.microsoft.com/office/drawing/2016/5/13/chartex" xmlns:cx8="http://schemas.microsoft.com/office/drawing/2016/5/14/chartex" xmlns:mc="http://schemas.openxmlformats.org/markup-compatibility/2006" xmlns:aink="http://schemas.microsoft.com/office/drawing/2016/ink" xmlns:am3d="http://schemas.microsoft.com/office/drawing/2017/model3d" xmlns:o="urn:schemas-microsoft-com:office:office" xmlns:oel="http://schemas.microsoft.com/office/2019/extlst" xmlns:r="http://schemas.openxmlformats.org/officeDocument/2006/relationships" xmlns:m="http://schemas.openxmlformats.org/officeDocument/2006/math" xmlns:v="urn:schemas-microsoft-com:vml" xmlns:wp14="http://schemas.microsoft.com/office/word/2010/wordprocessingDrawing" xmlns:wp="http://schemas.openxmlformats.org/drawingml/2006/wordprocessingDrawing" xmlns:w10="urn:schemas-microsoft-com:office:word" xmlns:w="http://schemas.openxmlformats.org/wordprocessingml/2006/main" xmlns:w14="http://schemas.microsoft.com/office/word/2010/wordml" xmlns:w15="http://schemas.microsoft.com/office/word/2012/wordml" xmlns:w16cex="http://schemas.microsoft.com/office/word/2018/wordml/cex" xmlns:w16cid="http://schemas.microsoft.com/office/word/2016/wordml/cid" xmlns:w16="http://schemas.microsoft.com/office/word/2018/wordml" xmlns:w16sdtdh="http://schemas.microsoft.com/office/word/2020/wordml/sdtdatahash" xmlns:w16se="http://schemas.microsoft.com/office/word/2015/wordml/symex" xmlns:wpg="http://schemas.microsoft.com/office/word/2010/wordprocessingGroup" xmlns:wpi="http://schemas.microsoft.com/office/word/2010/wordprocessingInk" xmlns:wne="http://schemas.microsoft.com/office/word/2006/wordml" xmlns:wps="http://schemas.microsoft.com/office/word/2010/wordprocessingShape" mc:Ignorable="w14 w15 w16se w16cid w16 w16cex w16sdtdh wp14">
+<w:footnotes xmlns:wpc="http://schemas.microsoft.com/office/word/2010/wordprocessingCanvas" xmlns:cx="http://schemas.microsoft.com/office/drawing/2014/chartex" xmlns:cx1="http://schemas.microsoft.com/office/drawing/2015/9/8/chartex" xmlns:cx2="http://schemas.microsoft.com/office/drawing/2015/10/21/chartex" xmlns:cx3="http://schemas.microsoft.com/office/drawing/2016/5/9/chartex" xmlns:cx4="http://schemas.microsoft.com/office/drawing/2016/5/10/chartex" xmlns:cx5="http://schemas.microsoft.com/office/drawing/2016/5/11/chartex" xmlns:cx6="http://schemas.microsoft.com/office/drawing/2016/5/12/chartex" xmlns:cx7="http://schemas.microsoft.com/office/drawing/2016/5/13/chartex" xmlns:cx8="http://schemas.microsoft.com/office/drawing/2016/5/14/chartex" xmlns:mc="http://schemas.openxmlformats.org/markup-compatibility/2006" xmlns:aink="http://schemas.microsoft.com/office/drawing/2016/ink" xmlns:am3d="http://schemas.microsoft.com/office/drawing/2017/model3d" xmlns:o="urn:schemas-microsoft-com:office:office" xmlns:oel="http://schemas.microsoft.com/office/2019/extlst" xmlns:r="http://schemas.openxmlformats.org/officeDocument/2006/relationships" xmlns:m="http://schemas.openxmlformats.org/officeDocument/2006/math" xmlns:v="urn:schemas-microsoft-com:vml" xmlns:wp14="http://schemas.microsoft.com/office/word/2010/wordprocessingDrawing" xmlns:wp="http://schemas.openxmlformats.org/drawingml/2006/wordprocessingDrawing" xmlns:w10="urn:schemas-microsoft-com:office:word" xmlns:w="http://schemas.openxmlformats.org/wordprocessingml/2006/main" xmlns:w14="http://schemas.microsoft.com/office/word/2010/wordml" xmlns:w15="http://schemas.microsoft.com/office/word/2012/wordml" xmlns:w16cex="http://schemas.microsoft.com/office/word/2018/wordml/cex" xmlns:w16cid="http://schemas.microsoft.com/office/word/2016/wordml/cid" xmlns:w16="http://schemas.microsoft.com/office/word/2018/wordml" xmlns:w16du="http://schemas.microsoft.com/office/word/2023/wordml/word16du" xmlns:w16sdtdh="http://schemas.microsoft.com/office/word/2020/wordml/sdtdatahash" xmlns:w16sdtfl="http://schemas.microsoft.com/office/word/2024/wordml/sdtformatlock" xmlns:w16se="http://schemas.microsoft.com/office/word/2015/wordml/symex" xmlns:wpg="http://schemas.microsoft.com/office/word/2010/wordprocessingGroup" xmlns:wpi="http://schemas.microsoft.com/office/word/2010/wordprocessingInk" xmlns:wne="http://schemas.microsoft.com/office/word/2006/wordml" xmlns:wps="http://schemas.microsoft.com/office/word/2010/wordprocessingShape" mc:Ignorable="w14 w15 w16se w16cid w16 w16cex w16sdtdh w16sdtfl w16du wp14">
   <w:footnote w:type="separator" w:id="-1">
     <w:p>
       <w:pPr>
@@ -1650,119 +955,7 @@
 </file>
 
 <file path=word/header1.xml><?xml version="1.0" encoding="utf-8"?>
-<w:hdr xmlns:wpc="http://schemas.microsoft.com/office/word/2010/wordprocessingCanvas" xmlns:cx="http://schemas.microsoft.com/office/drawing/2014/chartex" xmlns:cx1="http://schemas.microsoft.com/office/drawing/2015/9/8/chartex" xmlns:cx2="http://schemas.microsoft.com/office/drawing/2015/10/21/chartex" xmlns:cx3="http://schemas.microsoft.com/office/drawing/2016/5/9/chartex" xmlns:cx4="http://schemas.microsoft.com/office/drawing/2016/5/10/chartex" xmlns:cx5="http://schemas.microsoft.com/office/drawing/2016/5/11/chartex" xmlns:cx6="http://schemas.microsoft.com/office/drawing/2016/5/12/chartex" xmlns:cx7="http://schemas.microsoft.com/office/drawing/2016/5/13/chartex" xmlns:cx8="http://schemas.microsoft.com/office/drawing/2016/5/14/chartex" xmlns:mc="http://schemas.openxmlformats.org/markup-compatibility/2006" xmlns:aink="http://schemas.microsoft.com/office/drawing/2016/ink" xmlns:am3d="http://schemas.microsoft.com/office/drawing/2017/model3d" xmlns:o="urn:schemas-microsoft-com:office:office" xmlns:oel="http://schemas.microsoft.com/office/2019/extlst" xmlns:r="http://schemas.openxmlformats.org/officeDocument/2006/relationships" xmlns:m="http://schemas.openxmlformats.org/officeDocument/2006/math" xmlns:v="urn:schemas-microsoft-com:vml" xmlns:wp14="http://schemas.microsoft.com/office/word/2010/wordprocessingDrawing" xmlns:wp="http://schemas.openxmlformats.org/drawingml/2006/wordprocessingDrawing" xmlns:w10="urn:schemas-microsoft-com:office:word" xmlns:w="http://schemas.openxmlformats.org/wordprocessingml/2006/main" xmlns:w14="http://schemas.microsoft.com/office/word/2010/wordml" xmlns:w15="http://schemas.microsoft.com/office/word/2012/wordml" xmlns:w16cex="http://schemas.microsoft.com/office/word/2018/wordml/cex" xmlns:w16cid="http://schemas.microsoft.com/office/word/2016/wordml/cid" xmlns:w16="http://schemas.microsoft.com/office/word/2018/wordml" xmlns:w16sdtdh="http://schemas.microsoft.com/office/word/2020/wordml/sdtdatahash" xmlns:w16se="http://schemas.microsoft.com/office/word/2015/wordml/symex" xmlns:wpg="http://schemas.microsoft.com/office/word/2010/wordprocessingGroup" xmlns:wpi="http://schemas.microsoft.com/office/word/2010/wordprocessingInk" xmlns:wne="http://schemas.microsoft.com/office/word/2006/wordml" xmlns:wps="http://schemas.microsoft.com/office/word/2010/wordprocessingShape" mc:Ignorable="w14 w15 w16se w16cid w16 w16cex w16sdtdh wp14">
-  <w:tbl>
-    <w:tblPr>
-      <w:tblStyle w:val="Tabellenraster"/>
-      <w:tblW w:w="9071" w:type="dxa"/>
-      <w:tblBorders>
-        <w:top w:val="none" w:sz="0" w:space="0" w:color="auto"/>
-        <w:left w:val="none" w:sz="0" w:space="0" w:color="auto"/>
-        <w:right w:val="none" w:sz="0" w:space="0" w:color="auto"/>
-        <w:insideH w:val="none" w:sz="0" w:space="0" w:color="auto"/>
-        <w:insideV w:val="none" w:sz="0" w:space="0" w:color="auto"/>
-      </w:tblBorders>
-      <w:tblLook w:val="04A0" w:firstRow="1" w:lastRow="0" w:firstColumn="1" w:lastColumn="0" w:noHBand="0" w:noVBand="1"/>
-    </w:tblPr>
-    <w:tblGrid>
-      <w:gridCol w:w="5074"/>
-      <w:gridCol w:w="3997"/>
-    </w:tblGrid>
-    <w:tr>
-      <w:trPr>
-        <w:trHeight w:val="1077"/>
-      </w:trPr>
-      <w:tc>
-        <w:tcPr>
-          <w:tcW w:w="5074" w:type="dxa"/>
-        </w:tcPr>
-        <w:p>
-          <w:pPr>
-            <w:pStyle w:val="Kopfzeile"/>
-          </w:pPr>
-          <w:r>
-            <w:rPr>
-              <w:noProof/>
-            </w:rPr>
-            <w:drawing>
-              <wp:anchor distT="0" distB="0" distL="114300" distR="114300" simplePos="0" relativeHeight="251662336" behindDoc="0" locked="0" layoutInCell="1" allowOverlap="1" wp14:anchorId="72C797CB" wp14:editId="6E172C0C">
-                <wp:simplePos x="0" y="0"/>
-                <wp:positionH relativeFrom="column">
-                  <wp:posOffset>-2540</wp:posOffset>
-                </wp:positionH>
-                <wp:positionV relativeFrom="paragraph">
-                  <wp:posOffset>39701</wp:posOffset>
-                </wp:positionV>
-                <wp:extent cx="1416440" cy="612000"/>
-                <wp:effectExtent l="0" t="0" r="0" b="0"/>
-                <wp:wrapSquare wrapText="bothSides"/>
-                <wp:docPr id="1852084364" name="Grafik 1" descr="Ein Bild, das Text, Schrift, Grafiken, Symbol enthält.&#10;&#10;Automatisch generierte Beschreibung"/>
-                <wp:cNvGraphicFramePr>
-                  <a:graphicFrameLocks xmlns:a="http://schemas.openxmlformats.org/drawingml/2006/main" noChangeAspect="1"/>
-                </wp:cNvGraphicFramePr>
-                <a:graphic xmlns:a="http://schemas.openxmlformats.org/drawingml/2006/main">
-                  <a:graphicData uri="http://schemas.openxmlformats.org/drawingml/2006/picture">
-                    <pic:pic xmlns:pic="http://schemas.openxmlformats.org/drawingml/2006/picture">
-                      <pic:nvPicPr>
-                        <pic:cNvPr id="1852084364" name="Grafik 1" descr="Ein Bild, das Text, Schrift, Grafiken, Symbol enthält.&#10;&#10;Automatisch generierte Beschreibung"/>
-                        <pic:cNvPicPr/>
-                      </pic:nvPicPr>
-                      <pic:blipFill>
-                        <a:blip r:embed="rId1"/>
-                        <a:stretch>
-                          <a:fillRect/>
-                        </a:stretch>
-                      </pic:blipFill>
-                      <pic:spPr>
-                        <a:xfrm>
-                          <a:off x="0" y="0"/>
-                          <a:ext cx="1416440" cy="612000"/>
-                        </a:xfrm>
-                        <a:prstGeom prst="rect">
-                          <a:avLst/>
-                        </a:prstGeom>
-                      </pic:spPr>
-                    </pic:pic>
-                  </a:graphicData>
-                </a:graphic>
-                <wp14:sizeRelH relativeFrom="page">
-                  <wp14:pctWidth>0</wp14:pctWidth>
-                </wp14:sizeRelH>
-                <wp14:sizeRelV relativeFrom="page">
-                  <wp14:pctHeight>0</wp14:pctHeight>
-                </wp14:sizeRelV>
-              </wp:anchor>
-            </w:drawing>
-          </w:r>
-        </w:p>
-      </w:tc>
-      <w:tc>
-        <w:tcPr>
-          <w:tcW w:w="3997" w:type="dxa"/>
-          <w:vAlign w:val="bottom"/>
-        </w:tcPr>
-        <w:p>
-          <w:pPr>
-            <w:pStyle w:val="Kopfzeile"/>
-            <w:jc w:val="left"/>
-            <w:rPr>
-              <w:caps/>
-              <w:sz w:val="28"/>
-              <w:szCs w:val="28"/>
-            </w:rPr>
-          </w:pPr>
-          <w:r>
-            <w:rPr>
-              <w:caps/>
-              <w:sz w:val="28"/>
-              <w:szCs w:val="28"/>
-            </w:rPr>
-            <w:t>Direktion/Amt</w:t>
-          </w:r>
-        </w:p>
-      </w:tc>
-    </w:tr>
-  </w:tbl>
+<w:hdr xmlns:wpc="http://schemas.microsoft.com/office/word/2010/wordprocessingCanvas" xmlns:cx="http://schemas.microsoft.com/office/drawing/2014/chartex" xmlns:cx1="http://schemas.microsoft.com/office/drawing/2015/9/8/chartex" xmlns:cx2="http://schemas.microsoft.com/office/drawing/2015/10/21/chartex" xmlns:cx3="http://schemas.microsoft.com/office/drawing/2016/5/9/chartex" xmlns:cx4="http://schemas.microsoft.com/office/drawing/2016/5/10/chartex" xmlns:cx5="http://schemas.microsoft.com/office/drawing/2016/5/11/chartex" xmlns:cx6="http://schemas.microsoft.com/office/drawing/2016/5/12/chartex" xmlns:cx7="http://schemas.microsoft.com/office/drawing/2016/5/13/chartex" xmlns:cx8="http://schemas.microsoft.com/office/drawing/2016/5/14/chartex" xmlns:mc="http://schemas.openxmlformats.org/markup-compatibility/2006" xmlns:aink="http://schemas.microsoft.com/office/drawing/2016/ink" xmlns:am3d="http://schemas.microsoft.com/office/drawing/2017/model3d" xmlns:o="urn:schemas-microsoft-com:office:office" xmlns:oel="http://schemas.microsoft.com/office/2019/extlst" xmlns:r="http://schemas.openxmlformats.org/officeDocument/2006/relationships" xmlns:m="http://schemas.openxmlformats.org/officeDocument/2006/math" xmlns:v="urn:schemas-microsoft-com:vml" xmlns:wp14="http://schemas.microsoft.com/office/word/2010/wordprocessingDrawing" xmlns:wp="http://schemas.openxmlformats.org/drawingml/2006/wordprocessingDrawing" xmlns:w10="urn:schemas-microsoft-com:office:word" xmlns:w="http://schemas.openxmlformats.org/wordprocessingml/2006/main" xmlns:w14="http://schemas.microsoft.com/office/word/2010/wordml" xmlns:w15="http://schemas.microsoft.com/office/word/2012/wordml" xmlns:w16cex="http://schemas.microsoft.com/office/word/2018/wordml/cex" xmlns:w16cid="http://schemas.microsoft.com/office/word/2016/wordml/cid" xmlns:w16="http://schemas.microsoft.com/office/word/2018/wordml" xmlns:w16du="http://schemas.microsoft.com/office/word/2023/wordml/word16du" xmlns:w16sdtdh="http://schemas.microsoft.com/office/word/2020/wordml/sdtdatahash" xmlns:w16sdtfl="http://schemas.microsoft.com/office/word/2024/wordml/sdtformatlock" xmlns:w16se="http://schemas.microsoft.com/office/word/2015/wordml/symex" xmlns:wpg="http://schemas.microsoft.com/office/word/2010/wordprocessingGroup" xmlns:wpi="http://schemas.microsoft.com/office/word/2010/wordprocessingInk" xmlns:wne="http://schemas.microsoft.com/office/word/2006/wordml" xmlns:wps="http://schemas.microsoft.com/office/word/2010/wordprocessingShape" mc:Ignorable="w14 w15 w16se w16cid w16 w16cex w16sdtdh w16sdtfl w16du wp14">
   <w:p>
     <w:pPr>
       <w:pStyle w:val="Kopfzeile"/>
@@ -1772,43 +965,152 @@
 </file>
 
 <file path=word/header2.xml><?xml version="1.0" encoding="utf-8"?>
-<w:hdr xmlns:wpc="http://schemas.microsoft.com/office/word/2010/wordprocessingCanvas" xmlns:cx="http://schemas.microsoft.com/office/drawing/2014/chartex" xmlns:cx1="http://schemas.microsoft.com/office/drawing/2015/9/8/chartex" xmlns:cx2="http://schemas.microsoft.com/office/drawing/2015/10/21/chartex" xmlns:cx3="http://schemas.microsoft.com/office/drawing/2016/5/9/chartex" xmlns:cx4="http://schemas.microsoft.com/office/drawing/2016/5/10/chartex" xmlns:cx5="http://schemas.microsoft.com/office/drawing/2016/5/11/chartex" xmlns:cx6="http://schemas.microsoft.com/office/drawing/2016/5/12/chartex" xmlns:cx7="http://schemas.microsoft.com/office/drawing/2016/5/13/chartex" xmlns:cx8="http://schemas.microsoft.com/office/drawing/2016/5/14/chartex" xmlns:mc="http://schemas.openxmlformats.org/markup-compatibility/2006" xmlns:aink="http://schemas.microsoft.com/office/drawing/2016/ink" xmlns:am3d="http://schemas.microsoft.com/office/drawing/2017/model3d" xmlns:o="urn:schemas-microsoft-com:office:office" xmlns:oel="http://schemas.microsoft.com/office/2019/extlst" xmlns:r="http://schemas.openxmlformats.org/officeDocument/2006/relationships" xmlns:m="http://schemas.openxmlformats.org/officeDocument/2006/math" xmlns:v="urn:schemas-microsoft-com:vml" xmlns:wp14="http://schemas.microsoft.com/office/word/2010/wordprocessingDrawing" xmlns:wp="http://schemas.openxmlformats.org/drawingml/2006/wordprocessingDrawing" xmlns:w10="urn:schemas-microsoft-com:office:word" xmlns:w="http://schemas.openxmlformats.org/wordprocessingml/2006/main" xmlns:w14="http://schemas.microsoft.com/office/word/2010/wordml" xmlns:w15="http://schemas.microsoft.com/office/word/2012/wordml" xmlns:w16cex="http://schemas.microsoft.com/office/word/2018/wordml/cex" xmlns:w16cid="http://schemas.microsoft.com/office/word/2016/wordml/cid" xmlns:w16="http://schemas.microsoft.com/office/word/2018/wordml" xmlns:w16sdtdh="http://schemas.microsoft.com/office/word/2020/wordml/sdtdatahash" xmlns:w16se="http://schemas.microsoft.com/office/word/2015/wordml/symex" xmlns:wpg="http://schemas.microsoft.com/office/word/2010/wordprocessingGroup" xmlns:wpi="http://schemas.microsoft.com/office/word/2010/wordprocessingInk" xmlns:wne="http://schemas.microsoft.com/office/word/2006/wordml" xmlns:wps="http://schemas.microsoft.com/office/word/2010/wordprocessingShape" mc:Ignorable="w14 w15 w16se w16cid w16 w16cex w16sdtdh wp14">
+<w:hdr xmlns:wpc="http://schemas.microsoft.com/office/word/2010/wordprocessingCanvas" xmlns:cx="http://schemas.microsoft.com/office/drawing/2014/chartex" xmlns:cx1="http://schemas.microsoft.com/office/drawing/2015/9/8/chartex" xmlns:cx2="http://schemas.microsoft.com/office/drawing/2015/10/21/chartex" xmlns:cx3="http://schemas.microsoft.com/office/drawing/2016/5/9/chartex" xmlns:cx4="http://schemas.microsoft.com/office/drawing/2016/5/10/chartex" xmlns:cx5="http://schemas.microsoft.com/office/drawing/2016/5/11/chartex" xmlns:cx6="http://schemas.microsoft.com/office/drawing/2016/5/12/chartex" xmlns:cx7="http://schemas.microsoft.com/office/drawing/2016/5/13/chartex" xmlns:cx8="http://schemas.microsoft.com/office/drawing/2016/5/14/chartex" xmlns:mc="http://schemas.openxmlformats.org/markup-compatibility/2006" xmlns:aink="http://schemas.microsoft.com/office/drawing/2016/ink" xmlns:am3d="http://schemas.microsoft.com/office/drawing/2017/model3d" xmlns:o="urn:schemas-microsoft-com:office:office" xmlns:oel="http://schemas.microsoft.com/office/2019/extlst" xmlns:r="http://schemas.openxmlformats.org/officeDocument/2006/relationships" xmlns:m="http://schemas.openxmlformats.org/officeDocument/2006/math" xmlns:v="urn:schemas-microsoft-com:vml" xmlns:wp14="http://schemas.microsoft.com/office/word/2010/wordprocessingDrawing" xmlns:wp="http://schemas.openxmlformats.org/drawingml/2006/wordprocessingDrawing" xmlns:w10="urn:schemas-microsoft-com:office:word" xmlns:w="http://schemas.openxmlformats.org/wordprocessingml/2006/main" xmlns:w14="http://schemas.microsoft.com/office/word/2010/wordml" xmlns:w15="http://schemas.microsoft.com/office/word/2012/wordml" xmlns:w16cex="http://schemas.microsoft.com/office/word/2018/wordml/cex" xmlns:w16cid="http://schemas.microsoft.com/office/word/2016/wordml/cid" xmlns:w16="http://schemas.microsoft.com/office/word/2018/wordml" xmlns:w16du="http://schemas.microsoft.com/office/word/2023/wordml/word16du" xmlns:w16sdtdh="http://schemas.microsoft.com/office/word/2020/wordml/sdtdatahash" xmlns:w16sdtfl="http://schemas.microsoft.com/office/word/2024/wordml/sdtformatlock" xmlns:w16se="http://schemas.microsoft.com/office/word/2015/wordml/symex" xmlns:wpg="http://schemas.microsoft.com/office/word/2010/wordprocessingGroup" xmlns:wpi="http://schemas.microsoft.com/office/word/2010/wordprocessingInk" xmlns:wne="http://schemas.microsoft.com/office/word/2006/wordml" xmlns:wps="http://schemas.microsoft.com/office/word/2010/wordprocessingShape" mc:Ignorable="w14 w15 w16se w16cid w16 w16cex w16sdtdh w16sdtfl w16du wp14">
   <w:sdt>
     <w:sdtPr>
-      <w:id w:val="1433393313"/>
-      <w:docPartObj>
-        <w:docPartGallery w:val="Page Numbers (Top of Page)"/>
-        <w:docPartUnique/>
-      </w:docPartObj>
+      <w:rPr>
+        <w:sz w:val="22"/>
+        <w:lang w:val="de-CH"/>
+      </w:rPr>
+      <w:alias w:val="Header Block P1"/>
+      <w:tag w:val="officeatworkDocumentPart: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"/>
+      <w:id w:val="-2001033614"/>
+      <w:placeholder>
+        <w:docPart w:val="DefaultPlaceholder_-1854013440"/>
+      </w:placeholder>
+      <w15:appearance w15:val="hidden"/>
     </w:sdtPr>
-    <w:sdtEndPr/>
     <w:sdtContent>
       <w:p>
         <w:pPr>
+          <w:pStyle w:val="1pt"/>
+        </w:pPr>
+      </w:p>
+      <w:tbl>
+        <w:tblPr>
+          <w:tblW w:w="9072" w:type="dxa"/>
+          <w:tblBorders>
+            <w:bottom w:val="single" w:sz="4" w:space="0" w:color="auto"/>
+          </w:tblBorders>
+          <w:tblLayout w:type="fixed"/>
+          <w:tblCellMar>
+            <w:left w:w="0" w:type="dxa"/>
+            <w:right w:w="0" w:type="dxa"/>
+          </w:tblCellMar>
+          <w:tblLook w:val="01E0" w:firstRow="1" w:lastRow="1" w:firstColumn="1" w:lastColumn="1" w:noHBand="0" w:noVBand="0"/>
+        </w:tblPr>
+        <w:tblGrid>
+          <w:gridCol w:w="4679"/>
+          <w:gridCol w:w="4393"/>
+        </w:tblGrid>
+        <w:tr>
+          <w:trPr>
+            <w:trHeight w:hRule="exact" w:val="1077"/>
+          </w:trPr>
+          <w:tc>
+            <w:tcPr>
+              <w:tcW w:w="5074" w:type="dxa"/>
+              <w:tcBorders>
+                <w:top w:val="nil"/>
+                <w:left w:val="nil"/>
+                <w:bottom w:val="single" w:sz="4" w:space="0" w:color="auto"/>
+                <w:right w:val="nil"/>
+              </w:tcBorders>
+            </w:tcPr>
+            <w:p>
+              <w:pPr>
+                <w:pStyle w:val="1pt"/>
+              </w:pPr>
+            </w:p>
+            <w:sdt>
+              <w:sdtPr>
+                <w:alias w:val="Kopfzeile (gesperrt)"/>
+                <w:tag w:val="officeatworkDocumentPart: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"/>
+                <w:id w:val="1420138689"/>
+                <w:lock w:val="sdtContentLocked"/>
+                <w:placeholder>
+                  <w:docPart w:val="4E963FEC58C344AB927956B6F370AB09"/>
+                </w:placeholder>
+                <w:showingPlcHdr/>
+              </w:sdtPr>
+              <w:sdtContent>
+                <w:p>
+                  <w:pPr>
+                    <w:pStyle w:val="1pt"/>
+                  </w:pPr>
+                  <w:r>
+                    <w:rPr>
+                      <w:rStyle w:val="Platzhaltertext"/>
+                      <w:rFonts w:ascii="Arial" w:hAnsi="Arial" w:cs="Arial"/>
+                    </w:rPr>
+                    <w:t>​</w:t>
+                  </w:r>
+                </w:p>
+              </w:sdtContent>
+            </w:sdt>
+          </w:tc>
+          <w:tc>
+            <w:tcPr>
+              <w:tcW w:w="4763" w:type="dxa"/>
+              <w:tcBorders>
+                <w:top w:val="nil"/>
+                <w:left w:val="nil"/>
+                <w:bottom w:val="single" w:sz="4" w:space="0" w:color="auto"/>
+                <w:right w:val="nil"/>
+              </w:tcBorders>
+              <w:vAlign w:val="bottom"/>
+            </w:tcPr>
+            <w:sdt>
+              <w:sdtPr>
+                <w:alias w:val="Kopfzeile (gesperrt)"/>
+                <w:tag w:val="officeatworkDocumentPart: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"/>
+                <w:id w:val="204998344"/>
+                <w:lock w:val="sdtContentLocked"/>
+                <w:placeholder>
+                  <w:docPart w:val="E2D981C990B64A49999EBE64811507D8"/>
+                </w:placeholder>
+                <w:showingPlcHdr/>
+              </w:sdtPr>
+              <w:sdtContent>
+                <w:p>
+                  <w:pPr>
+                    <w:pStyle w:val="Absender"/>
+                  </w:pPr>
+                  <w:r>
+                    <w:rPr>
+                      <w:rStyle w:val="Platzhaltertext"/>
+                      <w:rFonts w:ascii="Arial" w:hAnsi="Arial" w:cs="Arial"/>
+                    </w:rPr>
+                    <w:t>​</w:t>
+                  </w:r>
+                </w:p>
+              </w:sdtContent>
+            </w:sdt>
+          </w:tc>
+        </w:tr>
+      </w:tbl>
+      <w:p>
+        <w:pPr>
           <w:pStyle w:val="Kopfzeile"/>
-          <w:jc w:val="right"/>
         </w:pPr>
-        <w:r>
-          <w:fldChar w:fldCharType="begin"/>
-        </w:r>
-        <w:r>
-          <w:instrText>PAGE   \* MERGEFORMAT</w:instrText>
-        </w:r>
-        <w:r>
-          <w:fldChar w:fldCharType="separate"/>
-        </w:r>
-        <w:r>
-          <w:rPr>
-            <w:lang w:val="de-DE"/>
-          </w:rPr>
-          <w:t>2</w:t>
-        </w:r>
-        <w:r>
-          <w:fldChar w:fldCharType="end"/>
-        </w:r>
       </w:p>
     </w:sdtContent>
   </w:sdt>
+</w:hdr>
+</file>
+
+<file path=word/header3.xml><?xml version="1.0" encoding="utf-8"?>
+<w:hdr xmlns:wpc="http://schemas.microsoft.com/office/word/2010/wordprocessingCanvas" xmlns:cx="http://schemas.microsoft.com/office/drawing/2014/chartex" xmlns:cx1="http://schemas.microsoft.com/office/drawing/2015/9/8/chartex" xmlns:cx2="http://schemas.microsoft.com/office/drawing/2015/10/21/chartex" xmlns:cx3="http://schemas.microsoft.com/office/drawing/2016/5/9/chartex" xmlns:cx4="http://schemas.microsoft.com/office/drawing/2016/5/10/chartex" xmlns:cx5="http://schemas.microsoft.com/office/drawing/2016/5/11/chartex" xmlns:cx6="http://schemas.microsoft.com/office/drawing/2016/5/12/chartex" xmlns:cx7="http://schemas.microsoft.com/office/drawing/2016/5/13/chartex" xmlns:cx8="http://schemas.microsoft.com/office/drawing/2016/5/14/chartex" xmlns:mc="http://schemas.openxmlformats.org/markup-compatibility/2006" xmlns:aink="http://schemas.microsoft.com/office/drawing/2016/ink" xmlns:am3d="http://schemas.microsoft.com/office/drawing/2017/model3d" xmlns:o="urn:schemas-microsoft-com:office:office" xmlns:oel="http://schemas.microsoft.com/office/2019/extlst" xmlns:r="http://schemas.openxmlformats.org/officeDocument/2006/relationships" xmlns:m="http://schemas.openxmlformats.org/officeDocument/2006/math" xmlns:v="urn:schemas-microsoft-com:vml" xmlns:wp14="http://schemas.microsoft.com/office/word/2010/wordprocessingDrawing" xmlns:wp="http://schemas.openxmlformats.org/drawingml/2006/wordprocessingDrawing" xmlns:w10="urn:schemas-microsoft-com:office:word" xmlns:w="http://schemas.openxmlformats.org/wordprocessingml/2006/main" xmlns:w14="http://schemas.microsoft.com/office/word/2010/wordml" xmlns:w15="http://schemas.microsoft.com/office/word/2012/wordml" xmlns:w16cex="http://schemas.microsoft.com/office/word/2018/wordml/cex" xmlns:w16cid="http://schemas.microsoft.com/office/word/2016/wordml/cid" xmlns:w16="http://schemas.microsoft.com/office/word/2018/wordml" xmlns:w16du="http://schemas.microsoft.com/office/word/2023/wordml/word16du" xmlns:w16sdtdh="http://schemas.microsoft.com/office/word/2020/wordml/sdtdatahash" xmlns:w16sdtfl="http://schemas.microsoft.com/office/word/2024/wordml/sdtformatlock" xmlns:w16se="http://schemas.microsoft.com/office/word/2015/wordml/symex" xmlns:wpg="http://schemas.microsoft.com/office/word/2010/wordprocessingGroup" xmlns:wpi="http://schemas.microsoft.com/office/word/2010/wordprocessingInk" xmlns:wne="http://schemas.microsoft.com/office/word/2006/wordml" xmlns:wps="http://schemas.microsoft.com/office/word/2010/wordprocessingShape" mc:Ignorable="w14 w15 w16se w16cid w16 w16cex w16sdtdh w16sdtfl w16du wp14">
+  <w:p>
+    <w:pPr>
+      <w:pStyle w:val="Kopfzeile"/>
+    </w:pPr>
+  </w:p>
+</w:hdr>
+</file>
+
+<file path=word/header4.xml><?xml version="1.0" encoding="utf-8"?>
+<w:hdr xmlns:wpc="http://schemas.microsoft.com/office/word/2010/wordprocessingCanvas" xmlns:cx="http://schemas.microsoft.com/office/drawing/2014/chartex" xmlns:cx1="http://schemas.microsoft.com/office/drawing/2015/9/8/chartex" xmlns:cx2="http://schemas.microsoft.com/office/drawing/2015/10/21/chartex" xmlns:cx3="http://schemas.microsoft.com/office/drawing/2016/5/9/chartex" xmlns:cx4="http://schemas.microsoft.com/office/drawing/2016/5/10/chartex" xmlns:cx5="http://schemas.microsoft.com/office/drawing/2016/5/11/chartex" xmlns:cx6="http://schemas.microsoft.com/office/drawing/2016/5/12/chartex" xmlns:cx7="http://schemas.microsoft.com/office/drawing/2016/5/13/chartex" xmlns:cx8="http://schemas.microsoft.com/office/drawing/2016/5/14/chartex" xmlns:mc="http://schemas.openxmlformats.org/markup-compatibility/2006" xmlns:aink="http://schemas.microsoft.com/office/drawing/2016/ink" xmlns:am3d="http://schemas.microsoft.com/office/drawing/2017/model3d" xmlns:o="urn:schemas-microsoft-com:office:office" xmlns:oel="http://schemas.microsoft.com/office/2019/extlst" xmlns:r="http://schemas.openxmlformats.org/officeDocument/2006/relationships" xmlns:m="http://schemas.openxmlformats.org/officeDocument/2006/math" xmlns:v="urn:schemas-microsoft-com:vml" xmlns:wp14="http://schemas.microsoft.com/office/word/2010/wordprocessingDrawing" xmlns:wp="http://schemas.openxmlformats.org/drawingml/2006/wordprocessingDrawing" xmlns:w10="urn:schemas-microsoft-com:office:word" xmlns:w="http://schemas.openxmlformats.org/wordprocessingml/2006/main" xmlns:w14="http://schemas.microsoft.com/office/word/2010/wordml" xmlns:w15="http://schemas.microsoft.com/office/word/2012/wordml" xmlns:w16cex="http://schemas.microsoft.com/office/word/2018/wordml/cex" xmlns:w16cid="http://schemas.microsoft.com/office/word/2016/wordml/cid" xmlns:w16="http://schemas.microsoft.com/office/word/2018/wordml" xmlns:w16du="http://schemas.microsoft.com/office/word/2023/wordml/word16du" xmlns:w16sdtdh="http://schemas.microsoft.com/office/word/2020/wordml/sdtdatahash" xmlns:w16sdtfl="http://schemas.microsoft.com/office/word/2024/wordml/sdtformatlock" xmlns:w16se="http://schemas.microsoft.com/office/word/2015/wordml/symex" xmlns:wpg="http://schemas.microsoft.com/office/word/2010/wordprocessingGroup" xmlns:wpi="http://schemas.microsoft.com/office/word/2010/wordprocessingInk" xmlns:wne="http://schemas.microsoft.com/office/word/2006/wordml" xmlns:wps="http://schemas.microsoft.com/office/word/2010/wordprocessingShape" mc:Ignorable="w14 w15 w16se w16cid w16 w16cex w16sdtdh w16sdtfl w16du wp14">
   <w:p>
     <w:pPr>
       <w:pStyle w:val="Kopfzeile"/>
@@ -1818,12 +1120,85 @@
       </w:tabs>
       <w:ind w:right="-1"/>
     </w:pPr>
+    <w:r>
+      <w:rPr>
+        <w:noProof/>
+      </w:rPr>
+      <w:drawing>
+        <wp:anchor distT="0" distB="0" distL="114300" distR="114300" simplePos="0" relativeHeight="251659264" behindDoc="1" locked="1" layoutInCell="1" allowOverlap="1" wp14:anchorId="0EFAF881" wp14:editId="35AB57B6">
+          <wp:simplePos x="0" y="0"/>
+          <wp:positionH relativeFrom="column">
+            <wp:posOffset>-101600</wp:posOffset>
+          </wp:positionH>
+          <wp:positionV relativeFrom="paragraph">
+            <wp:posOffset>-244475</wp:posOffset>
+          </wp:positionV>
+          <wp:extent cx="2807335" cy="508635"/>
+          <wp:effectExtent l="0" t="0" r="0" b="5715"/>
+          <wp:wrapNone/>
+          <wp:docPr id="1" name="1915f5c0-df51-4687-9b3d-ad96_1" descr="A grey rectangular object with black text&#10;&#10;AI-generated content may be incorrect." hidden="1"/>
+          <wp:cNvGraphicFramePr/>
+          <a:graphic xmlns:a="http://schemas.openxmlformats.org/drawingml/2006/main">
+            <a:graphicData uri="http://schemas.openxmlformats.org/drawingml/2006/picture">
+              <pic:pic xmlns:pic="http://schemas.openxmlformats.org/drawingml/2006/picture">
+                <pic:nvPicPr>
+                  <pic:cNvPr id="1" name="1915f5c0-df51-4687-9b3d-ad96_1" descr="A grey rectangular object with black text&#10;&#10;AI-generated content may be incorrect." hidden="1"/>
+                  <pic:cNvPicPr/>
+                </pic:nvPicPr>
+                <pic:blipFill>
+                  <a:blip r:embed="rId1"/>
+                  <a:stretch>
+                    <a:fillRect/>
+                  </a:stretch>
+                </pic:blipFill>
+                <pic:spPr>
+                  <a:xfrm>
+                    <a:off x="0" y="0"/>
+                    <a:ext cx="2807335" cy="508635"/>
+                  </a:xfrm>
+                  <a:prstGeom prst="rect">
+                    <a:avLst/>
+                  </a:prstGeom>
+                </pic:spPr>
+              </pic:pic>
+            </a:graphicData>
+          </a:graphic>
+          <wp14:sizeRelH relativeFrom="margin">
+            <wp14:pctWidth>0</wp14:pctWidth>
+          </wp14:sizeRelH>
+          <wp14:sizeRelV relativeFrom="margin">
+            <wp14:pctHeight>0</wp14:pctHeight>
+          </wp14:sizeRelV>
+        </wp:anchor>
+      </w:drawing>
+    </w:r>
+    <w:r>
+      <w:t xml:space="preserve"> </w:t>
+    </w:r>
+    <w:r>
+      <w:tab/>
+    </w:r>
+    <w:r>
+      <w:fldChar w:fldCharType="begin"/>
+    </w:r>
+    <w:r>
+      <w:instrText xml:space="preserve"> PAGE  \* Arabic  \* MERGEFORMAT </w:instrText>
+    </w:r>
+    <w:r>
+      <w:fldChar w:fldCharType="separate"/>
+    </w:r>
+    <w:r>
+      <w:t>2</w:t>
+    </w:r>
+    <w:r>
+      <w:fldChar w:fldCharType="end"/>
+    </w:r>
   </w:p>
 </w:hdr>
 </file>
 
 <file path=word/numbering.xml><?xml version="1.0" encoding="utf-8"?>
-<w:numbering xmlns:wpc="http://schemas.microsoft.com/office/word/2010/wordprocessingCanvas" xmlns:cx="http://schemas.microsoft.com/office/drawing/2014/chartex" xmlns:cx1="http://schemas.microsoft.com/office/drawing/2015/9/8/chartex" xmlns:cx2="http://schemas.microsoft.com/office/drawing/2015/10/21/chartex" xmlns:cx3="http://schemas.microsoft.com/office/drawing/2016/5/9/chartex" xmlns:cx4="http://schemas.microsoft.com/office/drawing/2016/5/10/chartex" xmlns:cx5="http://schemas.microsoft.com/office/drawing/2016/5/11/chartex" xmlns:cx6="http://schemas.microsoft.com/office/drawing/2016/5/12/chartex" xmlns:cx7="http://schemas.microsoft.com/office/drawing/2016/5/13/chartex" xmlns:cx8="http://schemas.microsoft.com/office/drawing/2016/5/14/chartex" xmlns:mc="http://schemas.openxmlformats.org/markup-compatibility/2006" xmlns:aink="http://schemas.microsoft.com/office/drawing/2016/ink" xmlns:am3d="http://schemas.microsoft.com/office/drawing/2017/model3d" xmlns:o="urn:schemas-microsoft-com:office:office" xmlns:oel="http://schemas.microsoft.com/office/2019/extlst" xmlns:r="http://schemas.openxmlformats.org/officeDocument/2006/relationships" xmlns:m="http://schemas.openxmlformats.org/officeDocument/2006/math" xmlns:v="urn:schemas-microsoft-com:vml" xmlns:wp14="http://schemas.microsoft.com/office/word/2010/wordprocessingDrawing" xmlns:wp="http://schemas.openxmlformats.org/drawingml/2006/wordprocessingDrawing" xmlns:w10="urn:schemas-microsoft-com:office:word" xmlns:w="http://schemas.openxmlformats.org/wordprocessingml/2006/main" xmlns:w14="http://schemas.microsoft.com/office/word/2010/wordml" xmlns:w15="http://schemas.microsoft.com/office/word/2012/wordml" xmlns:w16cex="http://schemas.microsoft.com/office/word/2018/wordml/cex" xmlns:w16cid="http://schemas.microsoft.com/office/word/2016/wordml/cid" xmlns:w16="http://schemas.microsoft.com/office/word/2018/wordml" xmlns:w16sdtdh="http://schemas.microsoft.com/office/word/2020/wordml/sdtdatahash" xmlns:w16se="http://schemas.microsoft.com/office/word/2015/wordml/symex" xmlns:wpg="http://schemas.microsoft.com/office/word/2010/wordprocessingGroup" xmlns:wpi="http://schemas.microsoft.com/office/word/2010/wordprocessingInk" xmlns:wne="http://schemas.microsoft.com/office/word/2006/wordml" xmlns:wps="http://schemas.microsoft.com/office/word/2010/wordprocessingShape" mc:Ignorable="w14 w15 w16se w16cid w16 w16cex w16sdtdh wp14">
+<w:numbering xmlns:wpc="http://schemas.microsoft.com/office/word/2010/wordprocessingCanvas" xmlns:cx="http://schemas.microsoft.com/office/drawing/2014/chartex" xmlns:cx1="http://schemas.microsoft.com/office/drawing/2015/9/8/chartex" xmlns:cx2="http://schemas.microsoft.com/office/drawing/2015/10/21/chartex" xmlns:cx3="http://schemas.microsoft.com/office/drawing/2016/5/9/chartex" xmlns:cx4="http://schemas.microsoft.com/office/drawing/2016/5/10/chartex" xmlns:cx5="http://schemas.microsoft.com/office/drawing/2016/5/11/chartex" xmlns:cx6="http://schemas.microsoft.com/office/drawing/2016/5/12/chartex" xmlns:cx7="http://schemas.microsoft.com/office/drawing/2016/5/13/chartex" xmlns:cx8="http://schemas.microsoft.com/office/drawing/2016/5/14/chartex" xmlns:mc="http://schemas.openxmlformats.org/markup-compatibility/2006" xmlns:aink="http://schemas.microsoft.com/office/drawing/2016/ink" xmlns:am3d="http://schemas.microsoft.com/office/drawing/2017/model3d" xmlns:o="urn:schemas-microsoft-com:office:office" xmlns:oel="http://schemas.microsoft.com/office/2019/extlst" xmlns:r="http://schemas.openxmlformats.org/officeDocument/2006/relationships" xmlns:m="http://schemas.openxmlformats.org/officeDocument/2006/math" xmlns:v="urn:schemas-microsoft-com:vml" xmlns:wp14="http://schemas.microsoft.com/office/word/2010/wordprocessingDrawing" xmlns:wp="http://schemas.openxmlformats.org/drawingml/2006/wordprocessingDrawing" xmlns:w10="urn:schemas-microsoft-com:office:word" xmlns:w="http://schemas.openxmlformats.org/wordprocessingml/2006/main" xmlns:w14="http://schemas.microsoft.com/office/word/2010/wordml" xmlns:w15="http://schemas.microsoft.com/office/word/2012/wordml" xmlns:w16cex="http://schemas.microsoft.com/office/word/2018/wordml/cex" xmlns:w16cid="http://schemas.microsoft.com/office/word/2016/wordml/cid" xmlns:w16="http://schemas.microsoft.com/office/word/2018/wordml" xmlns:w16du="http://schemas.microsoft.com/office/word/2023/wordml/word16du" xmlns:w16sdtdh="http://schemas.microsoft.com/office/word/2020/wordml/sdtdatahash" xmlns:w16sdtfl="http://schemas.microsoft.com/office/word/2024/wordml/sdtformatlock" xmlns:w16se="http://schemas.microsoft.com/office/word/2015/wordml/symex" xmlns:wpg="http://schemas.microsoft.com/office/word/2010/wordprocessingGroup" xmlns:wpi="http://schemas.microsoft.com/office/word/2010/wordprocessingInk" xmlns:wne="http://schemas.microsoft.com/office/word/2006/wordml" xmlns:wps="http://schemas.microsoft.com/office/word/2010/wordprocessingShape" mc:Ignorable="w14 w15 w16se w16cid w16 w16cex w16sdtdh w16sdtfl w16du wp14">
   <w:abstractNum w:abstractNumId="0" w15:restartNumberingAfterBreak="0">
     <w:nsid w:val="FFFFFF89"/>
     <w:multiLevelType w:val="singleLevel"/>
@@ -1845,12 +1220,12 @@
   <w:abstractNum w:abstractNumId="1" w15:restartNumberingAfterBreak="0">
     <w:nsid w:val="123936C7"/>
     <w:multiLevelType w:val="multilevel"/>
-    <w:tmpl w:val="3BB87B58"/>
+    <w:tmpl w:val="7916E306"/>
     <w:lvl w:ilvl="0">
       <w:start w:val="1"/>
       <w:numFmt w:val="bullet"/>
       <w:pStyle w:val="AufzhlungSymbol"/>
-      <w:lvlText w:val="-"/>
+      <w:lvlText w:val="ꟷ"/>
       <w:lvlJc w:val="left"/>
       <w:pPr>
         <w:ind w:left="360" w:hanging="360"/>
@@ -1859,7 +1234,7 @@
         <w:rFonts w:ascii="Calibri" w:hAnsi="Calibri" w:hint="default"/>
         <w:b w:val="0"/>
         <w:i w:val="0"/>
-        <w:sz w:val="22"/>
+        <w:sz w:val="20"/>
       </w:rPr>
     </w:lvl>
     <w:lvl w:ilvl="1">
@@ -2698,105 +2073,113 @@
       </w:pPr>
     </w:lvl>
   </w:abstractNum>
-  <w:num w:numId="1" w16cid:durableId="276178634">
+  <w:num w:numId="1" w16cid:durableId="1935631284">
     <w:abstractNumId w:val="3"/>
   </w:num>
-  <w:num w:numId="2" w16cid:durableId="872350426">
+  <w:num w:numId="2" w16cid:durableId="164632013">
     <w:abstractNumId w:val="4"/>
   </w:num>
-  <w:num w:numId="3" w16cid:durableId="151220314">
+  <w:num w:numId="3" w16cid:durableId="1605460230">
     <w:abstractNumId w:val="1"/>
   </w:num>
-  <w:num w:numId="4" w16cid:durableId="515194567">
+  <w:num w:numId="4" w16cid:durableId="102070662">
     <w:abstractNumId w:val="7"/>
   </w:num>
-  <w:num w:numId="5" w16cid:durableId="385422054">
+  <w:num w:numId="5" w16cid:durableId="1139231404">
     <w:abstractNumId w:val="7"/>
   </w:num>
-  <w:num w:numId="6" w16cid:durableId="772823326">
+  <w:num w:numId="6" w16cid:durableId="336347227">
     <w:abstractNumId w:val="7"/>
   </w:num>
-  <w:num w:numId="7" w16cid:durableId="1935285523">
+  <w:num w:numId="7" w16cid:durableId="1849176542">
     <w:abstractNumId w:val="7"/>
   </w:num>
-  <w:num w:numId="8" w16cid:durableId="2101100689">
+  <w:num w:numId="8" w16cid:durableId="1401706892">
     <w:abstractNumId w:val="7"/>
   </w:num>
-  <w:num w:numId="9" w16cid:durableId="1793790147">
+  <w:num w:numId="9" w16cid:durableId="1209999138">
     <w:abstractNumId w:val="7"/>
   </w:num>
-  <w:num w:numId="10" w16cid:durableId="1719427411">
+  <w:num w:numId="10" w16cid:durableId="942496123">
     <w:abstractNumId w:val="7"/>
   </w:num>
-  <w:num w:numId="11" w16cid:durableId="2013796493">
+  <w:num w:numId="11" w16cid:durableId="61291151">
     <w:abstractNumId w:val="7"/>
   </w:num>
-  <w:num w:numId="12" w16cid:durableId="983923404">
+  <w:num w:numId="12" w16cid:durableId="479423074">
     <w:abstractNumId w:val="7"/>
   </w:num>
-  <w:num w:numId="13" w16cid:durableId="8534768">
+  <w:num w:numId="13" w16cid:durableId="1993020976">
     <w:abstractNumId w:val="7"/>
   </w:num>
-  <w:num w:numId="14" w16cid:durableId="1969042089">
+  <w:num w:numId="14" w16cid:durableId="252903925">
     <w:abstractNumId w:val="7"/>
   </w:num>
-  <w:num w:numId="15" w16cid:durableId="1143231814">
+  <w:num w:numId="15" w16cid:durableId="226306638">
     <w:abstractNumId w:val="7"/>
   </w:num>
-  <w:num w:numId="16" w16cid:durableId="1492714439">
+  <w:num w:numId="16" w16cid:durableId="1514879484">
     <w:abstractNumId w:val="7"/>
   </w:num>
-  <w:num w:numId="17" w16cid:durableId="293367914">
+  <w:num w:numId="17" w16cid:durableId="2108883419">
     <w:abstractNumId w:val="7"/>
   </w:num>
-  <w:num w:numId="18" w16cid:durableId="2046906884">
+  <w:num w:numId="18" w16cid:durableId="237792080">
     <w:abstractNumId w:val="7"/>
   </w:num>
-  <w:num w:numId="19" w16cid:durableId="571893406">
+  <w:num w:numId="19" w16cid:durableId="1490756621">
     <w:abstractNumId w:val="7"/>
   </w:num>
-  <w:num w:numId="20" w16cid:durableId="636879875">
+  <w:num w:numId="20" w16cid:durableId="1279068603">
     <w:abstractNumId w:val="7"/>
   </w:num>
-  <w:num w:numId="21" w16cid:durableId="2125414601">
+  <w:num w:numId="21" w16cid:durableId="1398017731">
     <w:abstractNumId w:val="7"/>
   </w:num>
-  <w:num w:numId="22" w16cid:durableId="1666979775">
+  <w:num w:numId="22" w16cid:durableId="147480320">
     <w:abstractNumId w:val="5"/>
   </w:num>
-  <w:num w:numId="23" w16cid:durableId="795291025">
+  <w:num w:numId="23" w16cid:durableId="947085984">
     <w:abstractNumId w:val="2"/>
   </w:num>
-  <w:num w:numId="24" w16cid:durableId="2145466810">
+  <w:num w:numId="24" w16cid:durableId="11730947">
     <w:abstractNumId w:val="0"/>
   </w:num>
-  <w:num w:numId="25" w16cid:durableId="2046441517">
+  <w:num w:numId="25" w16cid:durableId="904221590">
     <w:abstractNumId w:val="0"/>
   </w:num>
-  <w:num w:numId="26" w16cid:durableId="1565337697">
+  <w:num w:numId="26" w16cid:durableId="426266013">
     <w:abstractNumId w:val="7"/>
   </w:num>
-  <w:num w:numId="27" w16cid:durableId="258678690">
+  <w:num w:numId="27" w16cid:durableId="448355795">
     <w:abstractNumId w:val="7"/>
   </w:num>
-  <w:num w:numId="28" w16cid:durableId="1301959363">
+  <w:num w:numId="28" w16cid:durableId="526723799">
     <w:abstractNumId w:val="7"/>
   </w:num>
-  <w:num w:numId="29" w16cid:durableId="1195383416">
+  <w:num w:numId="29" w16cid:durableId="802111928">
     <w:abstractNumId w:val="7"/>
   </w:num>
-  <w:num w:numId="30" w16cid:durableId="1958246109">
+  <w:num w:numId="30" w16cid:durableId="884216400">
     <w:abstractNumId w:val="6"/>
+  </w:num>
+  <w:num w:numId="31" w16cid:durableId="1245383327">
+    <w:abstractNumId w:val="5"/>
+  </w:num>
+  <w:num w:numId="32" w16cid:durableId="547453607">
+    <w:abstractNumId w:val="5"/>
   </w:num>
 </w:numbering>
 </file>
 
 <file path=word/styles.xml><?xml version="1.0" encoding="utf-8"?>
-<w:styles xmlns:mc="http://schemas.openxmlformats.org/markup-compatibility/2006" xmlns:r="http://schemas.openxmlformats.org/officeDocument/2006/relationships" xmlns:w="http://schemas.openxmlformats.org/wordprocessingml/2006/main" xmlns:w14="http://schemas.microsoft.com/office/word/2010/wordml" xmlns:w15="http://schemas.microsoft.com/office/word/2012/wordml" xmlns:w16cex="http://schemas.microsoft.com/office/word/2018/wordml/cex" xmlns:w16cid="http://schemas.microsoft.com/office/word/2016/wordml/cid" xmlns:w16="http://schemas.microsoft.com/office/word/2018/wordml" xmlns:w16sdtdh="http://schemas.microsoft.com/office/word/2020/wordml/sdtdatahash" xmlns:w16se="http://schemas.microsoft.com/office/word/2015/wordml/symex" mc:Ignorable="w14 w15 w16se w16cid w16 w16cex w16sdtdh">
+<w:styles xmlns:mc="http://schemas.openxmlformats.org/markup-compatibility/2006" xmlns:r="http://schemas.openxmlformats.org/officeDocument/2006/relationships" xmlns:w="http://schemas.openxmlformats.org/wordprocessingml/2006/main" xmlns:w14="http://schemas.microsoft.com/office/word/2010/wordml" xmlns:w15="http://schemas.microsoft.com/office/word/2012/wordml" xmlns:w16cex="http://schemas.microsoft.com/office/word/2018/wordml/cex" xmlns:w16cid="http://schemas.microsoft.com/office/word/2016/wordml/cid" xmlns:w16="http://schemas.microsoft.com/office/word/2018/wordml" xmlns:w16du="http://schemas.microsoft.com/office/word/2023/wordml/word16du" xmlns:w16sdtdh="http://schemas.microsoft.com/office/word/2020/wordml/sdtdatahash" xmlns:w16sdtfl="http://schemas.microsoft.com/office/word/2024/wordml/sdtformatlock" xmlns:w16se="http://schemas.microsoft.com/office/word/2015/wordml/symex" mc:Ignorable="w14 w15 w16se w16cid w16 w16cex w16sdtdh w16sdtfl w16du">
   <w:docDefaults>
     <w:rPrDefault>
       <w:rPr>
-        <w:rFonts w:ascii="Calibri" w:eastAsia="Calibri" w:hAnsi="Calibri" w:cs="Times New Roman"/>
+        <w:rFonts w:ascii="Aptos" w:eastAsia="Calibri" w:hAnsi="Aptos" w:cs="Times New Roman"/>
+        <w:sz w:val="22"/>
+        <w:szCs w:val="22"/>
         <w:lang w:val="de-CH" w:eastAsia="de-CH" w:bidi="ar-SA"/>
       </w:rPr>
     </w:rPrDefault>
@@ -2834,8 +2217,8 @@
     <w:lsdException w:name="Normal Indent" w:semiHidden="1" w:unhideWhenUsed="1"/>
     <w:lsdException w:name="footnote text" w:semiHidden="1" w:unhideWhenUsed="1"/>
     <w:lsdException w:name="annotation text" w:semiHidden="1" w:unhideWhenUsed="1"/>
-    <w:lsdException w:name="header" w:semiHidden="1" w:unhideWhenUsed="1"/>
-    <w:lsdException w:name="footer" w:semiHidden="1" w:uiPriority="0" w:unhideWhenUsed="1"/>
+    <w:lsdException w:name="header" w:semiHidden="1" w:uiPriority="0" w:unhideWhenUsed="1"/>
+    <w:lsdException w:name="footer" w:semiHidden="1" w:unhideWhenUsed="1"/>
     <w:lsdException w:name="index heading" w:semiHidden="1" w:unhideWhenUsed="1"/>
     <w:lsdException w:name="caption" w:semiHidden="1" w:uiPriority="35" w:unhideWhenUsed="1" w:qFormat="1"/>
     <w:lsdException w:name="table of figures" w:semiHidden="1" w:unhideWhenUsed="1"/>
@@ -3070,7 +2453,6 @@
     <w:lsdException w:name="Book Title" w:uiPriority="33" w:qFormat="1"/>
     <w:lsdException w:name="Bibliography" w:semiHidden="1" w:uiPriority="37" w:unhideWhenUsed="1"/>
     <w:lsdException w:name="TOC Heading" w:semiHidden="1" w:uiPriority="39" w:unhideWhenUsed="1" w:qFormat="1"/>
-    <w:lsdException w:name="Plain Table 2" w:uiPriority="42"/>
     <w:lsdException w:name="Plain Table 4" w:uiPriority="44"/>
     <w:lsdException w:name="Plain Table 5" w:uiPriority="45"/>
     <w:lsdException w:name="Grid Table Light" w:uiPriority="40"/>
@@ -3181,15 +2563,10 @@
   <w:style w:type="paragraph" w:default="1" w:styleId="Standard">
     <w:name w:val="Normal"/>
     <w:qFormat/>
-    <w:rsid w:val="007C5EE4"/>
+    <w:rsid w:val="004D33EC"/>
     <w:pPr>
       <w:spacing w:line="276" w:lineRule="auto"/>
     </w:pPr>
-    <w:rPr>
-      <w:sz w:val="22"/>
-      <w:szCs w:val="22"/>
-      <w:lang w:eastAsia="en-US"/>
-    </w:rPr>
   </w:style>
   <w:style w:type="paragraph" w:styleId="berschrift1">
     <w:name w:val="heading 1"/>
@@ -3504,7 +2881,7 @@
     <w:name w:val="Aufzählung Symbol"/>
     <w:basedOn w:val="Text"/>
     <w:qFormat/>
-    <w:rsid w:val="00257D91"/>
+    <w:rsid w:val="00F06136"/>
     <w:pPr>
       <w:numPr>
         <w:numId w:val="3"/>
@@ -3512,7 +2889,6 @@
       <w:tabs>
         <w:tab w:val="left" w:pos="357"/>
       </w:tabs>
-      <w:ind w:left="357" w:hanging="357"/>
     </w:pPr>
   </w:style>
   <w:style w:type="character" w:customStyle="1" w:styleId="TextZchn">
@@ -3581,7 +2957,6 @@
     <w:name w:val="header"/>
     <w:basedOn w:val="Standard"/>
     <w:link w:val="KopfzeileZchn"/>
-    <w:uiPriority w:val="99"/>
     <w:unhideWhenUsed/>
     <w:rsid w:val="00ED0F50"/>
     <w:pPr>
@@ -3594,7 +2969,6 @@
   <w:style w:type="character" w:customStyle="1" w:styleId="KopfzeileZchn">
     <w:name w:val="Kopfzeile Zchn"/>
     <w:link w:val="Kopfzeile"/>
-    <w:uiPriority w:val="99"/>
     <w:rsid w:val="00ED0F50"/>
     <w:rPr>
       <w:rFonts w:ascii="Arial" w:hAnsi="Arial"/>
@@ -3606,6 +2980,7 @@
     <w:name w:val="footer"/>
     <w:basedOn w:val="Standard"/>
     <w:link w:val="FuzeileZchn"/>
+    <w:uiPriority w:val="99"/>
     <w:unhideWhenUsed/>
     <w:rsid w:val="006E1E72"/>
     <w:pPr>
@@ -3634,6 +3009,7 @@
   <w:style w:type="paragraph" w:customStyle="1" w:styleId="zOawBlindzeile">
     <w:name w:val="zOawBlindzeile"/>
     <w:basedOn w:val="Standard"/>
+    <w:semiHidden/>
     <w:qFormat/>
     <w:rsid w:val="00006D18"/>
     <w:pPr>
@@ -3845,8 +3221,9 @@
     <w:basedOn w:val="Absatz-Standardschriftart"/>
     <w:uiPriority w:val="99"/>
     <w:semiHidden/>
-    <w:rsid w:val="0058257F"/>
-    <w:rPr>
+    <w:rsid w:val="004D33EC"/>
+    <w:rPr>
+      <w:vanish/>
       <w:color w:val="808080"/>
       <w:lang w:val="de-CH"/>
     </w:rPr>
@@ -3860,8 +3237,6 @@
     </w:pPr>
     <w:rPr>
       <w:rFonts w:ascii="Arial" w:eastAsiaTheme="minorHAnsi" w:hAnsi="Arial" w:cstheme="minorBidi"/>
-      <w:sz w:val="22"/>
-      <w:szCs w:val="22"/>
       <w:lang w:eastAsia="en-US"/>
     </w:rPr>
   </w:style>
@@ -3874,7 +3249,7 @@
     <w:rsid w:val="004B3C48"/>
     <w:pPr>
       <w:numPr>
-        <w:numId w:val="22"/>
+        <w:numId w:val="32"/>
       </w:numPr>
     </w:pPr>
     <w:rPr>
@@ -3890,8 +3265,6 @@
       <w:jc w:val="both"/>
     </w:pPr>
     <w:rPr>
-      <w:sz w:val="22"/>
-      <w:szCs w:val="22"/>
       <w:lang w:eastAsia="en-US"/>
     </w:rPr>
     <w:tblPr>
@@ -3914,7 +3287,6 @@
     </w:pPr>
     <w:rPr>
       <w:rFonts w:ascii="Arial" w:hAnsi="Arial"/>
-      <w:szCs w:val="22"/>
       <w:lang w:eastAsia="en-US"/>
     </w:rPr>
     <w:tblPr>
@@ -3958,14 +3330,10 @@
     </w:pPr>
     <w:rPr>
       <w:rFonts w:ascii="Calibri" w:hAnsi="Calibri"/>
-      <w:sz w:val="22"/>
     </w:rPr>
     <w:tblPr>
       <w:tblInd w:w="0" w:type="dxa"/>
     </w:tblPr>
-    <w:tcPr>
-      <w:shd w:val="clear" w:color="auto" w:fill="FFEEB6"/>
-    </w:tcPr>
     <w:tblStylePr w:type="firstRow">
       <w:tblPr/>
       <w:tcPr>
@@ -3982,6 +3350,7 @@
   <w:style w:type="paragraph" w:customStyle="1" w:styleId="zOawDeliveryOption">
     <w:name w:val="zOawDeliveryOption"/>
     <w:basedOn w:val="Text"/>
+    <w:semiHidden/>
     <w:qFormat/>
     <w:rsid w:val="001F39D1"/>
     <w:rPr>
@@ -4008,9 +3377,6 @@
     <w:pPr>
       <w:ind w:left="113"/>
     </w:pPr>
-    <w:rPr>
-      <w:sz w:val="22"/>
-    </w:rPr>
     <w:tblPr>
       <w:tblBorders>
         <w:top w:val="single" w:sz="4" w:space="0" w:color="auto"/>
@@ -4056,9 +3422,6 @@
     <w:pPr>
       <w:ind w:left="113"/>
     </w:pPr>
-    <w:rPr>
-      <w:sz w:val="22"/>
-    </w:rPr>
     <w:tblPr>
       <w:tblInd w:w="1021" w:type="dxa"/>
       <w:tblBorders>
@@ -4135,7 +3498,6 @@
       <w:rFonts w:ascii="Frutiger 55 Roman" w:eastAsia="Times New Roman" w:hAnsi="Frutiger 55 Roman"/>
       <w:sz w:val="20"/>
       <w:szCs w:val="24"/>
-      <w:lang w:eastAsia="de-CH"/>
     </w:rPr>
   </w:style>
   <w:style w:type="paragraph" w:customStyle="1" w:styleId="AufzaehlungAB">
@@ -4197,8 +3559,6 @@
     <w:rsid w:val="00793633"/>
     <w:rPr>
       <w:rFonts w:asciiTheme="minorHAnsi" w:eastAsiaTheme="minorHAnsi" w:hAnsiTheme="minorHAnsi" w:cstheme="minorBidi"/>
-      <w:sz w:val="22"/>
-      <w:szCs w:val="22"/>
       <w:lang w:eastAsia="en-US"/>
     </w:rPr>
     <w:tblPr>
@@ -4256,12 +3616,10 @@
   <w:style w:type="table" w:styleId="EinfacheTabelle2">
     <w:name w:val="Plain Table 2"/>
     <w:basedOn w:val="NormaleTabelle"/>
-    <w:uiPriority w:val="42"/>
+    <w:uiPriority w:val="99"/>
     <w:rsid w:val="00793633"/>
     <w:rPr>
       <w:rFonts w:asciiTheme="minorHAnsi" w:eastAsiaTheme="minorHAnsi" w:hAnsiTheme="minorHAnsi" w:cstheme="minorBidi"/>
-      <w:sz w:val="22"/>
-      <w:szCs w:val="22"/>
       <w:lang w:eastAsia="en-US"/>
     </w:rPr>
     <w:tblPr>
@@ -4350,8 +3708,6 @@
     <w:rsid w:val="00793633"/>
     <w:rPr>
       <w:rFonts w:asciiTheme="minorHAnsi" w:eastAsiaTheme="minorHAnsi" w:hAnsiTheme="minorHAnsi" w:cstheme="minorBidi"/>
-      <w:sz w:val="22"/>
-      <w:szCs w:val="22"/>
       <w:lang w:eastAsia="en-US"/>
     </w:rPr>
     <w:tblPr>
@@ -4454,15 +3810,223 @@
       <w:szCs w:val="18"/>
     </w:rPr>
   </w:style>
+  <w:style w:type="paragraph" w:customStyle="1" w:styleId="1pt">
+    <w:name w:val="1pt"/>
+    <w:basedOn w:val="Standard"/>
+    <w:rsid w:val="006E6A39"/>
+    <w:pPr>
+      <w:spacing w:line="240" w:lineRule="auto"/>
+    </w:pPr>
+    <w:rPr>
+      <w:sz w:val="2"/>
+      <w:lang w:val="en-GB"/>
+    </w:rPr>
+  </w:style>
+  <w:style w:type="paragraph" w:customStyle="1" w:styleId="bodyaddinfo">
+    <w:name w:val="bodyaddinfo"/>
+    <w:basedOn w:val="Beilagen"/>
+    <w:rsid w:val="000F5989"/>
+    <w:pPr>
+      <w:keepNext/>
+      <w:keepLines/>
+      <w:ind w:left="357" w:hanging="357"/>
+    </w:pPr>
+    <w:rPr>
+      <w:noProof/>
+    </w:rPr>
+  </w:style>
+  <w:style w:type="paragraph" w:customStyle="1" w:styleId="bodyaddinfolabel">
+    <w:name w:val="bodyaddinfolabel"/>
+    <w:basedOn w:val="Standard"/>
+    <w:next w:val="Beilagen"/>
+    <w:rsid w:val="007876A2"/>
+    <w:pPr>
+      <w:keepNext/>
+      <w:keepLines/>
+    </w:pPr>
+    <w:rPr>
+      <w:noProof/>
+      <w:szCs w:val="20"/>
+    </w:rPr>
+  </w:style>
+  <w:style w:type="paragraph" w:customStyle="1" w:styleId="bodyaddressblock">
+    <w:name w:val="bodyaddressblock"/>
+    <w:basedOn w:val="Standard"/>
+    <w:rsid w:val="006F0A69"/>
+    <w:pPr>
+      <w:spacing w:line="240" w:lineRule="auto"/>
+    </w:pPr>
+  </w:style>
+  <w:style w:type="paragraph" w:customStyle="1" w:styleId="bodycitydate">
+    <w:name w:val="bodycitydate"/>
+    <w:basedOn w:val="Standard"/>
+    <w:rsid w:val="006F0A69"/>
+    <w:pPr>
+      <w:spacing w:before="600"/>
+    </w:pPr>
+  </w:style>
+  <w:style w:type="paragraph" w:customStyle="1" w:styleId="bodyclosing">
+    <w:name w:val="bodyclosing"/>
+    <w:basedOn w:val="Standard"/>
+    <w:rsid w:val="003C7033"/>
+    <w:pPr>
+      <w:keepNext/>
+      <w:keepLines/>
+      <w:spacing w:before="320"/>
+    </w:pPr>
+  </w:style>
+  <w:style w:type="paragraph" w:customStyle="1" w:styleId="bodyclosingorg">
+    <w:name w:val="bodyclosingorg"/>
+    <w:basedOn w:val="Standard"/>
+    <w:rsid w:val="009019C5"/>
+    <w:pPr>
+      <w:keepNext/>
+      <w:keepLines/>
+      <w:spacing w:before="360"/>
+      <w:jc w:val="both"/>
+    </w:pPr>
+  </w:style>
+  <w:style w:type="paragraph" w:customStyle="1" w:styleId="bodyhint">
+    <w:name w:val="bodyhint"/>
+    <w:basedOn w:val="Standard"/>
+    <w:rsid w:val="006F0A69"/>
+    <w:pPr>
+      <w:spacing w:before="600"/>
+    </w:pPr>
+  </w:style>
+  <w:style w:type="paragraph" w:customStyle="1" w:styleId="bodyintroduction">
+    <w:name w:val="bodyintroduction"/>
+    <w:basedOn w:val="Standard"/>
+    <w:rsid w:val="003C7033"/>
+    <w:pPr>
+      <w:spacing w:before="700" w:after="300"/>
+    </w:pPr>
+  </w:style>
+  <w:style w:type="paragraph" w:customStyle="1" w:styleId="bodyreference">
+    <w:name w:val="bodyreference"/>
+    <w:basedOn w:val="Standard"/>
+    <w:rsid w:val="006F0A69"/>
+    <w:rPr>
+      <w:sz w:val="18"/>
+      <w:szCs w:val="18"/>
+    </w:rPr>
+  </w:style>
+  <w:style w:type="paragraph" w:customStyle="1" w:styleId="bodysignature">
+    <w:name w:val="bodysignature"/>
+    <w:basedOn w:val="Standard"/>
+    <w:rsid w:val="006F0A69"/>
+    <w:pPr>
+      <w:keepNext/>
+      <w:keepLines/>
+    </w:pPr>
+  </w:style>
+  <w:style w:type="paragraph" w:customStyle="1" w:styleId="bodystandard">
+    <w:name w:val="bodystandard"/>
+    <w:basedOn w:val="Standard"/>
+    <w:rsid w:val="006F0A69"/>
+    <w:rPr>
+      <w:noProof/>
+      <w:lang w:val="en-GB"/>
+    </w:rPr>
+  </w:style>
+  <w:style w:type="paragraph" w:customStyle="1" w:styleId="bodysubject">
+    <w:name w:val="bodysubject"/>
+    <w:basedOn w:val="Betreff"/>
+    <w:semiHidden/>
+    <w:rsid w:val="006F0A69"/>
+    <w:pPr>
+      <w:spacing w:before="600" w:after="0"/>
+    </w:pPr>
+  </w:style>
+  <w:style w:type="paragraph" w:customStyle="1" w:styleId="footerstandard">
+    <w:name w:val="footerstandard"/>
+    <w:basedOn w:val="Standard"/>
+    <w:rsid w:val="00294BCF"/>
+    <w:pPr>
+      <w:spacing w:before="80" w:line="240" w:lineRule="auto"/>
+    </w:pPr>
+    <w:rPr>
+      <w:rFonts w:eastAsiaTheme="minorEastAsia"/>
+      <w:sz w:val="18"/>
+      <w:szCs w:val="24"/>
+    </w:rPr>
+  </w:style>
+  <w:style w:type="paragraph" w:customStyle="1" w:styleId="headersender">
+    <w:name w:val="headersender"/>
+    <w:basedOn w:val="Standard"/>
+    <w:semiHidden/>
+    <w:qFormat/>
+    <w:rsid w:val="006F0A69"/>
+    <w:pPr>
+      <w:spacing w:line="240" w:lineRule="auto"/>
+    </w:pPr>
+    <w:rPr>
+      <w:caps/>
+      <w:sz w:val="28"/>
+    </w:rPr>
+  </w:style>
+  <w:style w:type="paragraph" w:customStyle="1" w:styleId="msonormal0">
+    <w:name w:val="msonormal"/>
+    <w:basedOn w:val="Standard"/>
+    <w:rsid w:val="006E6A39"/>
+    <w:pPr>
+      <w:spacing w:before="100" w:beforeAutospacing="1" w:after="100" w:afterAutospacing="1" w:line="240" w:lineRule="auto"/>
+    </w:pPr>
+    <w:rPr>
+      <w:rFonts w:ascii="Times New Roman" w:eastAsiaTheme="minorEastAsia" w:hAnsi="Times New Roman"/>
+      <w:sz w:val="24"/>
+      <w:szCs w:val="24"/>
+    </w:rPr>
+  </w:style>
+  <w:style w:type="paragraph" w:customStyle="1" w:styleId="bodylogo">
+    <w:name w:val="bodylogo"/>
+    <w:basedOn w:val="Standard"/>
+    <w:semiHidden/>
+    <w:rsid w:val="00A800FB"/>
+    <w:pPr>
+      <w:spacing w:before="100" w:beforeAutospacing="1" w:after="100" w:afterAutospacing="1" w:line="240" w:lineRule="auto"/>
+    </w:pPr>
+    <w:rPr>
+      <w:rFonts w:ascii="Times New Roman" w:eastAsiaTheme="minorEastAsia" w:hAnsi="Times New Roman"/>
+      <w:sz w:val="24"/>
+      <w:szCs w:val="24"/>
+    </w:rPr>
+  </w:style>
 </w:styles>
 </file>
 
 <file path=word/glossary/document.xml><?xml version="1.0" encoding="utf-8"?>
-<w:glossaryDocument xmlns:wpc="http://schemas.microsoft.com/office/word/2010/wordprocessingCanvas" xmlns:cx="http://schemas.microsoft.com/office/drawing/2014/chartex" xmlns:cx1="http://schemas.microsoft.com/office/drawing/2015/9/8/chartex" xmlns:cx2="http://schemas.microsoft.com/office/drawing/2015/10/21/chartex" xmlns:cx3="http://schemas.microsoft.com/office/drawing/2016/5/9/chartex" xmlns:cx4="http://schemas.microsoft.com/office/drawing/2016/5/10/chartex" xmlns:cx5="http://schemas.microsoft.com/office/drawing/2016/5/11/chartex" xmlns:cx6="http://schemas.microsoft.com/office/drawing/2016/5/12/chartex" xmlns:cx7="http://schemas.microsoft.com/office/drawing/2016/5/13/chartex" xmlns:cx8="http://schemas.microsoft.com/office/drawing/2016/5/14/chartex" xmlns:mc="http://schemas.openxmlformats.org/markup-compatibility/2006" xmlns:aink="http://schemas.microsoft.com/office/drawing/2016/ink" xmlns:am3d="http://schemas.microsoft.com/office/drawing/2017/model3d" xmlns:o="urn:schemas-microsoft-com:office:office" xmlns:oel="http://schemas.microsoft.com/office/2019/extlst" xmlns:r="http://schemas.openxmlformats.org/officeDocument/2006/relationships" xmlns:m="http://schemas.openxmlformats.org/officeDocument/2006/math" xmlns:v="urn:schemas-microsoft-com:vml" xmlns:wp14="http://schemas.microsoft.com/office/word/2010/wordprocessingDrawing" xmlns:wp="http://schemas.openxmlformats.org/drawingml/2006/wordprocessingDrawing" xmlns:w10="urn:schemas-microsoft-com:office:word" xmlns:w="http://schemas.openxmlformats.org/wordprocessingml/2006/main" xmlns:w14="http://schemas.microsoft.com/office/word/2010/wordml" xmlns:w15="http://schemas.microsoft.com/office/word/2012/wordml" xmlns:w16cex="http://schemas.microsoft.com/office/word/2018/wordml/cex" xmlns:w16cid="http://schemas.microsoft.com/office/word/2016/wordml/cid" xmlns:w16="http://schemas.microsoft.com/office/word/2018/wordml" xmlns:w16sdtdh="http://schemas.microsoft.com/office/word/2020/wordml/sdtdatahash" xmlns:w16se="http://schemas.microsoft.com/office/word/2015/wordml/symex" xmlns:wpg="http://schemas.microsoft.com/office/word/2010/wordprocessingGroup" xmlns:wpi="http://schemas.microsoft.com/office/word/2010/wordprocessingInk" xmlns:wne="http://schemas.microsoft.com/office/word/2006/wordml" xmlns:wps="http://schemas.microsoft.com/office/word/2010/wordprocessingShape" mc:Ignorable="w14 w15 w16se w16cid w16 w16cex w16sdtdh wp14">
+<w:glossaryDocument xmlns:wpc="http://schemas.microsoft.com/office/word/2010/wordprocessingCanvas" xmlns:cx="http://schemas.microsoft.com/office/drawing/2014/chartex" xmlns:cx1="http://schemas.microsoft.com/office/drawing/2015/9/8/chartex" xmlns:cx2="http://schemas.microsoft.com/office/drawing/2015/10/21/chartex" xmlns:cx3="http://schemas.microsoft.com/office/drawing/2016/5/9/chartex" xmlns:cx4="http://schemas.microsoft.com/office/drawing/2016/5/10/chartex" xmlns:cx5="http://schemas.microsoft.com/office/drawing/2016/5/11/chartex" xmlns:cx6="http://schemas.microsoft.com/office/drawing/2016/5/12/chartex" xmlns:cx7="http://schemas.microsoft.com/office/drawing/2016/5/13/chartex" xmlns:cx8="http://schemas.microsoft.com/office/drawing/2016/5/14/chartex" xmlns:mc="http://schemas.openxmlformats.org/markup-compatibility/2006" xmlns:aink="http://schemas.microsoft.com/office/drawing/2016/ink" xmlns:am3d="http://schemas.microsoft.com/office/drawing/2017/model3d" xmlns:o="urn:schemas-microsoft-com:office:office" xmlns:oel="http://schemas.microsoft.com/office/2019/extlst" xmlns:r="http://schemas.openxmlformats.org/officeDocument/2006/relationships" xmlns:m="http://schemas.openxmlformats.org/officeDocument/2006/math" xmlns:v="urn:schemas-microsoft-com:vml" xmlns:wp14="http://schemas.microsoft.com/office/word/2010/wordprocessingDrawing" xmlns:wp="http://schemas.openxmlformats.org/drawingml/2006/wordprocessingDrawing" xmlns:w10="urn:schemas-microsoft-com:office:word" xmlns:w="http://schemas.openxmlformats.org/wordprocessingml/2006/main" xmlns:w14="http://schemas.microsoft.com/office/word/2010/wordml" xmlns:w15="http://schemas.microsoft.com/office/word/2012/wordml" xmlns:w16cex="http://schemas.microsoft.com/office/word/2018/wordml/cex" xmlns:w16cid="http://schemas.microsoft.com/office/word/2016/wordml/cid" xmlns:w16="http://schemas.microsoft.com/office/word/2018/wordml" xmlns:w16du="http://schemas.microsoft.com/office/word/2023/wordml/word16du" xmlns:w16sdtdh="http://schemas.microsoft.com/office/word/2020/wordml/sdtdatahash" xmlns:w16sdtfl="http://schemas.microsoft.com/office/word/2024/wordml/sdtformatlock" xmlns:w16se="http://schemas.microsoft.com/office/word/2015/wordml/symex" xmlns:wpg="http://schemas.microsoft.com/office/word/2010/wordprocessingGroup" xmlns:wpi="http://schemas.microsoft.com/office/word/2010/wordprocessingInk" xmlns:wne="http://schemas.microsoft.com/office/word/2006/wordml" xmlns:wps="http://schemas.microsoft.com/office/word/2010/wordprocessingShape" mc:Ignorable="w14 w15 w16se w16cid w16 w16cex w16sdtdh w16sdtfl w16du wp14">
   <w:docParts>
     <w:docPart>
       <w:docPartPr>
-        <w:name w:val="A28DEAC98E864F40AD3EF282E33FC7A4"/>
+        <w:name w:val="DefaultPlaceholder_-1854013440"/>
+        <w:category>
+          <w:name w:val="General"/>
+          <w:gallery w:val="placeholder"/>
+        </w:category>
+        <w:types>
+          <w:type w:val="bbPlcHdr"/>
+        </w:types>
+        <w:behaviors>
+          <w:behavior w:val="content"/>
+        </w:behaviors>
+        <w:guid w:val="{F8A49007-6637-4777-B0BA-5C8B7C2455CE}"/>
+      </w:docPartPr>
+      <w:docPartBody>
+        <w:p>
+          <w:r>
+            <w:rPr>
+              <w:rStyle w:val="Platzhaltertext"/>
+            </w:rPr>
+            <w:t>Click or tap here to enter text.</w:t>
+          </w:r>
+        </w:p>
+      </w:docPartBody>
+    </w:docPart>
+    <w:docPart>
+      <w:docPartPr>
+        <w:name w:val="F0A0ECDA330441C2802C3E4BAE6D2312"/>
         <w:category>
           <w:name w:val="Allgemein"/>
           <w:gallery w:val="placeholder"/>
@@ -4473,25 +4037,22 @@
         <w:behaviors>
           <w:behavior w:val="content"/>
         </w:behaviors>
-        <w:guid w:val="{B56704AA-3FF3-4364-954D-DE0926F8B4C4}"/>
+        <w:guid w:val="{71E424E8-6E4A-458C-8FB6-822F308D7BC8}"/>
       </w:docPartPr>
       <w:docPartBody>
         <w:p>
-          <w:pPr>
-            <w:pStyle w:val="A28DEAC98E864F40AD3EF282E33FC7A4"/>
-          </w:pPr>
           <w:r>
             <w:rPr>
               <w:rStyle w:val="Platzhaltertext"/>
             </w:rPr>
-            <w:t xml:space="preserve"> </w:t>
+            <w:t>​</w:t>
           </w:r>
         </w:p>
       </w:docPartBody>
     </w:docPart>
     <w:docPart>
       <w:docPartPr>
-        <w:name w:val="A00863442AEA43F29467ED98612A59AC"/>
+        <w:name w:val="7343135B96DC4FBFBF4597B87306F263"/>
         <w:category>
           <w:name w:val="Allgemein"/>
           <w:gallery w:val="placeholder"/>
@@ -4502,18 +4063,330 @@
         <w:behaviors>
           <w:behavior w:val="content"/>
         </w:behaviors>
-        <w:guid w:val="{5496B819-35A7-41AD-A25D-C6825D2B7B2A}"/>
+        <w:guid w:val="{2A176B02-3404-4954-BA21-9E0D6E599D58}"/>
+      </w:docPartPr>
+      <w:docPartBody>
+        <w:p>
+          <w:r>
+            <w:rPr>
+              <w:rStyle w:val="Platzhaltertext"/>
+            </w:rPr>
+            <w:t>​</w:t>
+          </w:r>
+        </w:p>
+      </w:docPartBody>
+    </w:docPart>
+    <w:docPart>
+      <w:docPartPr>
+        <w:name w:val="CF333B2262FD44E3A3C571D1B00D18F9"/>
+        <w:category>
+          <w:name w:val="Allgemein"/>
+          <w:gallery w:val="placeholder"/>
+        </w:category>
+        <w:types>
+          <w:type w:val="bbPlcHdr"/>
+        </w:types>
+        <w:behaviors>
+          <w:behavior w:val="content"/>
+        </w:behaviors>
+        <w:guid w:val="{332A8145-2B2F-4B73-8457-894AB003B404}"/>
+      </w:docPartPr>
+      <w:docPartBody>
+        <w:p>
+          <w:r>
+            <w:rPr>
+              <w:rStyle w:val="Platzhaltertext"/>
+            </w:rPr>
+            <w:t>​</w:t>
+          </w:r>
+        </w:p>
+      </w:docPartBody>
+    </w:docPart>
+    <w:docPart>
+      <w:docPartPr>
+        <w:name w:val="94B05EF37F8145359C898073F9EFC586"/>
+        <w:category>
+          <w:name w:val="Allgemein"/>
+          <w:gallery w:val="placeholder"/>
+        </w:category>
+        <w:types>
+          <w:type w:val="bbPlcHdr"/>
+        </w:types>
+        <w:behaviors>
+          <w:behavior w:val="content"/>
+        </w:behaviors>
+        <w:guid w:val="{B4F282F8-2A33-4999-B69E-AE07C8ABDFAF}"/>
+      </w:docPartPr>
+      <w:docPartBody>
+        <w:p>
+          <w:r>
+            <w:rPr>
+              <w:rStyle w:val="Platzhaltertext"/>
+            </w:rPr>
+            <w:t>​</w:t>
+          </w:r>
+        </w:p>
+      </w:docPartBody>
+    </w:docPart>
+    <w:docPart>
+      <w:docPartPr>
+        <w:name w:val="7131270FD68A4F72A9714EBF79CA284B"/>
+        <w:category>
+          <w:name w:val="Allgemein"/>
+          <w:gallery w:val="placeholder"/>
+        </w:category>
+        <w:types>
+          <w:type w:val="bbPlcHdr"/>
+        </w:types>
+        <w:behaviors>
+          <w:behavior w:val="content"/>
+        </w:behaviors>
+        <w:guid w:val="{A38C477D-9A74-470B-9228-B63CE04C6B06}"/>
+      </w:docPartPr>
+      <w:docPartBody>
+        <w:p>
+          <w:r>
+            <w:rPr>
+              <w:rStyle w:val="Platzhaltertext"/>
+            </w:rPr>
+            <w:t>​</w:t>
+          </w:r>
+        </w:p>
+      </w:docPartBody>
+    </w:docPart>
+    <w:docPart>
+      <w:docPartPr>
+        <w:name w:val="4E963FEC58C344AB927956B6F370AB09"/>
+        <w:category>
+          <w:name w:val="Allgemein"/>
+          <w:gallery w:val="placeholder"/>
+        </w:category>
+        <w:types>
+          <w:type w:val="bbPlcHdr"/>
+        </w:types>
+        <w:behaviors>
+          <w:behavior w:val="content"/>
+        </w:behaviors>
+        <w:guid w:val="{1F5AB112-B3BD-416A-A711-B1F81B6FC858}"/>
+      </w:docPartPr>
+      <w:docPartBody>
+        <w:p>
+          <w:r>
+            <w:rPr>
+              <w:rStyle w:val="Platzhaltertext"/>
+            </w:rPr>
+            <w:t>​</w:t>
+          </w:r>
+        </w:p>
+      </w:docPartBody>
+    </w:docPart>
+    <w:docPart>
+      <w:docPartPr>
+        <w:name w:val="E2D981C990B64A49999EBE64811507D8"/>
+        <w:category>
+          <w:name w:val="Allgemein"/>
+          <w:gallery w:val="placeholder"/>
+        </w:category>
+        <w:types>
+          <w:type w:val="bbPlcHdr"/>
+        </w:types>
+        <w:behaviors>
+          <w:behavior w:val="content"/>
+        </w:behaviors>
+        <w:guid w:val="{377C7FEB-EB48-4453-B1B6-519499CF1934}"/>
+      </w:docPartPr>
+      <w:docPartBody>
+        <w:p>
+          <w:r>
+            <w:rPr>
+              <w:rStyle w:val="Platzhaltertext"/>
+            </w:rPr>
+            <w:t>​</w:t>
+          </w:r>
+        </w:p>
+      </w:docPartBody>
+    </w:docPart>
+    <w:docPart>
+      <w:docPartPr>
+        <w:name w:val="3396F2D9941F4B65B2D11C8A9CC25315"/>
+        <w:category>
+          <w:name w:val="Allgemein"/>
+          <w:gallery w:val="placeholder"/>
+        </w:category>
+        <w:types>
+          <w:type w:val="bbPlcHdr"/>
+        </w:types>
+        <w:behaviors>
+          <w:behavior w:val="content"/>
+        </w:behaviors>
+        <w:guid w:val="{452CA8AF-4C3A-4A53-A415-B9B0FDA7EF78}"/>
+      </w:docPartPr>
+      <w:docPartBody>
+        <w:p>
+          <w:r>
+            <w:rPr>
+              <w:rStyle w:val="Platzhaltertext"/>
+            </w:rPr>
+            <w:t>​</w:t>
+          </w:r>
+        </w:p>
+      </w:docPartBody>
+    </w:docPart>
+    <w:docPart>
+      <w:docPartPr>
+        <w:name w:val="EE3E77094C004512A9905A9EEAD830AA"/>
+        <w:category>
+          <w:name w:val="Allgemein"/>
+          <w:gallery w:val="placeholder"/>
+        </w:category>
+        <w:types>
+          <w:type w:val="bbPlcHdr"/>
+        </w:types>
+        <w:behaviors>
+          <w:behavior w:val="content"/>
+        </w:behaviors>
+        <w:guid w:val="{408B9A7D-EC66-46EF-8A45-B2DE1107C84B}"/>
+      </w:docPartPr>
+      <w:docPartBody>
+        <w:p>
+          <w:r>
+            <w:rPr>
+              <w:rStyle w:val="Platzhaltertext"/>
+            </w:rPr>
+            <w:t>​</w:t>
+          </w:r>
+        </w:p>
+      </w:docPartBody>
+    </w:docPart>
+    <w:docPart>
+      <w:docPartPr>
+        <w:name w:val="74C2DA7684A5405FA26B38C9F36415F8"/>
+        <w:category>
+          <w:name w:val="Allgemein"/>
+          <w:gallery w:val="placeholder"/>
+        </w:category>
+        <w:types>
+          <w:type w:val="bbPlcHdr"/>
+        </w:types>
+        <w:behaviors>
+          <w:behavior w:val="content"/>
+        </w:behaviors>
+        <w:guid w:val="{86210391-546F-4704-A580-57D012A195B2}"/>
+      </w:docPartPr>
+      <w:docPartBody>
+        <w:p>
+          <w:r>
+            <w:rPr>
+              <w:rStyle w:val="Platzhaltertext"/>
+            </w:rPr>
+            <w:t>​</w:t>
+          </w:r>
+        </w:p>
+      </w:docPartBody>
+    </w:docPart>
+    <w:docPart>
+      <w:docPartPr>
+        <w:name w:val="4E0390ECC8A440409AF9A12433F5DB35"/>
+        <w:category>
+          <w:name w:val="Allgemein"/>
+          <w:gallery w:val="placeholder"/>
+        </w:category>
+        <w:types>
+          <w:type w:val="bbPlcHdr"/>
+        </w:types>
+        <w:behaviors>
+          <w:behavior w:val="content"/>
+        </w:behaviors>
+        <w:guid w:val="{CCB028C2-1265-4964-9986-7EF17F20F077}"/>
+      </w:docPartPr>
+      <w:docPartBody>
+        <w:p>
+          <w:r>
+            <w:rPr>
+              <w:rStyle w:val="Platzhaltertext"/>
+            </w:rPr>
+            <w:t>[Klicken oder tippen Sie hier, um Text einzugeben.]</w:t>
+          </w:r>
+        </w:p>
+      </w:docPartBody>
+    </w:docPart>
+    <w:docPart>
+      <w:docPartPr>
+        <w:name w:val="46C3130EBA5C437386A368BE6F706A94"/>
+        <w:category>
+          <w:name w:val="Allgemein"/>
+          <w:gallery w:val="placeholder"/>
+        </w:category>
+        <w:types>
+          <w:type w:val="bbPlcHdr"/>
+        </w:types>
+        <w:behaviors>
+          <w:behavior w:val="content"/>
+        </w:behaviors>
+        <w:guid w:val="{83243EA6-3983-435F-B445-ADBA4B64CB1A}"/>
+      </w:docPartPr>
+      <w:docPartBody>
+        <w:p>
+          <w:r>
+            <w:rPr>
+              <w:rStyle w:val="Platzhaltertext"/>
+            </w:rPr>
+            <w:t>[Klicken oder tippen Sie hier, um Text einzugeben.]</w:t>
+          </w:r>
+        </w:p>
+      </w:docPartBody>
+    </w:docPart>
+    <w:docPart>
+      <w:docPartPr>
+        <w:name w:val="B18BE1EF45774FDF9230D203BFCD8675"/>
+        <w:category>
+          <w:name w:val="Allgemein"/>
+          <w:gallery w:val="placeholder"/>
+        </w:category>
+        <w:types>
+          <w:type w:val="bbPlcHdr"/>
+        </w:types>
+        <w:behaviors>
+          <w:behavior w:val="content"/>
+        </w:behaviors>
+        <w:guid w:val="{9464C9E0-173E-476E-8793-D183643744F8}"/>
+      </w:docPartPr>
+      <w:docPartBody>
+        <w:p>
+          <w:r>
+            <w:rPr>
+              <w:rStyle w:val="Platzhaltertext"/>
+            </w:rPr>
+            <w:t>[Klicken oder tippen Sie hier, um Text einzugeben.]</w:t>
+          </w:r>
+        </w:p>
+      </w:docPartBody>
+    </w:docPart>
+    <w:docPart>
+      <w:docPartPr>
+        <w:name w:val="10AF4F2DF9984F189B1CAC3064572385"/>
+        <w:category>
+          <w:name w:val="Allgemein"/>
+          <w:gallery w:val="placeholder"/>
+        </w:category>
+        <w:types>
+          <w:type w:val="bbPlcHdr"/>
+        </w:types>
+        <w:behaviors>
+          <w:behavior w:val="content"/>
+        </w:behaviors>
+        <w:guid w:val="{E47A1134-BAA4-4F3F-8DC3-79E383CE0585}"/>
       </w:docPartPr>
       <w:docPartBody>
         <w:p>
           <w:pPr>
-            <w:pStyle w:val="A00863442AEA43F29467ED98612A59AC"/>
+            <w:pStyle w:val="10AF4F2DF9984F189B1CAC3064572385"/>
           </w:pPr>
           <w:r>
             <w:rPr>
               <w:rStyle w:val="Platzhaltertext"/>
             </w:rPr>
-            <w:t xml:space="preserve"> </w:t>
+            <w:t>​</w:t>
           </w:r>
         </w:p>
       </w:docPartBody>
@@ -4523,7 +4396,7 @@
 </file>
 
 <file path=word/glossary/fontTable.xml><?xml version="1.0" encoding="utf-8"?>
-<w:fonts xmlns:mc="http://schemas.openxmlformats.org/markup-compatibility/2006" xmlns:r="http://schemas.openxmlformats.org/officeDocument/2006/relationships" xmlns:w="http://schemas.openxmlformats.org/wordprocessingml/2006/main" xmlns:w14="http://schemas.microsoft.com/office/word/2010/wordml" xmlns:w15="http://schemas.microsoft.com/office/word/2012/wordml" xmlns:w16cex="http://schemas.microsoft.com/office/word/2018/wordml/cex" xmlns:w16cid="http://schemas.microsoft.com/office/word/2016/wordml/cid" xmlns:w16="http://schemas.microsoft.com/office/word/2018/wordml" xmlns:w16sdtdh="http://schemas.microsoft.com/office/word/2020/wordml/sdtdatahash" xmlns:w16se="http://schemas.microsoft.com/office/word/2015/wordml/symex" mc:Ignorable="w14 w15 w16se w16cid w16 w16cex w16sdtdh">
+<w:fonts xmlns:mc="http://schemas.openxmlformats.org/markup-compatibility/2006" xmlns:r="http://schemas.openxmlformats.org/officeDocument/2006/relationships" xmlns:w="http://schemas.openxmlformats.org/wordprocessingml/2006/main" xmlns:w14="http://schemas.microsoft.com/office/word/2010/wordml" xmlns:w15="http://schemas.microsoft.com/office/word/2012/wordml" xmlns:w16cex="http://schemas.microsoft.com/office/word/2018/wordml/cex" xmlns:w16cid="http://schemas.microsoft.com/office/word/2016/wordml/cid" xmlns:w16="http://schemas.microsoft.com/office/word/2018/wordml" xmlns:w16du="http://schemas.microsoft.com/office/word/2023/wordml/word16du" xmlns:w16sdtdh="http://schemas.microsoft.com/office/word/2020/wordml/sdtdatahash" xmlns:w16sdtfl="http://schemas.microsoft.com/office/word/2024/wordml/sdtformatlock" xmlns:w16se="http://schemas.microsoft.com/office/word/2015/wordml/symex" mc:Ignorable="w14 w15 w16se w16cid w16 w16cex w16sdtdh w16sdtfl w16du">
   <w:font w:name="Symbol">
     <w:panose1 w:val="05050102010706020507"/>
     <w:charset w:val="02"/>
@@ -4565,6 +4438,13 @@
     <w:pitch w:val="variable"/>
     <w:sig w:usb0="00000000" w:usb1="10000000" w:usb2="00000000" w:usb3="00000000" w:csb0="80000000" w:csb1="00000000"/>
   </w:font>
+  <w:font w:name="Aptos">
+    <w:panose1 w:val="020B0004020202020204"/>
+    <w:charset w:val="00"/>
+    <w:family w:val="swiss"/>
+    <w:pitch w:val="variable"/>
+    <w:sig w:usb0="20000287" w:usb1="00000003" w:usb2="00000000" w:usb3="00000000" w:csb0="0000019F" w:csb1="00000000"/>
+  </w:font>
   <w:font w:name="Cambria">
     <w:panose1 w:val="02040503050406030204"/>
     <w:charset w:val="00"/>
@@ -4600,18 +4480,18 @@
     <w:pitch w:val="variable"/>
     <w:sig w:usb0="800000AF" w:usb1="5000204A" w:usb2="00000000" w:usb3="00000000" w:csb0="0000009B" w:csb1="00000000"/>
   </w:font>
-  <w:font w:name="Calibri Light">
-    <w:panose1 w:val="020F0302020204030204"/>
+  <w:font w:name="Aptos Display">
+    <w:panose1 w:val="020B0004020202020204"/>
     <w:charset w:val="00"/>
     <w:family w:val="swiss"/>
     <w:pitch w:val="variable"/>
-    <w:sig w:usb0="E4002EFF" w:usb1="C200247B" w:usb2="00000009" w:usb3="00000000" w:csb0="000001FF" w:csb1="00000000"/>
+    <w:sig w:usb0="20000287" w:usb1="00000003" w:usb2="00000000" w:usb3="00000000" w:csb0="0000019F" w:csb1="00000000"/>
   </w:font>
 </w:fonts>
 </file>
 
 <file path=word/glossary/settings.xml><?xml version="1.0" encoding="utf-8"?>
-<w:settings xmlns:mc="http://schemas.openxmlformats.org/markup-compatibility/2006" xmlns:o="urn:schemas-microsoft-com:office:office" xmlns:r="http://schemas.openxmlformats.org/officeDocument/2006/relationships" xmlns:m="http://schemas.openxmlformats.org/officeDocument/2006/math" xmlns:v="urn:schemas-microsoft-com:vml" xmlns:w10="urn:schemas-microsoft-com:office:word" xmlns:w="http://schemas.openxmlformats.org/wordprocessingml/2006/main" xmlns:w14="http://schemas.microsoft.com/office/word/2010/wordml" xmlns:w15="http://schemas.microsoft.com/office/word/2012/wordml" xmlns:w16cex="http://schemas.microsoft.com/office/word/2018/wordml/cex" xmlns:w16cid="http://schemas.microsoft.com/office/word/2016/wordml/cid" xmlns:w16="http://schemas.microsoft.com/office/word/2018/wordml" xmlns:w16sdtdh="http://schemas.microsoft.com/office/word/2020/wordml/sdtdatahash" xmlns:w16se="http://schemas.microsoft.com/office/word/2015/wordml/symex" xmlns:sl="http://schemas.openxmlformats.org/schemaLibrary/2006/main" mc:Ignorable="w14 w15 w16se w16cid w16 w16cex w16sdtdh">
+<w:settings xmlns:mc="http://schemas.openxmlformats.org/markup-compatibility/2006" xmlns:o="urn:schemas-microsoft-com:office:office" xmlns:r="http://schemas.openxmlformats.org/officeDocument/2006/relationships" xmlns:m="http://schemas.openxmlformats.org/officeDocument/2006/math" xmlns:v="urn:schemas-microsoft-com:vml" xmlns:w10="urn:schemas-microsoft-com:office:word" xmlns:w="http://schemas.openxmlformats.org/wordprocessingml/2006/main" xmlns:w14="http://schemas.microsoft.com/office/word/2010/wordml" xmlns:w15="http://schemas.microsoft.com/office/word/2012/wordml" xmlns:w16cex="http://schemas.microsoft.com/office/word/2018/wordml/cex" xmlns:w16cid="http://schemas.microsoft.com/office/word/2016/wordml/cid" xmlns:w16="http://schemas.microsoft.com/office/word/2018/wordml" xmlns:w16du="http://schemas.microsoft.com/office/word/2023/wordml/word16du" xmlns:w16sdtdh="http://schemas.microsoft.com/office/word/2020/wordml/sdtdatahash" xmlns:w16sdtfl="http://schemas.microsoft.com/office/word/2024/wordml/sdtformatlock" xmlns:w16se="http://schemas.microsoft.com/office/word/2015/wordml/symex" xmlns:sl="http://schemas.openxmlformats.org/schemaLibrary/2006/main" mc:Ignorable="w14 w15 w16se w16cid w16 w16cex w16sdtdh w16sdtfl w16du">
   <w:view w:val="normal"/>
   <w:defaultTabStop w:val="708"/>
   <w:hyphenationZone w:val="425"/>
@@ -4626,13 +4506,65 @@
     <w:compatSetting w:name="useWord2013TrackBottomHyphenation" w:uri="http://schemas.microsoft.com/office/word" w:val="0"/>
   </w:compat>
   <w:rsids>
-    <w:rsidRoot w:val="003F7D16"/>
-    <w:rsid w:val="003F7D16"/>
-    <w:rsid w:val="00701246"/>
-    <w:rsid w:val="00995FA8"/>
-    <w:rsid w:val="00A45EED"/>
-    <w:rsid w:val="00CD3456"/>
-    <w:rsid w:val="00E57789"/>
+    <w:rsidRoot w:val="008018C0"/>
+    <w:rsid w:val="000744F9"/>
+    <w:rsid w:val="00074E01"/>
+    <w:rsid w:val="000A7610"/>
+    <w:rsid w:val="001231F1"/>
+    <w:rsid w:val="00141029"/>
+    <w:rsid w:val="001471A1"/>
+    <w:rsid w:val="001E70D6"/>
+    <w:rsid w:val="002120CF"/>
+    <w:rsid w:val="00250211"/>
+    <w:rsid w:val="002C583E"/>
+    <w:rsid w:val="003A58DE"/>
+    <w:rsid w:val="003D471F"/>
+    <w:rsid w:val="00464169"/>
+    <w:rsid w:val="00526DB6"/>
+    <w:rsid w:val="00571539"/>
+    <w:rsid w:val="00617087"/>
+    <w:rsid w:val="00654633"/>
+    <w:rsid w:val="00667B04"/>
+    <w:rsid w:val="0068320B"/>
+    <w:rsid w:val="0069387C"/>
+    <w:rsid w:val="00716D90"/>
+    <w:rsid w:val="00722C22"/>
+    <w:rsid w:val="008018C0"/>
+    <w:rsid w:val="00806969"/>
+    <w:rsid w:val="00811E1E"/>
+    <w:rsid w:val="00827497"/>
+    <w:rsid w:val="00850C8D"/>
+    <w:rsid w:val="00890B68"/>
+    <w:rsid w:val="008956A8"/>
+    <w:rsid w:val="008E4EEA"/>
+    <w:rsid w:val="00932929"/>
+    <w:rsid w:val="00997CFF"/>
+    <w:rsid w:val="009C56C0"/>
+    <w:rsid w:val="00A42933"/>
+    <w:rsid w:val="00AB6244"/>
+    <w:rsid w:val="00B01B40"/>
+    <w:rsid w:val="00B318BD"/>
+    <w:rsid w:val="00B331FF"/>
+    <w:rsid w:val="00BA6839"/>
+    <w:rsid w:val="00BB2CB2"/>
+    <w:rsid w:val="00C3120D"/>
+    <w:rsid w:val="00C918C8"/>
+    <w:rsid w:val="00CC0193"/>
+    <w:rsid w:val="00CC1A2D"/>
+    <w:rsid w:val="00CC46D4"/>
+    <w:rsid w:val="00CC7A5D"/>
+    <w:rsid w:val="00D363F3"/>
+    <w:rsid w:val="00D3705E"/>
+    <w:rsid w:val="00DD7821"/>
+    <w:rsid w:val="00E45120"/>
+    <w:rsid w:val="00E942CE"/>
+    <w:rsid w:val="00EB08AC"/>
+    <w:rsid w:val="00EC0DCF"/>
+    <w:rsid w:val="00EE3D90"/>
+    <w:rsid w:val="00EF323E"/>
+    <w:rsid w:val="00F452E3"/>
+    <w:rsid w:val="00F75675"/>
+    <w:rsid w:val="00FB3AA2"/>
   </w:rsids>
   <m:mathPr>
     <m:mathFont m:val="Cambria Math"/>
@@ -4647,7 +4579,7 @@
     <m:intLim m:val="subSup"/>
     <m:naryLim m:val="undOvr"/>
   </m:mathPr>
-  <w:themeFontLang w:val="de-CH"/>
+  <w:themeFontLang w:val="de-CH" w:bidi="ar-SA"/>
   <w:clrSchemeMapping w:bg1="light1" w:t1="dark1" w:bg2="light2" w:t2="dark2" w:accent1="accent1" w:accent2="accent2" w:accent3="accent3" w:accent4="accent4" w:accent5="accent5" w:accent6="accent6" w:hyperlink="hyperlink" w:followedHyperlink="followedHyperlink"/>
   <w:decimalSymbol w:val="."/>
   <w:listSeparator w:val=";"/>
@@ -4656,21 +4588,21 @@
 </file>
 
 <file path=word/glossary/styles.xml><?xml version="1.0" encoding="utf-8"?>
-<w:styles xmlns:mc="http://schemas.openxmlformats.org/markup-compatibility/2006" xmlns:r="http://schemas.openxmlformats.org/officeDocument/2006/relationships" xmlns:w="http://schemas.openxmlformats.org/wordprocessingml/2006/main" xmlns:w14="http://schemas.microsoft.com/office/word/2010/wordml" xmlns:w15="http://schemas.microsoft.com/office/word/2012/wordml" xmlns:w16cex="http://schemas.microsoft.com/office/word/2018/wordml/cex" xmlns:w16cid="http://schemas.microsoft.com/office/word/2016/wordml/cid" xmlns:w16="http://schemas.microsoft.com/office/word/2018/wordml" xmlns:w16sdtdh="http://schemas.microsoft.com/office/word/2020/wordml/sdtdatahash" xmlns:w16se="http://schemas.microsoft.com/office/word/2015/wordml/symex" mc:Ignorable="w14 w15 w16se w16cid w16 w16cex w16sdtdh">
+<w:styles xmlns:mc="http://schemas.openxmlformats.org/markup-compatibility/2006" xmlns:r="http://schemas.openxmlformats.org/officeDocument/2006/relationships" xmlns:w="http://schemas.openxmlformats.org/wordprocessingml/2006/main" xmlns:w14="http://schemas.microsoft.com/office/word/2010/wordml" xmlns:w15="http://schemas.microsoft.com/office/word/2012/wordml" xmlns:w16cex="http://schemas.microsoft.com/office/word/2018/wordml/cex" xmlns:w16cid="http://schemas.microsoft.com/office/word/2016/wordml/cid" xmlns:w16="http://schemas.microsoft.com/office/word/2018/wordml" xmlns:w16du="http://schemas.microsoft.com/office/word/2023/wordml/word16du" xmlns:w16sdtdh="http://schemas.microsoft.com/office/word/2020/wordml/sdtdatahash" xmlns:w16sdtfl="http://schemas.microsoft.com/office/word/2024/wordml/sdtformatlock" xmlns:w16se="http://schemas.microsoft.com/office/word/2015/wordml/symex" mc:Ignorable="w14 w15 w16se w16cid w16 w16cex w16sdtdh w16sdtfl w16du">
   <w:docDefaults>
     <w:rPrDefault>
       <w:rPr>
         <w:rFonts w:asciiTheme="minorHAnsi" w:eastAsiaTheme="minorEastAsia" w:hAnsiTheme="minorHAnsi" w:cstheme="minorBidi"/>
         <w:kern w:val="2"/>
-        <w:sz w:val="22"/>
-        <w:szCs w:val="22"/>
+        <w:sz w:val="24"/>
+        <w:szCs w:val="24"/>
         <w:lang w:val="de-CH" w:eastAsia="de-CH" w:bidi="ar-SA"/>
         <w14:ligatures w14:val="standardContextual"/>
       </w:rPr>
     </w:rPrDefault>
     <w:pPrDefault>
       <w:pPr>
-        <w:spacing w:after="160" w:line="259" w:lineRule="auto"/>
+        <w:spacing w:after="160" w:line="278" w:lineRule="auto"/>
       </w:pPr>
     </w:pPrDefault>
   </w:docDefaults>
@@ -5076,6 +5008,9 @@
         <w:right w:w="108" w:type="dxa"/>
       </w:tblCellMar>
     </w:tblPr>
+    <w:trPr>
+      <w:hidden/>
+    </w:trPr>
   </w:style>
   <w:style w:type="numbering" w:default="1" w:styleId="KeineListe">
     <w:name w:val="No List"/>
@@ -5088,24 +5023,22 @@
     <w:basedOn w:val="Absatz-Standardschriftart"/>
     <w:uiPriority w:val="99"/>
     <w:semiHidden/>
-    <w:rsid w:val="00E57789"/>
-    <w:rPr>
+    <w:rsid w:val="00811E1E"/>
+    <w:rPr>
+      <w:vanish/>
       <w:color w:val="808080"/>
       <w:lang w:val="de-CH"/>
     </w:rPr>
   </w:style>
-  <w:style w:type="paragraph" w:customStyle="1" w:styleId="A28DEAC98E864F40AD3EF282E33FC7A4">
-    <w:name w:val="A28DEAC98E864F40AD3EF282E33FC7A4"/>
-  </w:style>
-  <w:style w:type="paragraph" w:customStyle="1" w:styleId="A00863442AEA43F29467ED98612A59AC">
-    <w:name w:val="A00863442AEA43F29467ED98612A59AC"/>
-    <w:rsid w:val="00E57789"/>
+  <w:style w:type="paragraph" w:customStyle="1" w:styleId="10AF4F2DF9984F189B1CAC3064572385">
+    <w:name w:val="10AF4F2DF9984F189B1CAC3064572385"/>
+    <w:rsid w:val="00811E1E"/>
   </w:style>
 </w:styles>
 </file>
 
 <file path=word/glossary/webSettings.xml><?xml version="1.0" encoding="utf-8"?>
-<w:webSettings xmlns:mc="http://schemas.openxmlformats.org/markup-compatibility/2006" xmlns:r="http://schemas.openxmlformats.org/officeDocument/2006/relationships" xmlns:w="http://schemas.openxmlformats.org/wordprocessingml/2006/main" xmlns:w14="http://schemas.microsoft.com/office/word/2010/wordml" xmlns:w15="http://schemas.microsoft.com/office/word/2012/wordml" xmlns:w16cex="http://schemas.microsoft.com/office/word/2018/wordml/cex" xmlns:w16cid="http://schemas.microsoft.com/office/word/2016/wordml/cid" xmlns:w16="http://schemas.microsoft.com/office/word/2018/wordml" xmlns:w16sdtdh="http://schemas.microsoft.com/office/word/2020/wordml/sdtdatahash" xmlns:w16se="http://schemas.microsoft.com/office/word/2015/wordml/symex" mc:Ignorable="w14 w15 w16se w16cid w16 w16cex w16sdtdh">
+<w:webSettings xmlns:mc="http://schemas.openxmlformats.org/markup-compatibility/2006" xmlns:r="http://schemas.openxmlformats.org/officeDocument/2006/relationships" xmlns:w="http://schemas.openxmlformats.org/wordprocessingml/2006/main" xmlns:w14="http://schemas.microsoft.com/office/word/2010/wordml" xmlns:w15="http://schemas.microsoft.com/office/word/2012/wordml" xmlns:w16cex="http://schemas.microsoft.com/office/word/2018/wordml/cex" xmlns:w16cid="http://schemas.microsoft.com/office/word/2016/wordml/cid" xmlns:w16="http://schemas.microsoft.com/office/word/2018/wordml" xmlns:w16du="http://schemas.microsoft.com/office/word/2023/wordml/word16du" xmlns:w16sdtdh="http://schemas.microsoft.com/office/word/2020/wordml/sdtdatahash" xmlns:w16sdtfl="http://schemas.microsoft.com/office/word/2024/wordml/sdtformatlock" xmlns:w16se="http://schemas.microsoft.com/office/word/2015/wordml/symex" mc:Ignorable="w14 w15 w16se w16cid w16 w16cex w16sdtdh w16sdtfl w16du">
   <w:optimizeForBrowser/>
   <w:allowPNG/>
 </w:webSettings>
@@ -5396,81 +5329,313 @@
 </a:theme>
 </file>
 
+<file path=word/webextensions/taskpanes.xml><?xml version="1.0" encoding="utf-8"?>
+<wetp:taskpanes xmlns:wetp="http://schemas.microsoft.com/office/webextensions/taskpanes/2010/11">
+  <wetp:taskpane dockstate="right" visibility="0" width="350" row="4">
+    <wetp:webextensionref xmlns:r="http://schemas.openxmlformats.org/officeDocument/2006/relationships" r:id="rId1"/>
+  </wetp:taskpane>
+  <wetp:taskpane dockstate="left" visibility="0" width="350" row="1">
+    <wetp:webextensionref xmlns:r="http://schemas.openxmlformats.org/officeDocument/2006/relationships" r:id="rId2"/>
+  </wetp:taskpane>
+  <wetp:taskpane dockstate="right" visibility="0" width="350" row="0">
+    <wetp:webextensionref xmlns:r="http://schemas.openxmlformats.org/officeDocument/2006/relationships" r:id="rId3"/>
+  </wetp:taskpane>
+  <wetp:taskpane dockstate="right" visibility="0" width="350" row="5">
+    <wetp:webextensionref xmlns:r="http://schemas.openxmlformats.org/officeDocument/2006/relationships" r:id="rId4"/>
+  </wetp:taskpane>
+</wetp:taskpanes>
+</file>
+
+<file path=word/webextensions/webextension1.xml><?xml version="1.0" encoding="utf-8"?>
+<we:webextension xmlns:we="http://schemas.microsoft.com/office/webextensions/webextension/2010/11" id="{AE061723-5546-44A9-A62F-C264AF7E5C95}">
+  <we:reference id="WA104380602" version="3.7.0.0" store="Omex" storeType="OMEX"/>
+  <we:alternateReferences>
+    <we:reference id="WA104380602" version="3.7.0.0" store="WA104380602" storeType="OMEX"/>
+  </we:alternateReferences>
+  <we:properties/>
+  <we:bindings/>
+  <we:snapshot xmlns:r="http://schemas.openxmlformats.org/officeDocument/2006/relationships"/>
+</we:webextension>
+</file>
+
+<file path=word/webextensions/webextension2.xml><?xml version="1.0" encoding="utf-8"?>
+<we:webextension xmlns:we="http://schemas.microsoft.com/office/webextensions/webextension/2010/11" id="{9A2A55A1-43B5-4F06-929F-D74F1909B7EB}">
+  <we:reference id="444c804e-8891-41f9-b246-f6dac759fca9" version="3.7.0.0" store="EXCatalog" storeType="EXCatalog"/>
+  <we:alternateReferences>
+    <we:reference id="WA104380518" version="3.7.0.0" store="en-US" storeType="OMEX"/>
+  </we:alternateReferences>
+  <we:properties/>
+  <we:bindings/>
+  <we:snapshot xmlns:r="http://schemas.openxmlformats.org/officeDocument/2006/relationships"/>
+</we:webextension>
+</file>
+
+<file path=word/webextensions/webextension3.xml><?xml version="1.0" encoding="utf-8"?>
+<we:webextension xmlns:we="http://schemas.microsoft.com/office/webextensions/webextension/2010/11" id="{13D40FFB-2A9E-499F-AE11-21D0121BB03F}">
+  <we:reference id="e765dd0b-6697-44aa-9025-1ce65686c598" version="3.7.0.0" store="EXCatalog" storeType="EXCatalog"/>
+  <we:alternateReferences>
+    <we:reference id="WA104380519" version="3.7.0.0" store="en-US" storeType="OMEX"/>
+  </we:alternateReferences>
+  <we:properties>
+    <we:property name="Office.AutoShowTaskpaneWithDocument" value="true"/>
+  </we:properties>
+  <we:bindings/>
+  <we:snapshot xmlns:r="http://schemas.openxmlformats.org/officeDocument/2006/relationships"/>
+</we:webextension>
+</file>
+
+<file path=word/webextensions/webextension4.xml><?xml version="1.0" encoding="utf-8"?>
+<we:webextension xmlns:we="http://schemas.microsoft.com/office/webextensions/webextension/2010/11" id="{F23FFC95-B7F9-4DEF-8D87-F5EEFEA0F724}">
+  <we:reference id="5DFDB5CC-192B-4C89-86DE-643F8DD60D3A" version="3.7.0.0" store="EXCatalog" storeType="EXCatalog"/>
+  <we:alternateReferences>
+    <we:reference id="WA104381430" version="3.7.0.0" store="en-US" storeType="OMEX"/>
+  </we:alternateReferences>
+  <we:properties/>
+  <we:bindings/>
+  <we:snapshot xmlns:r="http://schemas.openxmlformats.org/officeDocument/2006/relationships"/>
+</we:webextension>
+</file>
+
 <file path=customXml/item1.xml><?xml version="1.0" encoding="utf-8"?>
-<officeatwork xmlns="http://schemas.officeatwork.com/Media"/>
+<evaluation xmlns="http://schema.officeatwork365.com/2015/evaluation">
+  <parameters>officeatworkDocumentPart: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</parameters>
+</evaluation>
 </file>
 
 <file path=customXml/item2.xml><?xml version="1.0" encoding="utf-8"?>
-<officeatwork xmlns="http://schemas.officeatwork.com/CustomXMLPart">
-  <Header>​</Header>
-  <Hinweis>​</Hinweis>
-  <Block>,</Block>
-  <Introduction>Sehr geehrte Damen und Herren</Introduction>
-  <Direktion>​</Direktion>
-  <Amt>​</Amt>
-  <Address>​</Address>
-  <Internet>​</Internet>
-  <Telefon>​</Telefon>
-  <Sachbearbeitung>​</Sachbearbeitung>
-  <EMail>​</EMail>
-  <Closing>Freundliche Grüsse</Closing>
-  <Grussformel>​</Grussformel>
-  <Sig1>​</Sig1>
-  <Sig2>​</Sig2>
-  <Zeichen>​</Zeichen>
-  <DeliveryOption>​</DeliveryOption>
-  <Address2>​</Address2>
-</officeatwork>
+<templateReference xmlns="http://schema.officeatwork.com/2022/templateReference">
+  <reference>officeatworkDocumentPart: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</reference>
+</templateReference>
 </file>
 
 <file path=customXml/item3.xml><?xml version="1.0" encoding="utf-8"?>
-<officeatwork xmlns="http://schemas.officeatwork.com/Formulas">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</officeatwork>
+<dataConnections xmlns="http://schema.officeatwork365.com/2015/dataConnections">
+  <definitions>officeatworkDocumentPart: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</definitions>
+</dataConnections>
 </file>
 
 <file path=customXml/item4.xml><?xml version="1.0" encoding="utf-8"?>
-<officeatwork xmlns="http://schemas.officeatwork.com/MasterProperties">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</officeatwork>
+<?mso-contentType ?>
+<FormTemplates xmlns="http://schemas.microsoft.com/sharepoint/v3/contenttype/forms">
+  <Display>DocumentLibraryForm</Display>
+  <Edit>DocumentLibraryForm</Edit>
+  <New>DocumentLibraryForm</New>
+</FormTemplates>
 </file>
 
 <file path=customXml/item5.xml><?xml version="1.0" encoding="utf-8"?>
-<officeatwork xmlns="http://schemas.officeatwork.com/Document">eNp7v3u/jUt+cmlual6JnU1wfk5pSWZ+nmeKnY0+MscnMS+9NDE91c7IwNTURh/OtQnLTC0HqoVQAUCh4NSc1GSgUfooHLgVAFOAKK8=</officeatwork>
+<ct:contentTypeSchema xmlns:ct="http://schemas.microsoft.com/office/2006/metadata/contentType" xmlns:ma="http://schemas.microsoft.com/office/2006/metadata/properties/metaAttributes" ct:_="" ma:_="" ma:contentTypeName="Document" ma:contentTypeID="0x010100AC22454046DAB745857032C884756D54" ma:contentTypeVersion="3" ma:contentTypeDescription="Create a new document." ma:contentTypeScope="" ma:versionID="05435a3447088af03e7f80da8fb2cdfe">
+  <xsd:schema xmlns:xsd="http://www.w3.org/2001/XMLSchema" xmlns:xs="http://www.w3.org/2001/XMLSchema" xmlns:p="http://schemas.microsoft.com/office/2006/metadata/properties" xmlns:ns2="e3723776-3163-46e3-8352-f2065647aa65" targetNamespace="http://schemas.microsoft.com/office/2006/metadata/properties" ma:root="true" ma:fieldsID="51c6d8b39b111a00dc52fc70e49a25e1" ns2:_="">
+    <xsd:import namespace="e3723776-3163-46e3-8352-f2065647aa65"/>
+    <xsd:element name="properties">
+      <xsd:complexType>
+        <xsd:sequence>
+          <xsd:element name="documentManagement">
+            <xsd:complexType>
+              <xsd:all>
+                <xsd:element ref="ns2:MediaServiceMetadata" minOccurs="0"/>
+                <xsd:element ref="ns2:MediaServiceFastMetadata" minOccurs="0"/>
+                <xsd:element ref="ns2:MediaServiceSearchProperties" minOccurs="0"/>
+              </xsd:all>
+            </xsd:complexType>
+          </xsd:element>
+        </xsd:sequence>
+      </xsd:complexType>
+    </xsd:element>
+  </xsd:schema>
+  <xsd:schema xmlns:xsd="http://www.w3.org/2001/XMLSchema" xmlns:xs="http://www.w3.org/2001/XMLSchema" xmlns:dms="http://schemas.microsoft.com/office/2006/documentManagement/types" xmlns:pc="http://schemas.microsoft.com/office/infopath/2007/PartnerControls" targetNamespace="e3723776-3163-46e3-8352-f2065647aa65" elementFormDefault="qualified">
+    <xsd:import namespace="http://schemas.microsoft.com/office/2006/documentManagement/types"/>
+    <xsd:import namespace="http://schemas.microsoft.com/office/infopath/2007/PartnerControls"/>
+    <xsd:element name="MediaServiceMetadata" ma:index="8" nillable="true" ma:displayName="MediaServiceMetadata" ma:hidden="true" ma:internalName="MediaServiceMetadata" ma:readOnly="true">
+      <xsd:simpleType>
+        <xsd:restriction base="dms:Note"/>
+      </xsd:simpleType>
+    </xsd:element>
+    <xsd:element name="MediaServiceFastMetadata" ma:index="9" nillable="true" ma:displayName="MediaServiceFastMetadata" ma:hidden="true" ma:internalName="MediaServiceFastMetadata" ma:readOnly="true">
+      <xsd:simpleType>
+        <xsd:restriction base="dms:Note"/>
+      </xsd:simpleType>
+    </xsd:element>
+    <xsd:element name="MediaServiceSearchProperties" ma:index="10" nillable="true" ma:displayName="MediaServiceSearchProperties" ma:hidden="true" ma:internalName="MediaServiceSearchProperties" ma:readOnly="true">
+      <xsd:simpleType>
+        <xsd:restriction base="dms:Note"/>
+      </xsd:simpleType>
+    </xsd:element>
+  </xsd:schema>
+  <xsd:schema xmlns="http://schemas.openxmlformats.org/package/2006/metadata/core-properties" xmlns:xsd="http://www.w3.org/2001/XMLSchema" xmlns:xsi="http://www.w3.org/2001/XMLSchema-instance" xmlns:dc="http://purl.org/dc/elements/1.1/" xmlns:dcterms="http://purl.org/dc/terms/" xmlns:odoc="http://schemas.microsoft.com/internal/obd" targetNamespace="http://schemas.openxmlformats.org/package/2006/metadata/core-properties" elementFormDefault="qualified" attributeFormDefault="unqualified" blockDefault="#all">
+    <xsd:import namespace="http://purl.org/dc/elements/1.1/" schemaLocation="http://dublincore.org/schemas/xmls/qdc/2003/04/02/dc.xsd"/>
+    <xsd:import namespace="http://purl.org/dc/terms/" schemaLocation="http://dublincore.org/schemas/xmls/qdc/2003/04/02/dcterms.xsd"/>
+    <xsd:element name="coreProperties" type="CT_coreProperties"/>
+    <xsd:complexType name="CT_coreProperties">
+      <xsd:all>
+        <xsd:element ref="dc:creator" minOccurs="0" maxOccurs="1"/>
+        <xsd:element ref="dcterms:created" minOccurs="0" maxOccurs="1"/>
+        <xsd:element ref="dc:identifier" minOccurs="0" maxOccurs="1"/>
+        <xsd:element name="contentType" minOccurs="0" maxOccurs="1" type="xsd:string" ma:index="0" ma:displayName="Content Type"/>
+        <xsd:element ref="dc:title" minOccurs="0" maxOccurs="1" ma:index="4" ma:displayName="Title"/>
+        <xsd:element ref="dc:subject" minOccurs="0" maxOccurs="1"/>
+        <xsd:element ref="dc:description" minOccurs="0" maxOccurs="1"/>
+        <xsd:element name="keywords" minOccurs="0" maxOccurs="1" type="xsd:string"/>
+        <xsd:element ref="dc:language" minOccurs="0" maxOccurs="1"/>
+        <xsd:element name="category" minOccurs="0" maxOccurs="1" type="xsd:string"/>
+        <xsd:element name="version" minOccurs="0" maxOccurs="1" type="xsd:string"/>
+        <xsd:element name="revision" minOccurs="0" maxOccurs="1" type="xsd:string">
+          <xsd:annotation>
+            <xsd:documentation>
+                        This value indicates the number of saves or revisions. The application is responsible for updating this value after each revision.
+                    </xsd:documentation>
+          </xsd:annotation>
+        </xsd:element>
+        <xsd:element name="lastModifiedBy" minOccurs="0" maxOccurs="1" type="xsd:string"/>
+        <xsd:element ref="dcterms:modified" minOccurs="0" maxOccurs="1"/>
+        <xsd:element name="contentStatus" minOccurs="0" maxOccurs="1" type="xsd:string"/>
+      </xsd:all>
+    </xsd:complexType>
+  </xsd:schema>
+  <xs:schema xmlns:pc="http://schemas.microsoft.com/office/infopath/2007/PartnerControls" xmlns:xs="http://www.w3.org/2001/XMLSchema" targetNamespace="http://schemas.microsoft.com/office/infopath/2007/PartnerControls" elementFormDefault="qualified" attributeFormDefault="unqualified">
+    <xs:element name="Person">
+      <xs:complexType>
+        <xs:sequence>
+          <xs:element ref="pc:DisplayName" minOccurs="0"/>
+          <xs:element ref="pc:AccountId" minOccurs="0"/>
+          <xs:element ref="pc:AccountType" minOccurs="0"/>
+        </xs:sequence>
+      </xs:complexType>
+    </xs:element>
+    <xs:element name="DisplayName" type="xs:string"/>
+    <xs:element name="AccountId" type="xs:string"/>
+    <xs:element name="AccountType" type="xs:string"/>
+    <xs:element name="BDCAssociatedEntity">
+      <xs:complexType>
+        <xs:sequence>
+          <xs:element ref="pc:BDCEntity" minOccurs="0" maxOccurs="unbounded"/>
+        </xs:sequence>
+        <xs:attribute ref="pc:EntityNamespace"/>
+        <xs:attribute ref="pc:EntityName"/>
+        <xs:attribute ref="pc:SystemInstanceName"/>
+        <xs:attribute ref="pc:AssociationName"/>
+      </xs:complexType>
+    </xs:element>
+    <xs:attribute name="EntityNamespace" type="xs:string"/>
+    <xs:attribute name="EntityName" type="xs:string"/>
+    <xs:attribute name="SystemInstanceName" type="xs:string"/>
+    <xs:attribute name="AssociationName" type="xs:string"/>
+    <xs:element name="BDCEntity">
+      <xs:complexType>
+        <xs:sequence>
+          <xs:element ref="pc:EntityDisplayName" minOccurs="0"/>
+          <xs:element ref="pc:EntityInstanceReference" minOccurs="0"/>
+          <xs:element ref="pc:EntityId1" minOccurs="0"/>
+          <xs:element ref="pc:EntityId2" minOccurs="0"/>
+          <xs:element ref="pc:EntityId3" minOccurs="0"/>
+          <xs:element ref="pc:EntityId4" minOccurs="0"/>
+          <xs:element ref="pc:EntityId5" minOccurs="0"/>
+        </xs:sequence>
+      </xs:complexType>
+    </xs:element>
+    <xs:element name="EntityDisplayName" type="xs:string"/>
+    <xs:element name="EntityInstanceReference" type="xs:string"/>
+    <xs:element name="EntityId1" type="xs:string"/>
+    <xs:element name="EntityId2" type="xs:string"/>
+    <xs:element name="EntityId3" type="xs:string"/>
+    <xs:element name="EntityId4" type="xs:string"/>
+    <xs:element name="EntityId5" type="xs:string"/>
+    <xs:element name="Terms">
+      <xs:complexType>
+        <xs:sequence>
+          <xs:element ref="pc:TermInfo" minOccurs="0" maxOccurs="unbounded"/>
+        </xs:sequence>
+      </xs:complexType>
+    </xs:element>
+    <xs:element name="TermInfo">
+      <xs:complexType>
+        <xs:sequence>
+          <xs:element ref="pc:TermName" minOccurs="0"/>
+          <xs:element ref="pc:TermId" minOccurs="0"/>
+        </xs:sequence>
+      </xs:complexType>
+    </xs:element>
+    <xs:element name="TermName" type="xs:string"/>
+    <xs:element name="TermId" type="xs:string"/>
+  </xs:schema>
+</ct:contentTypeSchema>
+</file>
+
+<file path=customXml/item6.xml><?xml version="1.0" encoding="utf-8"?>
+<designSettings xmlns="http://schema.officeatwork365.com/2015/designSettings">
+  <settings>officeatworkDocumentPart: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</settings>
+</designSettings>
+</file>
+
+<file path=customXml/item7.xml><?xml version="1.0" encoding="utf-8"?>
+<p:properties xmlns:p="http://schemas.microsoft.com/office/2006/metadata/properties" xmlns:pc="http://schemas.microsoft.com/office/infopath/2007/PartnerControls" xmlns:xsi="http://www.w3.org/2001/XMLSchema-instance">
+  <documentManagement/>
+</p:properties>
 </file>
 
 <file path=customXml/itemProps1.xml><?xml version="1.0" encoding="utf-8"?>
-<ds:datastoreItem xmlns:ds="http://schemas.openxmlformats.org/officeDocument/2006/customXml" ds:itemID="{5414349B-C73A-4BA9-89B9-09F7AE1E34DC}">
+<ds:datastoreItem xmlns:ds="http://schemas.openxmlformats.org/officeDocument/2006/customXml" ds:itemID="{C9C218BF-2DCC-46EB-B5C0-0DD80A08904B}">
   <ds:schemaRefs>
-    <ds:schemaRef ds:uri="http://schemas.officeatwork.com/Media"/>
+    <ds:schemaRef ds:uri="http://schema.officeatwork365.com/2015/evaluation"/>
   </ds:schemaRefs>
 </ds:datastoreItem>
 </file>
 
 <file path=customXml/itemProps2.xml><?xml version="1.0" encoding="utf-8"?>
-<ds:datastoreItem xmlns:ds="http://schemas.openxmlformats.org/officeDocument/2006/customXml" ds:itemID="{449B45FC-8755-4360-A7E8-6A1DA88E2CF0}">
+<ds:datastoreItem xmlns:ds="http://schemas.openxmlformats.org/officeDocument/2006/customXml" ds:itemID="{BD143B51-E5F1-66DE-B13C-D53E7116A14A}">
   <ds:schemaRefs>
-    <ds:schemaRef ds:uri="http://schemas.officeatwork.com/CustomXMLPart"/>
+    <ds:schemaRef ds:uri="http://schema.officeatwork.com/2022/templateReference"/>
   </ds:schemaRefs>
 </ds:datastoreItem>
 </file>
 
 <file path=customXml/itemProps3.xml><?xml version="1.0" encoding="utf-8"?>
-<ds:datastoreItem xmlns:ds="http://schemas.openxmlformats.org/officeDocument/2006/customXml" ds:itemID="{82B8EFC9-A363-42F6-8E88-5FEB1A4090FA}">
+<ds:datastoreItem xmlns:ds="http://schemas.openxmlformats.org/officeDocument/2006/customXml" ds:itemID="{61F8A307-2DB1-4B7F-A69A-9446EA45B7D6}">
   <ds:schemaRefs>
-    <ds:schemaRef ds:uri="http://schemas.officeatwork.com/Formulas"/>
+    <ds:schemaRef ds:uri="http://schema.officeatwork365.com/2015/dataConnections"/>
   </ds:schemaRefs>
 </ds:datastoreItem>
 </file>
 
 <file path=customXml/itemProps4.xml><?xml version="1.0" encoding="utf-8"?>
-<ds:datastoreItem xmlns:ds="http://schemas.openxmlformats.org/officeDocument/2006/customXml" ds:itemID="{245A62C0-E6AC-493D-8DC7-F85BC29C3CCF}">
+<ds:datastoreItem xmlns:ds="http://schemas.openxmlformats.org/officeDocument/2006/customXml" ds:itemID="{43F27308-EADF-4BBC-B565-20FA0AD72D0A}">
   <ds:schemaRefs>
-    <ds:schemaRef ds:uri="http://schemas.officeatwork.com/MasterProperties"/>
+    <ds:schemaRef ds:uri="http://schemas.microsoft.com/sharepoint/v3/contenttype/forms"/>
   </ds:schemaRefs>
 </ds:datastoreItem>
 </file>
 
 <file path=customXml/itemProps5.xml><?xml version="1.0" encoding="utf-8"?>
-<ds:datastoreItem xmlns:ds="http://schemas.openxmlformats.org/officeDocument/2006/customXml" ds:itemID="{25FEFEDE-D75B-41FC-AA93-C6A8EDD1A53F}">
+<ds:datastoreItem xmlns:ds="http://schemas.openxmlformats.org/officeDocument/2006/customXml" ds:itemID="{7D312AC7-5951-48FC-8561-681DAD9F44EC}">
   <ds:schemaRefs>
-    <ds:schemaRef ds:uri="http://schemas.officeatwork.com/Document"/>
+    <ds:schemaRef ds:uri="http://schemas.microsoft.com/office/2006/metadata/contentType"/>
+    <ds:schemaRef ds:uri="http://schemas.microsoft.com/office/2006/metadata/properties/metaAttributes"/>
+    <ds:schemaRef ds:uri="http://www.w3.org/2001/XMLSchema"/>
+    <ds:schemaRef ds:uri="http://schemas.microsoft.com/office/2006/metadata/properties"/>
+    <ds:schemaRef ds:uri="e3723776-3163-46e3-8352-f2065647aa65"/>
+    <ds:schemaRef ds:uri="http://schemas.microsoft.com/office/2006/documentManagement/types"/>
+    <ds:schemaRef ds:uri="http://schemas.microsoft.com/office/infopath/2007/PartnerControls"/>
+    <ds:schemaRef ds:uri="http://schemas.openxmlformats.org/package/2006/metadata/core-properties"/>
+    <ds:schemaRef ds:uri="http://purl.org/dc/elements/1.1/"/>
+    <ds:schemaRef ds:uri="http://purl.org/dc/terms/"/>
+    <ds:schemaRef ds:uri="http://schemas.microsoft.com/internal/obd"/>
+  </ds:schemaRefs>
+</ds:datastoreItem>
+</file>
+
+<file path=customXml/itemProps6.xml><?xml version="1.0" encoding="utf-8"?>
+<ds:datastoreItem xmlns:ds="http://schemas.openxmlformats.org/officeDocument/2006/customXml" ds:itemID="{512B4226-3845-4BC9-B989-7BDF50EFDAAA}">
+  <ds:schemaRefs>
+    <ds:schemaRef ds:uri="http://schema.officeatwork365.com/2015/designSettings"/>
+  </ds:schemaRefs>
+</ds:datastoreItem>
+</file>
+
+<file path=customXml/itemProps7.xml><?xml version="1.0" encoding="utf-8"?>
+<ds:datastoreItem xmlns:ds="http://schemas.openxmlformats.org/officeDocument/2006/customXml" ds:itemID="{C2FE489E-404B-4265-90C9-F8A60D3BB73F}">
+  <ds:schemaRefs>
+    <ds:schemaRef ds:uri="http://schemas.microsoft.com/office/2006/metadata/properties"/>
+    <ds:schemaRef ds:uri="http://schemas.microsoft.com/office/infopath/2007/PartnerControls"/>
   </ds:schemaRefs>
 </ds:datastoreItem>
 </file>
</xml_diff>